<commit_message>
Removing any included files when getting getting a list of projects for a user.
</commit_message>
<xml_diff>
--- a/docs/Testing/Testing.docx
+++ b/docs/Testing/Testing.docx
@@ -149,7 +149,7 @@
           <w:sz w:val="16"/>
           <w:szCs w:val="16"/>
         </w:rPr>
-        <w:t>{</w:t>
+        <w:t>{ "</w:t>
       </w:r>
       <w:r>
         <w:rPr>
@@ -157,7 +157,7 @@
           <w:sz w:val="16"/>
           <w:szCs w:val="16"/>
         </w:rPr>
-        <w:t xml:space="preserve"> </w:t>
+        <w:t>id</w:t>
       </w:r>
       <w:r>
         <w:rPr>
@@ -165,7 +165,7 @@
           <w:sz w:val="16"/>
           <w:szCs w:val="16"/>
         </w:rPr>
-        <w:t>"</w:t>
+        <w:t xml:space="preserve">": </w:t>
       </w:r>
       <w:r>
         <w:rPr>
@@ -173,7 +173,7 @@
           <w:sz w:val="16"/>
           <w:szCs w:val="16"/>
         </w:rPr>
-        <w:t>id</w:t>
+        <w:t>4</w:t>
       </w:r>
       <w:r>
         <w:rPr>
@@ -181,7 +181,7 @@
           <w:sz w:val="16"/>
           <w:szCs w:val="16"/>
         </w:rPr>
-        <w:t xml:space="preserve">": </w:t>
+        <w:t>, "</w:t>
       </w:r>
       <w:r>
         <w:rPr>
@@ -189,7 +189,7 @@
           <w:sz w:val="16"/>
           <w:szCs w:val="16"/>
         </w:rPr>
-        <w:t>4</w:t>
+        <w:t>username</w:t>
       </w:r>
       <w:r>
         <w:rPr>
@@ -197,7 +197,7 @@
           <w:sz w:val="16"/>
           <w:szCs w:val="16"/>
         </w:rPr>
-        <w:t>,</w:t>
+        <w:t>": "</w:t>
       </w:r>
       <w:r>
         <w:rPr>
@@ -205,7 +205,7 @@
           <w:sz w:val="16"/>
           <w:szCs w:val="16"/>
         </w:rPr>
-        <w:t xml:space="preserve"> </w:t>
+        <w:t>new_user_1</w:t>
       </w:r>
       <w:r>
         <w:rPr>
@@ -213,81 +213,19 @@
           <w:sz w:val="16"/>
           <w:szCs w:val="16"/>
         </w:rPr>
-        <w:t>"</w:t>
-      </w:r>
-      <w:r>
-        <w:rPr>
-          <w:rFonts w:ascii="Consolas" w:hAnsi="Consolas"/>
-          <w:sz w:val="16"/>
-          <w:szCs w:val="16"/>
-        </w:rPr>
-        <w:t>username</w:t>
-      </w:r>
-      <w:r>
-        <w:rPr>
-          <w:rFonts w:ascii="Consolas" w:hAnsi="Consolas"/>
-          <w:sz w:val="16"/>
-          <w:szCs w:val="16"/>
-        </w:rPr>
-        <w:t>": "</w:t>
-      </w:r>
-      <w:r>
-        <w:rPr>
-          <w:rFonts w:ascii="Consolas" w:hAnsi="Consolas"/>
-          <w:sz w:val="16"/>
-          <w:szCs w:val="16"/>
-        </w:rPr>
-        <w:t>new_user_1</w:t>
-      </w:r>
-      <w:r>
-        <w:rPr>
-          <w:rFonts w:ascii="Consolas" w:hAnsi="Consolas"/>
-          <w:sz w:val="16"/>
-          <w:szCs w:val="16"/>
-        </w:rPr>
-        <w:t>"</w:t>
-      </w:r>
-      <w:r>
-        <w:rPr>
-          <w:rFonts w:ascii="Consolas" w:hAnsi="Consolas"/>
-          <w:sz w:val="16"/>
-          <w:szCs w:val="16"/>
-        </w:rPr>
-        <w:t xml:space="preserve"> </w:t>
-      </w:r>
-      <w:r>
-        <w:rPr>
-          <w:rFonts w:ascii="Consolas" w:hAnsi="Consolas"/>
-          <w:sz w:val="16"/>
-          <w:szCs w:val="16"/>
-        </w:rPr>
-        <w:t>}</w:t>
-      </w:r>
-    </w:p>
-    <w:p>
-      <w:pPr>
-        <w:spacing w:after="0"/>
-      </w:pPr>
-      <w:r>
-        <w:rPr>
-          <w:b/>
-          <w:bCs/>
-        </w:rPr>
-        <w:t xml:space="preserve">Case </w:t>
-      </w:r>
-      <w:r>
-        <w:rPr>
-          <w:b/>
-          <w:bCs/>
-        </w:rPr>
-        <w:t>2</w:t>
-      </w:r>
-      <w:r>
-        <w:rPr>
-          <w:b/>
-          <w:bCs/>
-        </w:rPr>
-        <w:t xml:space="preserve"> – </w:t>
+        <w:t>" }</w:t>
+      </w:r>
+    </w:p>
+    <w:p>
+      <w:pPr>
+        <w:spacing w:after="0"/>
+      </w:pPr>
+      <w:r>
+        <w:rPr>
+          <w:b/>
+          <w:bCs/>
+        </w:rPr>
+        <w:t xml:space="preserve">Case 2 – </w:t>
       </w:r>
       <w:r>
         <w:rPr>
@@ -398,21 +336,7 @@
           <w:b/>
           <w:bCs/>
         </w:rPr>
-        <w:t xml:space="preserve">Case </w:t>
-      </w:r>
-      <w:r>
-        <w:rPr>
-          <w:b/>
-          <w:bCs/>
-        </w:rPr>
-        <w:t>3</w:t>
-      </w:r>
-      <w:r>
-        <w:rPr>
-          <w:b/>
-          <w:bCs/>
-        </w:rPr>
-        <w:t xml:space="preserve"> – </w:t>
+        <w:t xml:space="preserve">Case 3 – </w:t>
       </w:r>
       <w:r>
         <w:rPr>
@@ -600,21 +524,7 @@
           <w:b/>
           <w:bCs/>
         </w:rPr>
-        <w:t xml:space="preserve">Case </w:t>
-      </w:r>
-      <w:r>
-        <w:rPr>
-          <w:b/>
-          <w:bCs/>
-        </w:rPr>
-        <w:t>4</w:t>
-      </w:r>
-      <w:r>
-        <w:rPr>
-          <w:b/>
-          <w:bCs/>
-        </w:rPr>
-        <w:t xml:space="preserve"> – </w:t>
+        <w:t xml:space="preserve">Case 4 – </w:t>
       </w:r>
       <w:r>
         <w:rPr>
@@ -716,31 +626,7 @@
         <w:rPr>
           <w:rStyle w:val="CodeExamplesChar"/>
         </w:rPr>
-        <w:t>{ "</w:t>
-      </w:r>
-      <w:r>
-        <w:rPr>
-          <w:rStyle w:val="CodeExamplesChar"/>
-        </w:rPr>
-        <w:t>error</w:t>
-      </w:r>
-      <w:r>
-        <w:rPr>
-          <w:rStyle w:val="CodeExamplesChar"/>
-        </w:rPr>
-        <w:t xml:space="preserve">": </w:t>
-      </w:r>
-      <w:r>
-        <w:rPr>
-          <w:rStyle w:val="CodeExamplesChar"/>
-        </w:rPr>
-        <w:t>“Username already exists”</w:t>
-      </w:r>
-      <w:r>
-        <w:rPr>
-          <w:rStyle w:val="CodeExamplesChar"/>
-        </w:rPr>
-        <w:t xml:space="preserve"> }</w:t>
+        <w:t>{ "error": “Username already exists” }</w:t>
       </w:r>
     </w:p>
     <w:p>
@@ -929,21 +815,7 @@
           <w:b/>
           <w:bCs/>
         </w:rPr>
-        <w:t xml:space="preserve">Case </w:t>
-      </w:r>
-      <w:r>
-        <w:rPr>
-          <w:b/>
-          <w:bCs/>
-        </w:rPr>
-        <w:t>2</w:t>
-      </w:r>
-      <w:r>
-        <w:rPr>
-          <w:b/>
-          <w:bCs/>
-        </w:rPr>
-        <w:t xml:space="preserve"> – </w:t>
+        <w:t xml:space="preserve">Case 2 – </w:t>
       </w:r>
       <w:r>
         <w:rPr>
@@ -1098,13 +970,7 @@
         <w:rPr>
           <w:rStyle w:val="CodeExamplesChar"/>
         </w:rPr>
-        <w:t xml:space="preserve">{ </w:t>
-      </w:r>
-      <w:r>
-        <w:rPr>
-          <w:rStyle w:val="CodeExamplesChar"/>
-        </w:rPr>
-        <w:t>"accessToken": "eyJhbGciOiJIUzI1NiIsInR5cCI6IkpXVCJ9..."</w:t>
+        <w:t>{ "accessToken": "eyJhbGciOiJIUzI1NiIsInR5cCI6IkpXVCJ9..."</w:t>
       </w:r>
       <w:r>
         <w:rPr>
@@ -1286,7 +1152,7 @@
       </w:pPr>
       <w:r>
         <w:pict w14:anchorId="26101DA0">
-          <v:rect id="_x0000_i1049" style="width:0;height:.75pt" o:hralign="center" o:hrstd="t" o:hr="t" fillcolor="#a0a0a0" stroked="f"/>
+          <v:rect id="_x0000_i1025" style="width:0;height:.75pt" o:hralign="center" o:hrstd="t" o:hr="t" fillcolor="#a0a0a0" stroked="f"/>
         </w:pict>
       </w:r>
     </w:p>
@@ -1352,6 +1218,13 @@
           <w:b/>
           <w:bCs/>
         </w:rPr>
+        <w:t xml:space="preserve"> OK</w:t>
+      </w:r>
+      <w:r>
+        <w:rPr>
+          <w:b/>
+          <w:bCs/>
+        </w:rPr>
         <w:t>:</w:t>
       </w:r>
       <w:r>
@@ -1693,21 +1566,7 @@
           <w:b/>
           <w:bCs/>
         </w:rPr>
-        <w:t xml:space="preserve">Case </w:t>
-      </w:r>
-      <w:r>
-        <w:rPr>
-          <w:b/>
-          <w:bCs/>
-        </w:rPr>
-        <w:t>2</w:t>
-      </w:r>
-      <w:r>
-        <w:rPr>
-          <w:b/>
-          <w:bCs/>
-        </w:rPr>
-        <w:t xml:space="preserve"> –  </w:t>
+        <w:t xml:space="preserve">Case 2 –  </w:t>
       </w:r>
       <w:r>
         <w:rPr>
@@ -1816,6 +1675,12 @@
           <w:numId w:val="3"/>
         </w:numPr>
         <w:spacing w:after="0"/>
+        <w:rPr>
+          <w:rStyle w:val="CodeExamplesChar"/>
+          <w:rFonts w:asciiTheme="minorHAnsi" w:hAnsiTheme="minorHAnsi"/>
+          <w:sz w:val="24"/>
+          <w:szCs w:val="24"/>
+        </w:rPr>
       </w:pPr>
       <w:r>
         <w:t xml:space="preserve">JSON: </w:t>
@@ -1824,786 +1689,11 @@
         <w:rPr>
           <w:rStyle w:val="CodeExamplesChar"/>
         </w:rPr>
-        <w:t>{</w:t>
-      </w:r>
-      <w:r>
-        <w:rPr>
-          <w:rStyle w:val="CodeExamplesChar"/>
-        </w:rPr>
-        <w:t xml:space="preserve"> "error": "Not authenticated. Please provide a valid token."  }</w:t>
-      </w:r>
-    </w:p>
-    <w:p>
-      <w:pPr>
-        <w:spacing w:after="0"/>
-        <w:rPr>
-          <w:rStyle w:val="Heading3Char"/>
-          <w:u w:val="single"/>
-        </w:rPr>
-      </w:pPr>
-    </w:p>
-    <w:p>
-      <w:pPr>
-        <w:spacing w:after="0"/>
-        <w:rPr>
-          <w:rStyle w:val="Heading3Char"/>
-          <w:u w:val="single"/>
-        </w:rPr>
-      </w:pPr>
-    </w:p>
-    <w:p>
-      <w:pPr>
-        <w:spacing w:after="0"/>
-        <w:rPr>
-          <w:rStyle w:val="Heading3Char"/>
-          <w:u w:val="single"/>
-        </w:rPr>
-      </w:pPr>
-    </w:p>
-    <w:p>
-      <w:pPr>
-        <w:spacing w:after="0"/>
-        <w:rPr>
-          <w:rStyle w:val="Heading3Char"/>
-          <w:u w:val="single"/>
-        </w:rPr>
-      </w:pPr>
-    </w:p>
-    <w:p>
-      <w:pPr>
-        <w:spacing w:after="0"/>
-        <w:rPr>
-          <w:rStyle w:val="Heading3Char"/>
-          <w:u w:val="single"/>
-        </w:rPr>
-      </w:pPr>
-    </w:p>
-    <w:p>
-      <w:pPr>
-        <w:spacing w:after="0"/>
-      </w:pPr>
-      <w:r>
-        <w:rPr>
-          <w:rStyle w:val="Heading3Char"/>
-          <w:u w:val="single"/>
-        </w:rPr>
-        <w:lastRenderedPageBreak/>
-        <w:t>POST</w:t>
-      </w:r>
-      <w:r>
-        <w:rPr>
-          <w:rStyle w:val="Heading3Char"/>
-          <w:u w:val="single"/>
-        </w:rPr>
-        <w:t xml:space="preserve"> /api/ideas</w:t>
-      </w:r>
-      <w:r>
-        <w:br/>
-      </w:r>
-      <w:r>
-        <w:rPr>
-          <w:b/>
-          <w:bCs/>
-        </w:rPr>
-        <w:t>Access Control:</w:t>
-      </w:r>
-      <w:r>
-        <w:t> Authenticated User</w:t>
-      </w:r>
-    </w:p>
-    <w:p>
-      <w:pPr>
-        <w:spacing w:after="0"/>
-      </w:pPr>
-      <w:r>
-        <w:rPr>
-          <w:b/>
-          <w:bCs/>
-        </w:rPr>
-        <w:t>Case 1</w:t>
-      </w:r>
-      <w:r>
-        <w:rPr>
-          <w:b/>
-          <w:bCs/>
-        </w:rPr>
-        <w:t xml:space="preserve"> – 201 Idea Created Successfully </w:t>
-      </w:r>
-      <w:r>
-        <w:t> </w:t>
-      </w:r>
-      <w:r>
-        <w:t xml:space="preserve"> </w:t>
-      </w:r>
-    </w:p>
-    <w:p>
-      <w:pPr>
-        <w:pStyle w:val="ListParagraph"/>
-        <w:numPr>
-          <w:ilvl w:val="0"/>
-          <w:numId w:val="3"/>
-        </w:numPr>
-        <w:spacing w:after="0"/>
-        <w:rPr>
-          <w:b/>
-          <w:bCs/>
-        </w:rPr>
-      </w:pPr>
-      <w:r>
-        <w:t>Click </w:t>
-      </w:r>
-      <w:r>
-        <w:rPr>
-          <w:b/>
-          <w:bCs/>
-        </w:rPr>
-        <w:t>Try it out</w:t>
-      </w:r>
-    </w:p>
-    <w:p>
-      <w:pPr>
-        <w:pStyle w:val="ListParagraph"/>
-        <w:numPr>
-          <w:ilvl w:val="0"/>
-          <w:numId w:val="3"/>
-        </w:numPr>
-        <w:spacing w:after="0"/>
-        <w:rPr>
-          <w:b/>
-          <w:bCs/>
-        </w:rPr>
-      </w:pPr>
-      <w:r>
-        <w:t xml:space="preserve">Click </w:t>
-      </w:r>
-      <w:r>
-        <w:rPr>
-          <w:b/>
-          <w:bCs/>
-        </w:rPr>
-        <w:t>Execute</w:t>
-      </w:r>
-    </w:p>
-    <w:p>
-      <w:pPr>
-        <w:pStyle w:val="ListParagraph"/>
-        <w:numPr>
-          <w:ilvl w:val="0"/>
-          <w:numId w:val="3"/>
-        </w:numPr>
-        <w:spacing w:after="0"/>
-      </w:pPr>
-      <w:r>
-        <w:t>Expect response: </w:t>
-      </w:r>
-    </w:p>
-    <w:p>
-      <w:pPr>
-        <w:pStyle w:val="ListParagraph"/>
-        <w:numPr>
-          <w:ilvl w:val="1"/>
-          <w:numId w:val="3"/>
-        </w:numPr>
-        <w:spacing w:after="0"/>
-      </w:pPr>
-      <w:r>
-        <w:t xml:space="preserve">Status: </w:t>
-      </w:r>
-      <w:r>
-        <w:t>201</w:t>
-      </w:r>
-    </w:p>
-    <w:p>
-      <w:pPr>
-        <w:pStyle w:val="ListParagraph"/>
-        <w:numPr>
-          <w:ilvl w:val="1"/>
-          <w:numId w:val="3"/>
-        </w:numPr>
-        <w:spacing w:after="0"/>
-      </w:pPr>
-      <w:r>
-        <w:t xml:space="preserve">JSON: </w:t>
-      </w:r>
-    </w:p>
-    <w:p>
-      <w:pPr>
-        <w:pStyle w:val="CodeExamples"/>
-        <w:ind w:left="1440"/>
-      </w:pPr>
-      <w:r>
-        <w:t>{</w:t>
-      </w:r>
-    </w:p>
-    <w:p>
-      <w:pPr>
-        <w:pStyle w:val="CodeExamples"/>
-        <w:ind w:left="1440"/>
-      </w:pPr>
-      <w:r>
-        <w:t xml:space="preserve">  "id": 10,</w:t>
-      </w:r>
-    </w:p>
-    <w:p>
-      <w:pPr>
-        <w:pStyle w:val="CodeExamples"/>
-        <w:ind w:left="1440"/>
-      </w:pPr>
-      <w:r>
-        <w:t xml:space="preserve">  "name": "A Task Manager",</w:t>
-      </w:r>
-    </w:p>
-    <w:p>
-      <w:pPr>
-        <w:pStyle w:val="CodeExamples"/>
-        <w:ind w:left="1440"/>
-      </w:pPr>
-      <w:r>
-        <w:t xml:space="preserve">  "description": "A web app that manages tasks.",</w:t>
-      </w:r>
-    </w:p>
-    <w:p>
-      <w:pPr>
-        <w:pStyle w:val="CodeExamples"/>
-        <w:ind w:left="1440"/>
-      </w:pPr>
-      <w:r>
-        <w:t xml:space="preserve">  "date_created": "2026-04-28T17:45:09.600Z",</w:t>
-      </w:r>
-    </w:p>
-    <w:p>
-      <w:pPr>
-        <w:pStyle w:val="CodeExamples"/>
-        <w:ind w:left="1440"/>
-      </w:pPr>
-      <w:r>
-        <w:t xml:space="preserve">  "userId": 1</w:t>
-      </w:r>
-    </w:p>
-    <w:p>
-      <w:pPr>
-        <w:pStyle w:val="CodeExamples"/>
-        <w:ind w:left="1440"/>
-        <w:rPr>
-          <w:b/>
-          <w:bCs/>
-        </w:rPr>
-      </w:pPr>
-      <w:r>
-        <w:t>}</w:t>
-      </w:r>
-      <w:r>
-        <w:t xml:space="preserve"> </w:t>
-      </w:r>
-    </w:p>
-    <w:p>
-      <w:pPr>
-        <w:spacing w:after="0"/>
-      </w:pPr>
-      <w:r>
-        <w:rPr>
-          <w:b/>
-          <w:bCs/>
-        </w:rPr>
-        <w:t>Case 2 – 400 Bad Request:</w:t>
-      </w:r>
-      <w:r>
-        <w:rPr>
-          <w:b/>
-          <w:bCs/>
-        </w:rPr>
-        <w:t xml:space="preserve"> </w:t>
-      </w:r>
-      <w:r>
-        <w:t xml:space="preserve">Name and Description are both empty. </w:t>
-      </w:r>
-    </w:p>
-    <w:p>
-      <w:pPr>
-        <w:pStyle w:val="ListParagraph"/>
-        <w:numPr>
-          <w:ilvl w:val="0"/>
-          <w:numId w:val="3"/>
-        </w:numPr>
-        <w:spacing w:after="0"/>
-      </w:pPr>
-      <w:r>
-        <w:t>Go through the login process again.</w:t>
-      </w:r>
-    </w:p>
-    <w:p>
-      <w:pPr>
-        <w:pStyle w:val="ListParagraph"/>
-        <w:numPr>
-          <w:ilvl w:val="0"/>
-          <w:numId w:val="3"/>
-        </w:numPr>
-        <w:spacing w:after="0"/>
-      </w:pPr>
-      <w:r>
-        <w:t>Click </w:t>
-      </w:r>
-      <w:r>
-        <w:rPr>
-          <w:b/>
-          <w:bCs/>
-        </w:rPr>
-        <w:t>Try it out</w:t>
-      </w:r>
-    </w:p>
-    <w:p>
-      <w:pPr>
-        <w:pStyle w:val="ListParagraph"/>
-        <w:numPr>
-          <w:ilvl w:val="0"/>
-          <w:numId w:val="3"/>
-        </w:numPr>
-        <w:spacing w:after="0"/>
-      </w:pPr>
-      <w:r>
-        <w:t>Delete everything in the request body</w:t>
-      </w:r>
-      <w:r>
-        <w:t xml:space="preserve"> except for {}</w:t>
-      </w:r>
-      <w:r>
-        <w:t>.</w:t>
-      </w:r>
-    </w:p>
-    <w:p>
-      <w:pPr>
-        <w:pStyle w:val="ListParagraph"/>
-        <w:numPr>
-          <w:ilvl w:val="0"/>
-          <w:numId w:val="3"/>
-        </w:numPr>
-        <w:spacing w:after="0"/>
-      </w:pPr>
-      <w:r>
-        <w:t xml:space="preserve">Click </w:t>
-      </w:r>
-      <w:r>
-        <w:rPr>
-          <w:b/>
-          <w:bCs/>
-        </w:rPr>
-        <w:t>Execute</w:t>
-      </w:r>
-    </w:p>
-    <w:p>
-      <w:pPr>
-        <w:pStyle w:val="ListParagraph"/>
-        <w:numPr>
-          <w:ilvl w:val="0"/>
-          <w:numId w:val="3"/>
-        </w:numPr>
-        <w:spacing w:after="0"/>
-      </w:pPr>
-      <w:r>
-        <w:t>Expected response:</w:t>
-      </w:r>
-    </w:p>
-    <w:p>
-      <w:pPr>
-        <w:pStyle w:val="ListParagraph"/>
-        <w:numPr>
-          <w:ilvl w:val="1"/>
-          <w:numId w:val="3"/>
-        </w:numPr>
-        <w:spacing w:after="0"/>
-      </w:pPr>
-      <w:r>
-        <w:t>Status: 400</w:t>
-      </w:r>
-    </w:p>
-    <w:p>
-      <w:pPr>
-        <w:pStyle w:val="ListParagraph"/>
-        <w:numPr>
-          <w:ilvl w:val="1"/>
-          <w:numId w:val="3"/>
-        </w:numPr>
-        <w:spacing w:after="0"/>
-      </w:pPr>
-      <w:r>
-        <w:t>JSON:</w:t>
-      </w:r>
-    </w:p>
-    <w:p>
-      <w:pPr>
-        <w:pStyle w:val="CodeExamples"/>
-        <w:ind w:left="1440"/>
-      </w:pPr>
-      <w:r>
-        <w:t>{</w:t>
-      </w:r>
-    </w:p>
-    <w:p>
-      <w:pPr>
-        <w:pStyle w:val="CodeExamples"/>
-        <w:ind w:left="1440"/>
-      </w:pPr>
-      <w:r>
-        <w:t xml:space="preserve">  "errors": [</w:t>
-      </w:r>
-    </w:p>
-    <w:p>
-      <w:pPr>
-        <w:pStyle w:val="CodeExamples"/>
-        <w:ind w:left="1440"/>
-      </w:pPr>
-      <w:r>
-        <w:t xml:space="preserve">    {</w:t>
-      </w:r>
-    </w:p>
-    <w:p>
-      <w:pPr>
-        <w:pStyle w:val="CodeExamples"/>
-        <w:ind w:left="1440"/>
-      </w:pPr>
-      <w:r>
-        <w:t xml:space="preserve">      "field": "name",</w:t>
-      </w:r>
-    </w:p>
-    <w:p>
-      <w:pPr>
-        <w:pStyle w:val="CodeExamples"/>
-        <w:ind w:left="1440"/>
-      </w:pPr>
-      <w:r>
-        <w:t xml:space="preserve">      "message": "Name is required"</w:t>
-      </w:r>
-    </w:p>
-    <w:p>
-      <w:pPr>
-        <w:pStyle w:val="CodeExamples"/>
-        <w:ind w:left="1440"/>
-      </w:pPr>
-      <w:r>
-        <w:t xml:space="preserve">    },</w:t>
-      </w:r>
-    </w:p>
-    <w:p>
-      <w:pPr>
-        <w:pStyle w:val="CodeExamples"/>
-        <w:ind w:left="1440"/>
-      </w:pPr>
-      <w:r>
-        <w:t xml:space="preserve">    {</w:t>
-      </w:r>
-    </w:p>
-    <w:p>
-      <w:pPr>
-        <w:pStyle w:val="CodeExamples"/>
-        <w:ind w:left="1440"/>
-      </w:pPr>
-      <w:r>
-        <w:t xml:space="preserve">      "field": "description",</w:t>
-      </w:r>
-    </w:p>
-    <w:p>
-      <w:pPr>
-        <w:pStyle w:val="CodeExamples"/>
-        <w:ind w:left="1440"/>
-      </w:pPr>
-      <w:r>
-        <w:t xml:space="preserve">      "message": "Description is required"</w:t>
-      </w:r>
-    </w:p>
-    <w:p>
-      <w:pPr>
-        <w:pStyle w:val="CodeExamples"/>
-        <w:ind w:left="1440"/>
-      </w:pPr>
-      <w:r>
-        <w:t xml:space="preserve">    }</w:t>
-      </w:r>
-    </w:p>
-    <w:p>
-      <w:pPr>
-        <w:pStyle w:val="CodeExamples"/>
-        <w:ind w:left="1440"/>
-      </w:pPr>
-      <w:r>
-        <w:t xml:space="preserve">  ]</w:t>
-      </w:r>
-    </w:p>
-    <w:p>
-      <w:pPr>
-        <w:pStyle w:val="CodeExamples"/>
-        <w:ind w:left="1440"/>
-      </w:pPr>
-      <w:r>
-        <w:t>}</w:t>
-      </w:r>
-    </w:p>
-    <w:p>
-      <w:pPr>
-        <w:spacing w:after="0"/>
-      </w:pPr>
-      <w:r>
-        <w:rPr>
-          <w:b/>
-          <w:bCs/>
-        </w:rPr>
-        <w:t xml:space="preserve">Case </w:t>
-      </w:r>
-      <w:r>
-        <w:rPr>
-          <w:b/>
-          <w:bCs/>
-        </w:rPr>
-        <w:t>3</w:t>
-      </w:r>
-      <w:r>
-        <w:rPr>
-          <w:b/>
-          <w:bCs/>
-        </w:rPr>
-        <w:t xml:space="preserve"> – 409 Conflict:</w:t>
-      </w:r>
-      <w:r>
-        <w:t xml:space="preserve"> Idea with th</w:t>
-      </w:r>
-      <w:r>
-        <w:t>at</w:t>
-      </w:r>
-      <w:r>
-        <w:t xml:space="preserve"> name already exists</w:t>
-      </w:r>
-    </w:p>
-    <w:p>
-      <w:pPr>
-        <w:pStyle w:val="ListParagraph"/>
-        <w:numPr>
-          <w:ilvl w:val="0"/>
-          <w:numId w:val="3"/>
-        </w:numPr>
-        <w:spacing w:after="0"/>
-      </w:pPr>
-      <w:r>
-        <w:t xml:space="preserve">Click </w:t>
-      </w:r>
-      <w:r>
-        <w:rPr>
-          <w:b/>
-          <w:bCs/>
-        </w:rPr>
-        <w:t>reset</w:t>
-      </w:r>
-    </w:p>
-    <w:p>
-      <w:pPr>
-        <w:pStyle w:val="ListParagraph"/>
-        <w:numPr>
-          <w:ilvl w:val="0"/>
-          <w:numId w:val="3"/>
-        </w:numPr>
-        <w:spacing w:after="0"/>
-      </w:pPr>
-      <w:r>
-        <w:t xml:space="preserve">Click </w:t>
-      </w:r>
-      <w:r>
-        <w:rPr>
-          <w:b/>
-          <w:bCs/>
-        </w:rPr>
-        <w:t>Try it out</w:t>
-      </w:r>
-    </w:p>
-    <w:p>
-      <w:pPr>
-        <w:pStyle w:val="ListParagraph"/>
-        <w:numPr>
-          <w:ilvl w:val="0"/>
-          <w:numId w:val="3"/>
-        </w:numPr>
-        <w:spacing w:after="0"/>
-      </w:pPr>
-      <w:r>
-        <w:t xml:space="preserve">Click </w:t>
-      </w:r>
-      <w:r>
-        <w:rPr>
-          <w:b/>
-          <w:bCs/>
-        </w:rPr>
-        <w:t>Execute</w:t>
-      </w:r>
-    </w:p>
-    <w:p>
-      <w:pPr>
-        <w:pStyle w:val="ListParagraph"/>
-        <w:numPr>
-          <w:ilvl w:val="0"/>
-          <w:numId w:val="3"/>
-        </w:numPr>
-        <w:spacing w:after="0"/>
-      </w:pPr>
-      <w:r>
-        <w:t>Expected response:</w:t>
-      </w:r>
-    </w:p>
-    <w:p>
-      <w:pPr>
-        <w:pStyle w:val="ListParagraph"/>
-        <w:numPr>
-          <w:ilvl w:val="1"/>
-          <w:numId w:val="3"/>
-        </w:numPr>
-        <w:spacing w:after="0"/>
-      </w:pPr>
-      <w:r>
-        <w:t xml:space="preserve">Status: </w:t>
-      </w:r>
-      <w:r>
-        <w:t>409</w:t>
-      </w:r>
-    </w:p>
-    <w:p>
-      <w:pPr>
-        <w:pStyle w:val="ListParagraph"/>
-        <w:numPr>
-          <w:ilvl w:val="1"/>
-          <w:numId w:val="3"/>
-        </w:numPr>
-        <w:spacing w:after="0"/>
-      </w:pPr>
-      <w:r>
-        <w:t xml:space="preserve">JSON: </w:t>
-      </w:r>
-      <w:r>
-        <w:rPr>
-          <w:rStyle w:val="CodeExamplesChar"/>
-        </w:rPr>
-        <w:t>{</w:t>
-      </w:r>
-      <w:r>
-        <w:rPr>
-          <w:rStyle w:val="CodeExamplesChar"/>
-        </w:rPr>
-        <w:t xml:space="preserve"> "error": "Idea with name \"A Task Manager\" already exists" }</w:t>
-      </w:r>
-    </w:p>
-    <w:p>
-      <w:pPr>
-        <w:spacing w:after="0"/>
-      </w:pPr>
-      <w:r>
-        <w:rPr>
-          <w:b/>
-          <w:bCs/>
-        </w:rPr>
-        <w:t xml:space="preserve">Case </w:t>
-      </w:r>
-      <w:r>
-        <w:rPr>
-          <w:b/>
-          <w:bCs/>
-        </w:rPr>
-        <w:t>4</w:t>
-      </w:r>
-      <w:r>
-        <w:rPr>
-          <w:b/>
-          <w:bCs/>
-        </w:rPr>
-        <w:t xml:space="preserve"> – 401 Unauthorized:</w:t>
-      </w:r>
-      <w:r>
-        <w:t> Remove the JWT from the Authorize feature.</w:t>
-      </w:r>
-    </w:p>
-    <w:p>
-      <w:pPr>
-        <w:pStyle w:val="ListParagraph"/>
-        <w:numPr>
-          <w:ilvl w:val="0"/>
-          <w:numId w:val="3"/>
-        </w:numPr>
-        <w:spacing w:after="0"/>
-      </w:pPr>
-      <w:r>
-        <w:t xml:space="preserve">Click the </w:t>
-      </w:r>
-      <w:r>
-        <w:rPr>
-          <w:b/>
-          <w:bCs/>
-        </w:rPr>
-        <w:t xml:space="preserve">Authorize </w:t>
-      </w:r>
-      <w:r>
-        <w:t xml:space="preserve">button at the top of the page and then press </w:t>
-      </w:r>
-      <w:r>
-        <w:rPr>
-          <w:b/>
-          <w:bCs/>
-        </w:rPr>
-        <w:t>logout</w:t>
-      </w:r>
-    </w:p>
-    <w:p>
-      <w:pPr>
-        <w:pStyle w:val="ListParagraph"/>
-        <w:numPr>
-          <w:ilvl w:val="0"/>
-          <w:numId w:val="3"/>
-        </w:numPr>
-        <w:spacing w:after="0"/>
-      </w:pPr>
-      <w:r>
-        <w:t>Click </w:t>
-      </w:r>
-      <w:r>
-        <w:rPr>
-          <w:b/>
-          <w:bCs/>
-        </w:rPr>
-        <w:t>Try it out</w:t>
-      </w:r>
-    </w:p>
-    <w:p>
-      <w:pPr>
-        <w:pStyle w:val="ListParagraph"/>
-        <w:numPr>
-          <w:ilvl w:val="0"/>
-          <w:numId w:val="3"/>
-        </w:numPr>
-        <w:spacing w:after="0"/>
-      </w:pPr>
-      <w:r>
-        <w:t>Expect</w:t>
-      </w:r>
-      <w:r>
-        <w:t>ed response:</w:t>
-      </w:r>
-    </w:p>
-    <w:p>
-      <w:pPr>
-        <w:pStyle w:val="ListParagraph"/>
-        <w:numPr>
-          <w:ilvl w:val="1"/>
-          <w:numId w:val="3"/>
-        </w:numPr>
-        <w:spacing w:after="0"/>
-      </w:pPr>
-      <w:r>
-        <w:t>Status:</w:t>
-      </w:r>
-      <w:r>
-        <w:t> 401 Unauthorized.</w:t>
-      </w:r>
-    </w:p>
-    <w:p>
-      <w:pPr>
-        <w:pStyle w:val="ListParagraph"/>
-        <w:numPr>
-          <w:ilvl w:val="1"/>
-          <w:numId w:val="3"/>
-        </w:numPr>
+        <w:t>{ "error": "Not authenticated. Please provide a valid token."  }</w:t>
+      </w:r>
+    </w:p>
+    <w:p>
+      <w:pPr>
         <w:spacing w:after="0"/>
         <w:rPr>
           <w:rStyle w:val="Heading3Char"/>
@@ -2613,21 +1703,6 @@
           <w:szCs w:val="24"/>
         </w:rPr>
       </w:pPr>
-      <w:r>
-        <w:t xml:space="preserve">JSON: </w:t>
-      </w:r>
-      <w:r>
-        <w:rPr>
-          <w:rStyle w:val="CodeExamplesChar"/>
-        </w:rPr>
-        <w:t>{</w:t>
-      </w:r>
-      <w:r>
-        <w:rPr>
-          <w:rStyle w:val="CodeExamplesChar"/>
-        </w:rPr>
-        <w:t xml:space="preserve"> "error": "Not authenticated. Please provide a valid token." }</w:t>
-      </w:r>
     </w:p>
     <w:p>
       <w:pPr>
@@ -2638,7 +1713,762 @@
           <w:rStyle w:val="Heading3Char"/>
           <w:u w:val="single"/>
         </w:rPr>
+        <w:t>POST</w:t>
+      </w:r>
+      <w:r>
+        <w:rPr>
+          <w:rStyle w:val="Heading3Char"/>
+          <w:u w:val="single"/>
+        </w:rPr>
+        <w:t xml:space="preserve"> /api/ideas</w:t>
+      </w:r>
+      <w:r>
+        <w:br/>
+      </w:r>
+      <w:r>
+        <w:rPr>
+          <w:b/>
+          <w:bCs/>
+        </w:rPr>
+        <w:t>Access Control:</w:t>
+      </w:r>
+      <w:r>
+        <w:t> Authenticated User</w:t>
+      </w:r>
+    </w:p>
+    <w:p>
+      <w:pPr>
+        <w:spacing w:after="0"/>
+      </w:pPr>
+      <w:r>
+        <w:rPr>
+          <w:b/>
+          <w:bCs/>
+        </w:rPr>
+        <w:t>Case 1</w:t>
+      </w:r>
+      <w:r>
+        <w:rPr>
+          <w:b/>
+          <w:bCs/>
+        </w:rPr>
+        <w:t xml:space="preserve"> – 201 Idea Created Successfully </w:t>
+      </w:r>
+      <w:r>
+        <w:t> </w:t>
+      </w:r>
+      <w:r>
+        <w:t xml:space="preserve"> </w:t>
+      </w:r>
+    </w:p>
+    <w:p>
+      <w:pPr>
+        <w:pStyle w:val="ListParagraph"/>
+        <w:numPr>
+          <w:ilvl w:val="0"/>
+          <w:numId w:val="3"/>
+        </w:numPr>
+        <w:spacing w:after="0"/>
+        <w:rPr>
+          <w:b/>
+          <w:bCs/>
+        </w:rPr>
+      </w:pPr>
+      <w:r>
+        <w:t>Click </w:t>
+      </w:r>
+      <w:r>
+        <w:rPr>
+          <w:b/>
+          <w:bCs/>
+        </w:rPr>
+        <w:t>Try it out</w:t>
+      </w:r>
+    </w:p>
+    <w:p>
+      <w:pPr>
+        <w:pStyle w:val="ListParagraph"/>
+        <w:numPr>
+          <w:ilvl w:val="0"/>
+          <w:numId w:val="3"/>
+        </w:numPr>
+        <w:spacing w:after="0"/>
+        <w:rPr>
+          <w:b/>
+          <w:bCs/>
+        </w:rPr>
+      </w:pPr>
+      <w:r>
+        <w:t xml:space="preserve">Click </w:t>
+      </w:r>
+      <w:r>
+        <w:rPr>
+          <w:b/>
+          <w:bCs/>
+        </w:rPr>
+        <w:t>Execute</w:t>
+      </w:r>
+    </w:p>
+    <w:p>
+      <w:pPr>
+        <w:spacing w:after="0"/>
+        <w:ind w:left="360"/>
+      </w:pPr>
+    </w:p>
+    <w:p>
+      <w:pPr>
+        <w:pStyle w:val="ListParagraph"/>
+        <w:numPr>
+          <w:ilvl w:val="0"/>
+          <w:numId w:val="3"/>
+        </w:numPr>
+        <w:spacing w:after="0"/>
+      </w:pPr>
+      <w:r>
         <w:lastRenderedPageBreak/>
+        <w:t>Expect response: </w:t>
+      </w:r>
+    </w:p>
+    <w:p>
+      <w:pPr>
+        <w:pStyle w:val="ListParagraph"/>
+        <w:numPr>
+          <w:ilvl w:val="1"/>
+          <w:numId w:val="3"/>
+        </w:numPr>
+        <w:spacing w:after="0"/>
+      </w:pPr>
+      <w:r>
+        <w:t xml:space="preserve">Status: </w:t>
+      </w:r>
+      <w:r>
+        <w:t>201</w:t>
+      </w:r>
+    </w:p>
+    <w:p>
+      <w:pPr>
+        <w:pStyle w:val="ListParagraph"/>
+        <w:numPr>
+          <w:ilvl w:val="1"/>
+          <w:numId w:val="3"/>
+        </w:numPr>
+        <w:spacing w:after="0"/>
+      </w:pPr>
+      <w:r>
+        <w:t xml:space="preserve">JSON: </w:t>
+      </w:r>
+    </w:p>
+    <w:p>
+      <w:pPr>
+        <w:pStyle w:val="CodeExamples"/>
+        <w:ind w:left="1440"/>
+      </w:pPr>
+      <w:r>
+        <w:t>{</w:t>
+      </w:r>
+    </w:p>
+    <w:p>
+      <w:pPr>
+        <w:pStyle w:val="CodeExamples"/>
+        <w:ind w:left="1440"/>
+      </w:pPr>
+      <w:r>
+        <w:t xml:space="preserve">  "id": 10,</w:t>
+      </w:r>
+    </w:p>
+    <w:p>
+      <w:pPr>
+        <w:pStyle w:val="CodeExamples"/>
+        <w:ind w:left="1440"/>
+      </w:pPr>
+      <w:r>
+        <w:t xml:space="preserve">  "name": "A Task Manager",</w:t>
+      </w:r>
+    </w:p>
+    <w:p>
+      <w:pPr>
+        <w:pStyle w:val="CodeExamples"/>
+        <w:ind w:left="1440"/>
+      </w:pPr>
+      <w:r>
+        <w:t xml:space="preserve">  "description": "A web app that manages tasks.",</w:t>
+      </w:r>
+    </w:p>
+    <w:p>
+      <w:pPr>
+        <w:pStyle w:val="CodeExamples"/>
+        <w:ind w:left="1440"/>
+      </w:pPr>
+      <w:r>
+        <w:t xml:space="preserve">  "date_created": "2026-04-28T17:45:09.600Z",</w:t>
+      </w:r>
+    </w:p>
+    <w:p>
+      <w:pPr>
+        <w:pStyle w:val="CodeExamples"/>
+        <w:ind w:left="1440"/>
+      </w:pPr>
+      <w:r>
+        <w:t xml:space="preserve">  "userId": 1</w:t>
+      </w:r>
+    </w:p>
+    <w:p>
+      <w:pPr>
+        <w:pStyle w:val="CodeExamples"/>
+        <w:ind w:left="1440"/>
+        <w:rPr>
+          <w:b/>
+          <w:bCs/>
+        </w:rPr>
+      </w:pPr>
+      <w:r>
+        <w:t>}</w:t>
+      </w:r>
+      <w:r>
+        <w:t xml:space="preserve"> </w:t>
+      </w:r>
+    </w:p>
+    <w:p>
+      <w:pPr>
+        <w:spacing w:after="0"/>
+      </w:pPr>
+      <w:r>
+        <w:rPr>
+          <w:b/>
+          <w:bCs/>
+        </w:rPr>
+        <w:t>Case 2 – 400 Bad Request:</w:t>
+      </w:r>
+      <w:r>
+        <w:rPr>
+          <w:b/>
+          <w:bCs/>
+        </w:rPr>
+        <w:t xml:space="preserve"> </w:t>
+      </w:r>
+      <w:r>
+        <w:t xml:space="preserve">Name and Description are both empty. </w:t>
+      </w:r>
+    </w:p>
+    <w:p>
+      <w:pPr>
+        <w:pStyle w:val="ListParagraph"/>
+        <w:numPr>
+          <w:ilvl w:val="0"/>
+          <w:numId w:val="3"/>
+        </w:numPr>
+        <w:spacing w:after="0"/>
+      </w:pPr>
+      <w:r>
+        <w:t>Go through the login process again.</w:t>
+      </w:r>
+    </w:p>
+    <w:p>
+      <w:pPr>
+        <w:pStyle w:val="ListParagraph"/>
+        <w:numPr>
+          <w:ilvl w:val="0"/>
+          <w:numId w:val="3"/>
+        </w:numPr>
+        <w:spacing w:after="0"/>
+      </w:pPr>
+      <w:r>
+        <w:t>Click </w:t>
+      </w:r>
+      <w:r>
+        <w:rPr>
+          <w:b/>
+          <w:bCs/>
+        </w:rPr>
+        <w:t>Try it out</w:t>
+      </w:r>
+    </w:p>
+    <w:p>
+      <w:pPr>
+        <w:pStyle w:val="ListParagraph"/>
+        <w:numPr>
+          <w:ilvl w:val="0"/>
+          <w:numId w:val="3"/>
+        </w:numPr>
+        <w:spacing w:after="0"/>
+      </w:pPr>
+      <w:r>
+        <w:t>Delete everything in the request body</w:t>
+      </w:r>
+      <w:r>
+        <w:t xml:space="preserve"> except for {}</w:t>
+      </w:r>
+      <w:r>
+        <w:t>.</w:t>
+      </w:r>
+    </w:p>
+    <w:p>
+      <w:pPr>
+        <w:pStyle w:val="ListParagraph"/>
+        <w:numPr>
+          <w:ilvl w:val="0"/>
+          <w:numId w:val="3"/>
+        </w:numPr>
+        <w:spacing w:after="0"/>
+      </w:pPr>
+      <w:r>
+        <w:t xml:space="preserve">Click </w:t>
+      </w:r>
+      <w:r>
+        <w:rPr>
+          <w:b/>
+          <w:bCs/>
+        </w:rPr>
+        <w:t>Execute</w:t>
+      </w:r>
+    </w:p>
+    <w:p>
+      <w:pPr>
+        <w:pStyle w:val="ListParagraph"/>
+        <w:numPr>
+          <w:ilvl w:val="0"/>
+          <w:numId w:val="3"/>
+        </w:numPr>
+        <w:spacing w:after="0"/>
+      </w:pPr>
+      <w:r>
+        <w:t>Expected response:</w:t>
+      </w:r>
+    </w:p>
+    <w:p>
+      <w:pPr>
+        <w:pStyle w:val="ListParagraph"/>
+        <w:numPr>
+          <w:ilvl w:val="1"/>
+          <w:numId w:val="3"/>
+        </w:numPr>
+        <w:spacing w:after="0"/>
+      </w:pPr>
+      <w:r>
+        <w:t>Status: 400</w:t>
+      </w:r>
+    </w:p>
+    <w:p>
+      <w:pPr>
+        <w:pStyle w:val="ListParagraph"/>
+        <w:numPr>
+          <w:ilvl w:val="1"/>
+          <w:numId w:val="3"/>
+        </w:numPr>
+        <w:spacing w:after="0"/>
+      </w:pPr>
+      <w:r>
+        <w:t>JSON:</w:t>
+      </w:r>
+    </w:p>
+    <w:p>
+      <w:pPr>
+        <w:pStyle w:val="CodeExamples"/>
+        <w:ind w:left="1440"/>
+      </w:pPr>
+      <w:r>
+        <w:t>{</w:t>
+      </w:r>
+    </w:p>
+    <w:p>
+      <w:pPr>
+        <w:pStyle w:val="CodeExamples"/>
+        <w:ind w:left="1440"/>
+      </w:pPr>
+      <w:r>
+        <w:t xml:space="preserve">  "errors": [</w:t>
+      </w:r>
+    </w:p>
+    <w:p>
+      <w:pPr>
+        <w:pStyle w:val="CodeExamples"/>
+        <w:ind w:left="1440"/>
+      </w:pPr>
+      <w:r>
+        <w:t xml:space="preserve">    {</w:t>
+      </w:r>
+    </w:p>
+    <w:p>
+      <w:pPr>
+        <w:pStyle w:val="CodeExamples"/>
+        <w:ind w:left="1440"/>
+      </w:pPr>
+      <w:r>
+        <w:t xml:space="preserve">      "field": "name",</w:t>
+      </w:r>
+    </w:p>
+    <w:p>
+      <w:pPr>
+        <w:pStyle w:val="CodeExamples"/>
+        <w:ind w:left="1440"/>
+      </w:pPr>
+      <w:r>
+        <w:t xml:space="preserve">      "message": "Name is required"</w:t>
+      </w:r>
+    </w:p>
+    <w:p>
+      <w:pPr>
+        <w:pStyle w:val="CodeExamples"/>
+        <w:ind w:left="1440"/>
+      </w:pPr>
+      <w:r>
+        <w:t xml:space="preserve">    },</w:t>
+      </w:r>
+    </w:p>
+    <w:p>
+      <w:pPr>
+        <w:pStyle w:val="CodeExamples"/>
+        <w:ind w:left="1440"/>
+      </w:pPr>
+      <w:r>
+        <w:t xml:space="preserve">    {</w:t>
+      </w:r>
+    </w:p>
+    <w:p>
+      <w:pPr>
+        <w:pStyle w:val="CodeExamples"/>
+        <w:ind w:left="1440"/>
+      </w:pPr>
+      <w:r>
+        <w:t xml:space="preserve">      "field": "description",</w:t>
+      </w:r>
+    </w:p>
+    <w:p>
+      <w:pPr>
+        <w:pStyle w:val="CodeExamples"/>
+        <w:ind w:left="1440"/>
+      </w:pPr>
+      <w:r>
+        <w:t xml:space="preserve">      "message": "Description is required"</w:t>
+      </w:r>
+    </w:p>
+    <w:p>
+      <w:pPr>
+        <w:pStyle w:val="CodeExamples"/>
+        <w:ind w:left="1440"/>
+      </w:pPr>
+      <w:r>
+        <w:t xml:space="preserve">    }</w:t>
+      </w:r>
+    </w:p>
+    <w:p>
+      <w:pPr>
+        <w:pStyle w:val="CodeExamples"/>
+        <w:ind w:left="1440"/>
+      </w:pPr>
+      <w:r>
+        <w:t xml:space="preserve">  ]</w:t>
+      </w:r>
+    </w:p>
+    <w:p>
+      <w:pPr>
+        <w:pStyle w:val="CodeExamples"/>
+        <w:ind w:left="1440"/>
+      </w:pPr>
+      <w:r>
+        <w:t>}</w:t>
+      </w:r>
+    </w:p>
+    <w:p>
+      <w:pPr>
+        <w:spacing w:after="0"/>
+      </w:pPr>
+      <w:r>
+        <w:rPr>
+          <w:b/>
+          <w:bCs/>
+        </w:rPr>
+        <w:t xml:space="preserve">Case </w:t>
+      </w:r>
+      <w:r>
+        <w:rPr>
+          <w:b/>
+          <w:bCs/>
+        </w:rPr>
+        <w:t>3</w:t>
+      </w:r>
+      <w:r>
+        <w:rPr>
+          <w:b/>
+          <w:bCs/>
+        </w:rPr>
+        <w:t xml:space="preserve"> – 409 Conflict:</w:t>
+      </w:r>
+      <w:r>
+        <w:t xml:space="preserve"> Idea with th</w:t>
+      </w:r>
+      <w:r>
+        <w:t>at</w:t>
+      </w:r>
+      <w:r>
+        <w:t xml:space="preserve"> name already exists</w:t>
+      </w:r>
+    </w:p>
+    <w:p>
+      <w:pPr>
+        <w:pStyle w:val="ListParagraph"/>
+        <w:numPr>
+          <w:ilvl w:val="0"/>
+          <w:numId w:val="3"/>
+        </w:numPr>
+        <w:spacing w:after="0"/>
+      </w:pPr>
+      <w:r>
+        <w:t xml:space="preserve">Click </w:t>
+      </w:r>
+      <w:r>
+        <w:rPr>
+          <w:b/>
+          <w:bCs/>
+        </w:rPr>
+        <w:t>reset</w:t>
+      </w:r>
+    </w:p>
+    <w:p>
+      <w:pPr>
+        <w:pStyle w:val="ListParagraph"/>
+        <w:numPr>
+          <w:ilvl w:val="0"/>
+          <w:numId w:val="3"/>
+        </w:numPr>
+        <w:spacing w:after="0"/>
+      </w:pPr>
+      <w:r>
+        <w:t xml:space="preserve">Click </w:t>
+      </w:r>
+      <w:r>
+        <w:rPr>
+          <w:b/>
+          <w:bCs/>
+        </w:rPr>
+        <w:t>Try it out</w:t>
+      </w:r>
+    </w:p>
+    <w:p>
+      <w:pPr>
+        <w:pStyle w:val="ListParagraph"/>
+        <w:numPr>
+          <w:ilvl w:val="0"/>
+          <w:numId w:val="3"/>
+        </w:numPr>
+        <w:spacing w:after="0"/>
+      </w:pPr>
+      <w:r>
+        <w:t xml:space="preserve">Click </w:t>
+      </w:r>
+      <w:r>
+        <w:rPr>
+          <w:b/>
+          <w:bCs/>
+        </w:rPr>
+        <w:t>Execute</w:t>
+      </w:r>
+    </w:p>
+    <w:p>
+      <w:pPr>
+        <w:pStyle w:val="ListParagraph"/>
+        <w:numPr>
+          <w:ilvl w:val="0"/>
+          <w:numId w:val="3"/>
+        </w:numPr>
+        <w:spacing w:after="0"/>
+      </w:pPr>
+      <w:r>
+        <w:t>Expected response:</w:t>
+      </w:r>
+    </w:p>
+    <w:p>
+      <w:pPr>
+        <w:pStyle w:val="ListParagraph"/>
+        <w:numPr>
+          <w:ilvl w:val="1"/>
+          <w:numId w:val="3"/>
+        </w:numPr>
+        <w:spacing w:after="0"/>
+      </w:pPr>
+      <w:r>
+        <w:t xml:space="preserve">Status: </w:t>
+      </w:r>
+      <w:r>
+        <w:t>409</w:t>
+      </w:r>
+    </w:p>
+    <w:p>
+      <w:pPr>
+        <w:pStyle w:val="ListParagraph"/>
+        <w:numPr>
+          <w:ilvl w:val="1"/>
+          <w:numId w:val="3"/>
+        </w:numPr>
+        <w:spacing w:after="0"/>
+      </w:pPr>
+      <w:r>
+        <w:t xml:space="preserve">JSON: </w:t>
+      </w:r>
+      <w:r>
+        <w:rPr>
+          <w:rStyle w:val="CodeExamplesChar"/>
+        </w:rPr>
+        <w:t>{ "error": "Idea with name \"A Task Manager\" already exists" }</w:t>
+      </w:r>
+    </w:p>
+    <w:p>
+      <w:pPr>
+        <w:spacing w:after="0"/>
+      </w:pPr>
+      <w:r>
+        <w:rPr>
+          <w:b/>
+          <w:bCs/>
+        </w:rPr>
+        <w:t xml:space="preserve">Case </w:t>
+      </w:r>
+      <w:r>
+        <w:rPr>
+          <w:b/>
+          <w:bCs/>
+        </w:rPr>
+        <w:t>4</w:t>
+      </w:r>
+      <w:r>
+        <w:rPr>
+          <w:b/>
+          <w:bCs/>
+        </w:rPr>
+        <w:t xml:space="preserve"> – 401 Unauthorized:</w:t>
+      </w:r>
+      <w:r>
+        <w:t> Remove the JWT from the Authorize feature.</w:t>
+      </w:r>
+    </w:p>
+    <w:p>
+      <w:pPr>
+        <w:pStyle w:val="ListParagraph"/>
+        <w:numPr>
+          <w:ilvl w:val="0"/>
+          <w:numId w:val="3"/>
+        </w:numPr>
+        <w:spacing w:after="0"/>
+      </w:pPr>
+      <w:r>
+        <w:t xml:space="preserve">Click the </w:t>
+      </w:r>
+      <w:r>
+        <w:rPr>
+          <w:b/>
+          <w:bCs/>
+        </w:rPr>
+        <w:t xml:space="preserve">Authorize </w:t>
+      </w:r>
+      <w:r>
+        <w:t xml:space="preserve">button at the top of the page and then press </w:t>
+      </w:r>
+      <w:r>
+        <w:rPr>
+          <w:b/>
+          <w:bCs/>
+        </w:rPr>
+        <w:t>logout</w:t>
+      </w:r>
+    </w:p>
+    <w:p>
+      <w:pPr>
+        <w:pStyle w:val="ListParagraph"/>
+        <w:numPr>
+          <w:ilvl w:val="0"/>
+          <w:numId w:val="3"/>
+        </w:numPr>
+        <w:spacing w:after="0"/>
+      </w:pPr>
+      <w:r>
+        <w:t>Click </w:t>
+      </w:r>
+      <w:r>
+        <w:rPr>
+          <w:b/>
+          <w:bCs/>
+        </w:rPr>
+        <w:t>Try it out</w:t>
+      </w:r>
+    </w:p>
+    <w:p>
+      <w:pPr>
+        <w:pStyle w:val="ListParagraph"/>
+        <w:numPr>
+          <w:ilvl w:val="0"/>
+          <w:numId w:val="3"/>
+        </w:numPr>
+        <w:spacing w:after="0"/>
+      </w:pPr>
+      <w:r>
+        <w:t>Expect</w:t>
+      </w:r>
+      <w:r>
+        <w:t>ed response:</w:t>
+      </w:r>
+    </w:p>
+    <w:p>
+      <w:pPr>
+        <w:pStyle w:val="ListParagraph"/>
+        <w:numPr>
+          <w:ilvl w:val="1"/>
+          <w:numId w:val="3"/>
+        </w:numPr>
+        <w:spacing w:after="0"/>
+      </w:pPr>
+      <w:r>
+        <w:t>Status:</w:t>
+      </w:r>
+      <w:r>
+        <w:t> 401 Unauthorized.</w:t>
+      </w:r>
+    </w:p>
+    <w:p>
+      <w:pPr>
+        <w:pStyle w:val="ListParagraph"/>
+        <w:numPr>
+          <w:ilvl w:val="1"/>
+          <w:numId w:val="3"/>
+        </w:numPr>
+        <w:spacing w:after="0"/>
+        <w:rPr>
+          <w:rStyle w:val="CodeExamplesChar"/>
+          <w:rFonts w:asciiTheme="minorHAnsi" w:hAnsiTheme="minorHAnsi"/>
+          <w:sz w:val="24"/>
+          <w:szCs w:val="24"/>
+        </w:rPr>
+      </w:pPr>
+      <w:r>
+        <w:t xml:space="preserve">JSON: </w:t>
+      </w:r>
+      <w:r>
+        <w:rPr>
+          <w:rStyle w:val="CodeExamplesChar"/>
+        </w:rPr>
+        <w:t>{ "error": "Not authenticated. Please provide a valid token." }</w:t>
+      </w:r>
+    </w:p>
+    <w:p>
+      <w:pPr>
+        <w:spacing w:after="0"/>
+        <w:rPr>
+          <w:rStyle w:val="Heading3Char"/>
+          <w:rFonts w:eastAsiaTheme="minorHAnsi" w:cstheme="minorBidi"/>
+          <w:color w:val="auto"/>
+          <w:sz w:val="24"/>
+          <w:szCs w:val="24"/>
+        </w:rPr>
+      </w:pPr>
+    </w:p>
+    <w:p>
+      <w:pPr>
+        <w:spacing w:after="0"/>
+      </w:pPr>
+      <w:r>
+        <w:rPr>
+          <w:rStyle w:val="Heading3Char"/>
+          <w:u w:val="single"/>
+        </w:rPr>
         <w:t>PUT /api/ideas/:id</w:t>
       </w:r>
       <w:r>
@@ -2654,9 +2484,199 @@
       <w:r>
         <w:t> Owner of the Idea</w:t>
       </w:r>
-      <w:r>
-        <w:br/>
-      </w:r>
+    </w:p>
+    <w:p>
+      <w:pPr>
+        <w:spacing w:after="0"/>
+      </w:pPr>
+      <w:r>
+        <w:rPr>
+          <w:b/>
+          <w:bCs/>
+        </w:rPr>
+        <w:t xml:space="preserve">Case </w:t>
+      </w:r>
+      <w:r>
+        <w:rPr>
+          <w:b/>
+          <w:bCs/>
+        </w:rPr>
+        <w:t>1</w:t>
+      </w:r>
+      <w:r>
+        <w:rPr>
+          <w:b/>
+          <w:bCs/>
+        </w:rPr>
+        <w:t xml:space="preserve"> – 404 </w:t>
+      </w:r>
+      <w:r>
+        <w:rPr>
+          <w:b/>
+          <w:bCs/>
+        </w:rPr>
+        <w:t>Not Found:</w:t>
+      </w:r>
+      <w:r>
+        <w:t> Use a non-existent</w:t>
+      </w:r>
+      <w:r>
+        <w:t xml:space="preserve"> positive number for the</w:t>
+      </w:r>
+      <w:r>
+        <w:t xml:space="preserve"> ID (e.g., </w:t>
+      </w:r>
+      <w:r>
+        <w:t>100</w:t>
+      </w:r>
+      <w:r>
+        <w:t>).</w:t>
+      </w:r>
+    </w:p>
+    <w:p>
+      <w:pPr>
+        <w:pStyle w:val="ListParagraph"/>
+        <w:numPr>
+          <w:ilvl w:val="0"/>
+          <w:numId w:val="7"/>
+        </w:numPr>
+        <w:spacing w:after="0"/>
+        <w:rPr>
+          <w:b/>
+          <w:bCs/>
+        </w:rPr>
+      </w:pPr>
+      <w:r>
+        <w:t>Click </w:t>
+      </w:r>
+      <w:r>
+        <w:rPr>
+          <w:b/>
+          <w:bCs/>
+        </w:rPr>
+        <w:t>Try it out</w:t>
+      </w:r>
+    </w:p>
+    <w:p>
+      <w:pPr>
+        <w:pStyle w:val="ListParagraph"/>
+        <w:numPr>
+          <w:ilvl w:val="0"/>
+          <w:numId w:val="7"/>
+        </w:numPr>
+        <w:spacing w:after="0"/>
+        <w:rPr>
+          <w:b/>
+          <w:bCs/>
+        </w:rPr>
+      </w:pPr>
+      <w:r>
+        <w:lastRenderedPageBreak/>
+        <w:t xml:space="preserve">Enter </w:t>
+      </w:r>
+      <w:r>
+        <w:rPr>
+          <w:b/>
+          <w:bCs/>
+        </w:rPr>
+        <w:t>a positive number</w:t>
+      </w:r>
+      <w:r>
+        <w:t xml:space="preserve"> into the box for </w:t>
+      </w:r>
+      <w:r>
+        <w:rPr>
+          <w:b/>
+          <w:bCs/>
+        </w:rPr>
+        <w:t>id</w:t>
+      </w:r>
+    </w:p>
+    <w:p>
+      <w:pPr>
+        <w:pStyle w:val="ListParagraph"/>
+        <w:numPr>
+          <w:ilvl w:val="0"/>
+          <w:numId w:val="7"/>
+        </w:numPr>
+        <w:spacing w:after="0"/>
+        <w:rPr>
+          <w:b/>
+          <w:bCs/>
+        </w:rPr>
+      </w:pPr>
+      <w:r>
+        <w:t xml:space="preserve">Click </w:t>
+      </w:r>
+      <w:r>
+        <w:rPr>
+          <w:b/>
+          <w:bCs/>
+        </w:rPr>
+        <w:t>Execute</w:t>
+      </w:r>
+    </w:p>
+    <w:p>
+      <w:pPr>
+        <w:pStyle w:val="ListParagraph"/>
+        <w:numPr>
+          <w:ilvl w:val="0"/>
+          <w:numId w:val="7"/>
+        </w:numPr>
+        <w:spacing w:after="0"/>
+      </w:pPr>
+      <w:r>
+        <w:t>Expect</w:t>
+      </w:r>
+      <w:r>
+        <w:t>ed</w:t>
+      </w:r>
+      <w:r>
+        <w:t xml:space="preserve"> response: </w:t>
+      </w:r>
+    </w:p>
+    <w:p>
+      <w:pPr>
+        <w:pStyle w:val="ListParagraph"/>
+        <w:numPr>
+          <w:ilvl w:val="1"/>
+          <w:numId w:val="7"/>
+        </w:numPr>
+        <w:spacing w:after="0"/>
+      </w:pPr>
+      <w:r>
+        <w:t xml:space="preserve">Status: 404 </w:t>
+      </w:r>
+    </w:p>
+    <w:p>
+      <w:pPr>
+        <w:pStyle w:val="ListParagraph"/>
+        <w:numPr>
+          <w:ilvl w:val="1"/>
+          <w:numId w:val="7"/>
+        </w:numPr>
+        <w:spacing w:after="0"/>
+      </w:pPr>
+      <w:r>
+        <w:t xml:space="preserve">JSON: </w:t>
+      </w:r>
+      <w:r>
+        <w:rPr>
+          <w:rStyle w:val="CodeExamplesChar"/>
+        </w:rPr>
+        <w:t>{</w:t>
+      </w:r>
+      <w:r>
+        <w:rPr>
+          <w:rStyle w:val="CodeExamplesChar"/>
+        </w:rPr>
+        <w:t xml:space="preserve"> "error": "Idea 100 not found" }</w:t>
+      </w:r>
+    </w:p>
+    <w:p>
+      <w:pPr>
+        <w:spacing w:after="0"/>
+      </w:pPr>
       <w:r>
         <w:rPr>
           <w:b/>
@@ -2669,7 +2689,35 @@
           <w:b/>
           <w:bCs/>
         </w:rPr>
-        <w:t xml:space="preserve"> 1 – 200 Idea updated successfully:</w:t>
+        <w:t xml:space="preserve"> </w:t>
+      </w:r>
+      <w:r>
+        <w:rPr>
+          <w:b/>
+          <w:bCs/>
+        </w:rPr>
+        <w:t>2</w:t>
+      </w:r>
+      <w:r>
+        <w:rPr>
+          <w:b/>
+          <w:bCs/>
+        </w:rPr>
+        <w:t xml:space="preserve"> – 200 </w:t>
+      </w:r>
+      <w:r>
+        <w:rPr>
+          <w:b/>
+          <w:bCs/>
+        </w:rPr>
+        <w:t>OK</w:t>
+      </w:r>
+      <w:r>
+        <w:rPr>
+          <w:b/>
+          <w:bCs/>
+        </w:rPr>
+        <w:t>:</w:t>
       </w:r>
       <w:r>
         <w:t> </w:t>
@@ -2716,7 +2764,17 @@
         </w:rPr>
       </w:pPr>
       <w:r>
-        <w:t xml:space="preserve">Enter 2 into the box for </w:t>
+        <w:t xml:space="preserve">Enter </w:t>
+      </w:r>
+      <w:r>
+        <w:rPr>
+          <w:b/>
+          <w:bCs/>
+        </w:rPr>
+        <w:t>2</w:t>
+      </w:r>
+      <w:r>
+        <w:t xml:space="preserve"> into the box for </w:t>
       </w:r>
       <w:r>
         <w:rPr>
@@ -2760,22 +2818,169 @@
         <w:spacing w:after="0"/>
       </w:pPr>
       <w:r>
-        <w:t>Expect response: 200 OK with updated fields.</w:t>
-      </w:r>
-    </w:p>
-    <w:p>
-      <w:pPr>
-        <w:spacing w:after="0"/>
-      </w:pPr>
-      <w:r>
-        <w:rPr>
-          <w:b/>
-          <w:bCs/>
-        </w:rPr>
-        <w:t>404 Not Found:</w:t>
-      </w:r>
-      <w:r>
-        <w:t> Use a non-existent ID (e.g., 9999).</w:t>
+        <w:t>Expect response: </w:t>
+      </w:r>
+    </w:p>
+    <w:p>
+      <w:pPr>
+        <w:pStyle w:val="ListParagraph"/>
+        <w:numPr>
+          <w:ilvl w:val="1"/>
+          <w:numId w:val="6"/>
+        </w:numPr>
+        <w:spacing w:after="0"/>
+      </w:pPr>
+      <w:r>
+        <w:t>Status: 200</w:t>
+      </w:r>
+    </w:p>
+    <w:p>
+      <w:pPr>
+        <w:pStyle w:val="ListParagraph"/>
+        <w:numPr>
+          <w:ilvl w:val="1"/>
+          <w:numId w:val="6"/>
+        </w:numPr>
+        <w:spacing w:after="0"/>
+      </w:pPr>
+      <w:r>
+        <w:t xml:space="preserve">JSON: </w:t>
+      </w:r>
+    </w:p>
+    <w:p>
+      <w:pPr>
+        <w:pStyle w:val="CodeExamples"/>
+        <w:ind w:left="1440"/>
+      </w:pPr>
+      <w:r>
+        <w:t>{</w:t>
+      </w:r>
+    </w:p>
+    <w:p>
+      <w:pPr>
+        <w:pStyle w:val="CodeExamples"/>
+        <w:ind w:left="1440"/>
+      </w:pPr>
+      <w:r>
+        <w:t xml:space="preserve">  "id": 2,</w:t>
+      </w:r>
+    </w:p>
+    <w:p>
+      <w:pPr>
+        <w:pStyle w:val="CodeExamples"/>
+        <w:ind w:left="1440"/>
+      </w:pPr>
+      <w:r>
+        <w:t xml:space="preserve">  "name": "Updated Idea",</w:t>
+      </w:r>
+    </w:p>
+    <w:p>
+      <w:pPr>
+        <w:pStyle w:val="CodeExamples"/>
+        <w:ind w:left="1440"/>
+      </w:pPr>
+      <w:r>
+        <w:t xml:space="preserve">  "description": "Updated Idea description.",</w:t>
+      </w:r>
+    </w:p>
+    <w:p>
+      <w:pPr>
+        <w:pStyle w:val="CodeExamples"/>
+        <w:ind w:left="1440"/>
+      </w:pPr>
+      <w:r>
+        <w:t xml:space="preserve">  "date_created": "2026-04-28T18:07:07.644Z",</w:t>
+      </w:r>
+    </w:p>
+    <w:p>
+      <w:pPr>
+        <w:pStyle w:val="CodeExamples"/>
+        <w:ind w:left="1440"/>
+      </w:pPr>
+      <w:r>
+        <w:t xml:space="preserve">  "userId": 1</w:t>
+      </w:r>
+    </w:p>
+    <w:p>
+      <w:pPr>
+        <w:pStyle w:val="CodeExamples"/>
+        <w:ind w:left="1440"/>
+      </w:pPr>
+      <w:r>
+        <w:t>}</w:t>
+      </w:r>
+    </w:p>
+    <w:p>
+      <w:pPr>
+        <w:spacing w:after="0"/>
+        <w:rPr>
+          <w:b/>
+          <w:bCs/>
+        </w:rPr>
+      </w:pPr>
+      <w:r>
+        <w:rPr>
+          <w:b/>
+          <w:bCs/>
+        </w:rPr>
+        <w:t xml:space="preserve">Case </w:t>
+      </w:r>
+      <w:r>
+        <w:rPr>
+          <w:b/>
+          <w:bCs/>
+        </w:rPr>
+        <w:t>3</w:t>
+      </w:r>
+      <w:r>
+        <w:rPr>
+          <w:b/>
+          <w:bCs/>
+        </w:rPr>
+        <w:t xml:space="preserve"> </w:t>
+      </w:r>
+      <w:r>
+        <w:rPr>
+          <w:b/>
+          <w:bCs/>
+        </w:rPr>
+        <w:t>–</w:t>
+      </w:r>
+      <w:r>
+        <w:rPr>
+          <w:b/>
+          <w:bCs/>
+        </w:rPr>
+        <w:t xml:space="preserve"> </w:t>
+      </w:r>
+      <w:r>
+        <w:rPr>
+          <w:b/>
+          <w:bCs/>
+        </w:rPr>
+        <w:t>400 Bad Request</w:t>
+      </w:r>
+      <w:r>
+        <w:rPr>
+          <w:b/>
+          <w:bCs/>
+        </w:rPr>
+        <w:t xml:space="preserve">: </w:t>
+      </w:r>
+      <w:r>
+        <w:t>Use a</w:t>
+      </w:r>
+      <w:r>
+        <w:t>n invalid format for</w:t>
+      </w:r>
+      <w:r>
+        <w:t xml:space="preserve"> ID (e.g., </w:t>
+      </w:r>
+      <w:r>
+        <w:t>-10</w:t>
+      </w:r>
+      <w:r>
+        <w:t>).</w:t>
       </w:r>
     </w:p>
     <w:p>
@@ -2810,9 +3015,1451 @@
           <w:numId w:val="7"/>
         </w:numPr>
         <w:spacing w:after="0"/>
-      </w:pPr>
-      <w:r>
-        <w:t>Expect 404 Not Found.</w:t>
+        <w:rPr>
+          <w:b/>
+          <w:bCs/>
+        </w:rPr>
+      </w:pPr>
+      <w:r>
+        <w:t xml:space="preserve">Enter </w:t>
+      </w:r>
+      <w:r>
+        <w:rPr>
+          <w:b/>
+          <w:bCs/>
+        </w:rPr>
+        <w:t xml:space="preserve">a </w:t>
+      </w:r>
+      <w:r>
+        <w:rPr>
+          <w:b/>
+          <w:bCs/>
+        </w:rPr>
+        <w:t>negative</w:t>
+      </w:r>
+      <w:r>
+        <w:rPr>
+          <w:b/>
+          <w:bCs/>
+        </w:rPr>
+        <w:t xml:space="preserve"> number</w:t>
+      </w:r>
+      <w:r>
+        <w:t xml:space="preserve"> into the box for </w:t>
+      </w:r>
+      <w:r>
+        <w:rPr>
+          <w:b/>
+          <w:bCs/>
+        </w:rPr>
+        <w:t>id</w:t>
+      </w:r>
+    </w:p>
+    <w:p>
+      <w:pPr>
+        <w:pStyle w:val="ListParagraph"/>
+        <w:numPr>
+          <w:ilvl w:val="0"/>
+          <w:numId w:val="7"/>
+        </w:numPr>
+        <w:spacing w:after="0"/>
+        <w:rPr>
+          <w:b/>
+          <w:bCs/>
+        </w:rPr>
+      </w:pPr>
+      <w:r>
+        <w:t xml:space="preserve">Click </w:t>
+      </w:r>
+      <w:r>
+        <w:rPr>
+          <w:b/>
+          <w:bCs/>
+        </w:rPr>
+        <w:t>Execute</w:t>
+      </w:r>
+    </w:p>
+    <w:p>
+      <w:pPr>
+        <w:pStyle w:val="ListParagraph"/>
+        <w:numPr>
+          <w:ilvl w:val="0"/>
+          <w:numId w:val="7"/>
+        </w:numPr>
+        <w:spacing w:after="0"/>
+      </w:pPr>
+      <w:r>
+        <w:t>Expect</w:t>
+      </w:r>
+      <w:r>
+        <w:t>ed</w:t>
+      </w:r>
+      <w:r>
+        <w:t xml:space="preserve"> response: </w:t>
+      </w:r>
+    </w:p>
+    <w:p>
+      <w:pPr>
+        <w:pStyle w:val="ListParagraph"/>
+        <w:numPr>
+          <w:ilvl w:val="1"/>
+          <w:numId w:val="7"/>
+        </w:numPr>
+        <w:spacing w:after="0"/>
+      </w:pPr>
+      <w:r>
+        <w:t>Status: 40</w:t>
+      </w:r>
+      <w:r>
+        <w:t>0</w:t>
+      </w:r>
+    </w:p>
+    <w:p>
+      <w:pPr>
+        <w:pStyle w:val="ListParagraph"/>
+        <w:numPr>
+          <w:ilvl w:val="1"/>
+          <w:numId w:val="7"/>
+        </w:numPr>
+        <w:spacing w:after="0"/>
+      </w:pPr>
+      <w:r>
+        <w:t xml:space="preserve">JSON: </w:t>
+      </w:r>
+      <w:r>
+        <w:rPr>
+          <w:rFonts w:ascii="Consolas" w:hAnsi="Consolas"/>
+          <w:sz w:val="16"/>
+          <w:szCs w:val="20"/>
+        </w:rPr>
+        <w:t>{</w:t>
+      </w:r>
+      <w:r>
+        <w:rPr>
+          <w:rFonts w:ascii="Consolas" w:hAnsi="Consolas"/>
+          <w:sz w:val="16"/>
+          <w:szCs w:val="20"/>
+        </w:rPr>
+        <w:t xml:space="preserve"> </w:t>
+      </w:r>
+      <w:r>
+        <w:rPr>
+          <w:rFonts w:ascii="Consolas" w:hAnsi="Consolas"/>
+          <w:sz w:val="16"/>
+          <w:szCs w:val="20"/>
+        </w:rPr>
+        <w:t>"errors": [{</w:t>
+      </w:r>
+      <w:r>
+        <w:rPr>
+          <w:rFonts w:ascii="Consolas" w:hAnsi="Consolas"/>
+          <w:sz w:val="16"/>
+          <w:szCs w:val="20"/>
+        </w:rPr>
+        <w:t xml:space="preserve"> </w:t>
+      </w:r>
+      <w:r>
+        <w:rPr>
+          <w:rFonts w:ascii="Consolas" w:hAnsi="Consolas"/>
+          <w:sz w:val="16"/>
+          <w:szCs w:val="20"/>
+        </w:rPr>
+        <w:t>"field": "id",</w:t>
+      </w:r>
+      <w:r>
+        <w:rPr>
+          <w:rFonts w:ascii="Consolas" w:hAnsi="Consolas"/>
+          <w:sz w:val="16"/>
+          <w:szCs w:val="20"/>
+        </w:rPr>
+        <w:t xml:space="preserve"> </w:t>
+      </w:r>
+      <w:r>
+        <w:rPr>
+          <w:rFonts w:ascii="Consolas" w:hAnsi="Consolas"/>
+          <w:sz w:val="16"/>
+          <w:szCs w:val="20"/>
+        </w:rPr>
+        <w:t>"message": "Id must be a positive integer"</w:t>
+      </w:r>
+      <w:r>
+        <w:rPr>
+          <w:rFonts w:ascii="Consolas" w:hAnsi="Consolas"/>
+          <w:sz w:val="16"/>
+          <w:szCs w:val="20"/>
+        </w:rPr>
+        <w:t xml:space="preserve"> </w:t>
+      </w:r>
+      <w:r>
+        <w:rPr>
+          <w:rFonts w:ascii="Consolas" w:hAnsi="Consolas"/>
+          <w:sz w:val="16"/>
+          <w:szCs w:val="20"/>
+        </w:rPr>
+        <w:t>}]}</w:t>
+      </w:r>
+    </w:p>
+    <w:p>
+      <w:pPr>
+        <w:spacing w:after="0"/>
+      </w:pPr>
+      <w:r>
+        <w:rPr>
+          <w:b/>
+          <w:bCs/>
+        </w:rPr>
+        <w:t xml:space="preserve">Case 4 </w:t>
+      </w:r>
+      <w:r>
+        <w:rPr>
+          <w:b/>
+          <w:bCs/>
+        </w:rPr>
+        <w:t>–</w:t>
+      </w:r>
+      <w:r>
+        <w:rPr>
+          <w:b/>
+          <w:bCs/>
+        </w:rPr>
+        <w:t xml:space="preserve"> </w:t>
+      </w:r>
+      <w:r>
+        <w:rPr>
+          <w:b/>
+          <w:bCs/>
+        </w:rPr>
+        <w:t>409 Conflict</w:t>
+      </w:r>
+      <w:r>
+        <w:rPr>
+          <w:b/>
+          <w:bCs/>
+        </w:rPr>
+        <w:t>:</w:t>
+      </w:r>
+      <w:r>
+        <w:t xml:space="preserve"> Idea with that name already exists</w:t>
+      </w:r>
+    </w:p>
+    <w:p>
+      <w:pPr>
+        <w:pStyle w:val="ListParagraph"/>
+        <w:numPr>
+          <w:ilvl w:val="0"/>
+          <w:numId w:val="3"/>
+        </w:numPr>
+        <w:spacing w:after="0"/>
+      </w:pPr>
+      <w:r>
+        <w:t xml:space="preserve">Click </w:t>
+      </w:r>
+      <w:r>
+        <w:rPr>
+          <w:b/>
+          <w:bCs/>
+        </w:rPr>
+        <w:t>reset</w:t>
+      </w:r>
+    </w:p>
+    <w:p>
+      <w:pPr>
+        <w:pStyle w:val="ListParagraph"/>
+        <w:numPr>
+          <w:ilvl w:val="0"/>
+          <w:numId w:val="3"/>
+        </w:numPr>
+        <w:spacing w:after="0"/>
+      </w:pPr>
+      <w:r>
+        <w:t xml:space="preserve">Click </w:t>
+      </w:r>
+      <w:r>
+        <w:rPr>
+          <w:b/>
+          <w:bCs/>
+        </w:rPr>
+        <w:t>Try it out</w:t>
+      </w:r>
+    </w:p>
+    <w:p>
+      <w:pPr>
+        <w:pStyle w:val="ListParagraph"/>
+        <w:numPr>
+          <w:ilvl w:val="0"/>
+          <w:numId w:val="3"/>
+        </w:numPr>
+        <w:spacing w:after="0"/>
+      </w:pPr>
+      <w:r>
+        <w:t xml:space="preserve">Click </w:t>
+      </w:r>
+      <w:r>
+        <w:rPr>
+          <w:b/>
+          <w:bCs/>
+        </w:rPr>
+        <w:t>Execute</w:t>
+      </w:r>
+    </w:p>
+    <w:p>
+      <w:pPr>
+        <w:pStyle w:val="ListParagraph"/>
+        <w:numPr>
+          <w:ilvl w:val="0"/>
+          <w:numId w:val="3"/>
+        </w:numPr>
+        <w:spacing w:after="0"/>
+      </w:pPr>
+      <w:r>
+        <w:t>Expected response:</w:t>
+      </w:r>
+    </w:p>
+    <w:p>
+      <w:pPr>
+        <w:pStyle w:val="ListParagraph"/>
+        <w:numPr>
+          <w:ilvl w:val="1"/>
+          <w:numId w:val="3"/>
+        </w:numPr>
+        <w:spacing w:after="0"/>
+      </w:pPr>
+      <w:r>
+        <w:t>Status: 409</w:t>
+      </w:r>
+    </w:p>
+    <w:p>
+      <w:pPr>
+        <w:pStyle w:val="ListParagraph"/>
+        <w:numPr>
+          <w:ilvl w:val="1"/>
+          <w:numId w:val="3"/>
+        </w:numPr>
+        <w:spacing w:after="0"/>
+      </w:pPr>
+      <w:r>
+        <w:t xml:space="preserve">JSON: </w:t>
+      </w:r>
+      <w:r>
+        <w:rPr>
+          <w:rStyle w:val="CodeExamplesChar"/>
+        </w:rPr>
+        <w:t xml:space="preserve">{ "error": "Idea with name </w:t>
+      </w:r>
+      <w:r>
+        <w:rPr>
+          <w:rStyle w:val="CodeExamplesChar"/>
+        </w:rPr>
+        <w:t>“Updated Idea”</w:t>
+      </w:r>
+      <w:r>
+        <w:rPr>
+          <w:rStyle w:val="CodeExamplesChar"/>
+        </w:rPr>
+        <w:t xml:space="preserve"> already exists" }</w:t>
+      </w:r>
+    </w:p>
+    <w:p>
+      <w:pPr>
+        <w:spacing w:after="0"/>
+      </w:pPr>
+      <w:r>
+        <w:rPr>
+          <w:b/>
+          <w:bCs/>
+        </w:rPr>
+        <w:t>Case 5 – 40</w:t>
+      </w:r>
+      <w:r>
+        <w:rPr>
+          <w:b/>
+          <w:bCs/>
+        </w:rPr>
+        <w:t>4</w:t>
+      </w:r>
+      <w:r>
+        <w:rPr>
+          <w:b/>
+          <w:bCs/>
+        </w:rPr>
+        <w:t xml:space="preserve"> Not Found</w:t>
+      </w:r>
+      <w:r>
+        <w:rPr>
+          <w:b/>
+          <w:bCs/>
+        </w:rPr>
+        <w:t>:</w:t>
+      </w:r>
+      <w:r>
+        <w:t> </w:t>
+      </w:r>
+      <w:r>
+        <w:t>Try to access an idea that the user does not own.</w:t>
+      </w:r>
+    </w:p>
+    <w:p>
+      <w:pPr>
+        <w:pStyle w:val="ListParagraph"/>
+        <w:numPr>
+          <w:ilvl w:val="0"/>
+          <w:numId w:val="3"/>
+        </w:numPr>
+        <w:spacing w:after="0"/>
+      </w:pPr>
+      <w:r>
+        <w:t>Click </w:t>
+      </w:r>
+      <w:r>
+        <w:rPr>
+          <w:b/>
+          <w:bCs/>
+        </w:rPr>
+        <w:t>Try it out</w:t>
+      </w:r>
+    </w:p>
+    <w:p>
+      <w:pPr>
+        <w:pStyle w:val="ListParagraph"/>
+        <w:numPr>
+          <w:ilvl w:val="0"/>
+          <w:numId w:val="3"/>
+        </w:numPr>
+        <w:spacing w:after="0"/>
+        <w:rPr>
+          <w:b/>
+          <w:bCs/>
+        </w:rPr>
+      </w:pPr>
+      <w:r>
+        <w:t xml:space="preserve">Enter </w:t>
+      </w:r>
+      <w:r>
+        <w:rPr>
+          <w:b/>
+          <w:bCs/>
+        </w:rPr>
+        <w:t>8</w:t>
+      </w:r>
+      <w:r>
+        <w:t xml:space="preserve"> into the box for </w:t>
+      </w:r>
+      <w:r>
+        <w:rPr>
+          <w:b/>
+          <w:bCs/>
+        </w:rPr>
+        <w:t>id</w:t>
+      </w:r>
+    </w:p>
+    <w:p>
+      <w:pPr>
+        <w:pStyle w:val="ListParagraph"/>
+        <w:numPr>
+          <w:ilvl w:val="0"/>
+          <w:numId w:val="3"/>
+        </w:numPr>
+        <w:spacing w:after="0"/>
+        <w:rPr>
+          <w:b/>
+          <w:bCs/>
+        </w:rPr>
+      </w:pPr>
+      <w:r>
+        <w:t xml:space="preserve">Click </w:t>
+      </w:r>
+      <w:r>
+        <w:rPr>
+          <w:b/>
+          <w:bCs/>
+        </w:rPr>
+        <w:t>Execute</w:t>
+      </w:r>
+    </w:p>
+    <w:p>
+      <w:pPr>
+        <w:pStyle w:val="ListParagraph"/>
+        <w:numPr>
+          <w:ilvl w:val="0"/>
+          <w:numId w:val="3"/>
+        </w:numPr>
+        <w:spacing w:after="0"/>
+        <w:rPr>
+          <w:b/>
+          <w:bCs/>
+        </w:rPr>
+      </w:pPr>
+      <w:r>
+        <w:t xml:space="preserve">Note that this returns 404 instead of </w:t>
+      </w:r>
+      <w:r>
+        <w:t xml:space="preserve">a 401 Unauthorized. </w:t>
+      </w:r>
+      <w:r>
+        <w:t xml:space="preserve">This keeps the Project IDs private from user to user by not saying if that ID exists, just that the server cannot find a project id of that value associated with the </w:t>
+      </w:r>
+      <w:r>
+        <w:t xml:space="preserve">current </w:t>
+      </w:r>
+      <w:r>
+        <w:t>user.</w:t>
+      </w:r>
+    </w:p>
+    <w:p>
+      <w:pPr>
+        <w:pStyle w:val="ListParagraph"/>
+        <w:numPr>
+          <w:ilvl w:val="0"/>
+          <w:numId w:val="3"/>
+        </w:numPr>
+        <w:spacing w:after="0"/>
+      </w:pPr>
+      <w:r>
+        <w:t>Expect</w:t>
+      </w:r>
+      <w:r>
+        <w:t>ed response:</w:t>
+      </w:r>
+      <w:r>
+        <w:t xml:space="preserve"> </w:t>
+      </w:r>
+    </w:p>
+    <w:p>
+      <w:pPr>
+        <w:pStyle w:val="ListParagraph"/>
+        <w:numPr>
+          <w:ilvl w:val="1"/>
+          <w:numId w:val="3"/>
+        </w:numPr>
+        <w:spacing w:after="0"/>
+      </w:pPr>
+      <w:r>
+        <w:t>Status:</w:t>
+      </w:r>
+      <w:r>
+        <w:t> 40</w:t>
+      </w:r>
+      <w:r>
+        <w:t>4</w:t>
+      </w:r>
+      <w:r>
+        <w:t xml:space="preserve"> </w:t>
+      </w:r>
+      <w:r>
+        <w:t>Not Found</w:t>
+      </w:r>
+      <w:r>
+        <w:t>.</w:t>
+      </w:r>
+    </w:p>
+    <w:p>
+      <w:pPr>
+        <w:pStyle w:val="ListParagraph"/>
+        <w:numPr>
+          <w:ilvl w:val="1"/>
+          <w:numId w:val="7"/>
+        </w:numPr>
+        <w:spacing w:after="0"/>
+        <w:rPr>
+          <w:rStyle w:val="CodeExamplesChar"/>
+          <w:rFonts w:asciiTheme="minorHAnsi" w:hAnsiTheme="minorHAnsi"/>
+          <w:sz w:val="24"/>
+          <w:szCs w:val="24"/>
+        </w:rPr>
+      </w:pPr>
+      <w:r>
+        <w:t xml:space="preserve">JSON: </w:t>
+      </w:r>
+      <w:r>
+        <w:rPr>
+          <w:rStyle w:val="CodeExamplesChar"/>
+        </w:rPr>
+        <w:t xml:space="preserve">{ "error": "Idea </w:t>
+      </w:r>
+      <w:r>
+        <w:rPr>
+          <w:rStyle w:val="CodeExamplesChar"/>
+        </w:rPr>
+        <w:t>8</w:t>
+      </w:r>
+      <w:r>
+        <w:rPr>
+          <w:rStyle w:val="CodeExamplesChar"/>
+        </w:rPr>
+        <w:t xml:space="preserve"> not found" }</w:t>
+      </w:r>
+    </w:p>
+    <w:p>
+      <w:pPr>
+        <w:spacing w:after="0"/>
+      </w:pPr>
+      <w:r>
+        <w:rPr>
+          <w:b/>
+          <w:bCs/>
+        </w:rPr>
+        <w:t xml:space="preserve">Case </w:t>
+      </w:r>
+      <w:r>
+        <w:rPr>
+          <w:b/>
+          <w:bCs/>
+        </w:rPr>
+        <w:t>6</w:t>
+      </w:r>
+      <w:r>
+        <w:rPr>
+          <w:b/>
+          <w:bCs/>
+        </w:rPr>
+        <w:t xml:space="preserve"> – 401</w:t>
+      </w:r>
+      <w:r>
+        <w:rPr>
+          <w:b/>
+          <w:bCs/>
+        </w:rPr>
+        <w:t xml:space="preserve"> </w:t>
+      </w:r>
+      <w:r>
+        <w:rPr>
+          <w:b/>
+          <w:bCs/>
+        </w:rPr>
+        <w:t>Unauthorized</w:t>
+      </w:r>
+      <w:r>
+        <w:rPr>
+          <w:b/>
+          <w:bCs/>
+        </w:rPr>
+        <w:t>:</w:t>
+      </w:r>
+      <w:r>
+        <w:t xml:space="preserve"> Missing or invalid token</w:t>
+      </w:r>
+    </w:p>
+    <w:p>
+      <w:pPr>
+        <w:pStyle w:val="ListParagraph"/>
+        <w:numPr>
+          <w:ilvl w:val="0"/>
+          <w:numId w:val="6"/>
+        </w:numPr>
+        <w:spacing w:after="0"/>
+      </w:pPr>
+      <w:r>
+        <w:lastRenderedPageBreak/>
+        <w:t xml:space="preserve">Click the </w:t>
+      </w:r>
+      <w:r>
+        <w:rPr>
+          <w:b/>
+          <w:bCs/>
+        </w:rPr>
+        <w:t xml:space="preserve">Authorize </w:t>
+      </w:r>
+      <w:r>
+        <w:t xml:space="preserve">button at the top of the page and then press </w:t>
+      </w:r>
+      <w:r>
+        <w:rPr>
+          <w:b/>
+          <w:bCs/>
+        </w:rPr>
+        <w:t>logout</w:t>
+      </w:r>
+    </w:p>
+    <w:p>
+      <w:pPr>
+        <w:pStyle w:val="ListParagraph"/>
+        <w:numPr>
+          <w:ilvl w:val="0"/>
+          <w:numId w:val="6"/>
+        </w:numPr>
+        <w:spacing w:after="0"/>
+      </w:pPr>
+      <w:r>
+        <w:t>Click </w:t>
+      </w:r>
+      <w:r>
+        <w:rPr>
+          <w:b/>
+          <w:bCs/>
+        </w:rPr>
+        <w:t>Try it out</w:t>
+      </w:r>
+    </w:p>
+    <w:p>
+      <w:pPr>
+        <w:pStyle w:val="ListParagraph"/>
+        <w:numPr>
+          <w:ilvl w:val="0"/>
+          <w:numId w:val="6"/>
+        </w:numPr>
+        <w:spacing w:after="0"/>
+      </w:pPr>
+      <w:r>
+        <w:t>Expect</w:t>
+      </w:r>
+      <w:r>
+        <w:t>ed response:</w:t>
+      </w:r>
+    </w:p>
+    <w:p>
+      <w:pPr>
+        <w:pStyle w:val="ListParagraph"/>
+        <w:numPr>
+          <w:ilvl w:val="1"/>
+          <w:numId w:val="6"/>
+        </w:numPr>
+        <w:spacing w:after="0"/>
+      </w:pPr>
+      <w:r>
+        <w:t>Status:</w:t>
+      </w:r>
+      <w:r>
+        <w:t> 401 Unauthorized.</w:t>
+      </w:r>
+    </w:p>
+    <w:p>
+      <w:pPr>
+        <w:pStyle w:val="ListParagraph"/>
+        <w:numPr>
+          <w:ilvl w:val="1"/>
+          <w:numId w:val="6"/>
+        </w:numPr>
+        <w:spacing w:after="0"/>
+      </w:pPr>
+      <w:r>
+        <w:t xml:space="preserve">JSON: </w:t>
+      </w:r>
+      <w:r>
+        <w:rPr>
+          <w:rStyle w:val="CodeExamplesChar"/>
+        </w:rPr>
+        <w:t>{ "error": "Not authenticated. Please provide a valid token." }</w:t>
+      </w:r>
+    </w:p>
+    <w:p>
+      <w:pPr>
+        <w:spacing w:after="0"/>
+      </w:pPr>
+    </w:p>
+    <w:p>
+      <w:pPr>
+        <w:spacing w:after="0"/>
+        <w:rPr>
+          <w:rStyle w:val="Heading3Char"/>
+          <w:u w:val="single"/>
+        </w:rPr>
+      </w:pPr>
+      <w:r>
+        <w:rPr>
+          <w:rStyle w:val="Heading3Char"/>
+          <w:u w:val="single"/>
+        </w:rPr>
+        <w:t>DELETE</w:t>
+      </w:r>
+      <w:r>
+        <w:rPr>
+          <w:rStyle w:val="Heading3Char"/>
+          <w:u w:val="single"/>
+        </w:rPr>
+        <w:t xml:space="preserve"> /api/ideas/:id</w:t>
+      </w:r>
+    </w:p>
+    <w:p>
+      <w:pPr>
+        <w:spacing w:after="0"/>
+      </w:pPr>
+      <w:r>
+        <w:rPr>
+          <w:b/>
+          <w:bCs/>
+        </w:rPr>
+        <w:t xml:space="preserve">Access Control: </w:t>
+      </w:r>
+      <w:r>
+        <w:t>Authenticated User</w:t>
+      </w:r>
+    </w:p>
+    <w:p>
+      <w:pPr>
+        <w:spacing w:after="0"/>
+      </w:pPr>
+      <w:r>
+        <w:rPr>
+          <w:b/>
+          <w:bCs/>
+        </w:rPr>
+        <w:t>Case 1 – 204</w:t>
+      </w:r>
+      <w:r>
+        <w:rPr>
+          <w:b/>
+          <w:bCs/>
+        </w:rPr>
+        <w:t>:</w:t>
+      </w:r>
+      <w:r>
+        <w:rPr>
+          <w:b/>
+          <w:bCs/>
+        </w:rPr>
+        <w:t xml:space="preserve"> </w:t>
+      </w:r>
+      <w:r>
+        <w:t>Idea deleted successfully</w:t>
+      </w:r>
+    </w:p>
+    <w:p>
+      <w:pPr>
+        <w:pStyle w:val="ListParagraph"/>
+        <w:numPr>
+          <w:ilvl w:val="0"/>
+          <w:numId w:val="6"/>
+        </w:numPr>
+        <w:spacing w:after="0"/>
+        <w:rPr>
+          <w:b/>
+          <w:bCs/>
+        </w:rPr>
+      </w:pPr>
+      <w:r>
+        <w:t>Click </w:t>
+      </w:r>
+      <w:r>
+        <w:rPr>
+          <w:b/>
+          <w:bCs/>
+        </w:rPr>
+        <w:t>Try it out</w:t>
+      </w:r>
+    </w:p>
+    <w:p>
+      <w:pPr>
+        <w:pStyle w:val="ListParagraph"/>
+        <w:numPr>
+          <w:ilvl w:val="0"/>
+          <w:numId w:val="6"/>
+        </w:numPr>
+        <w:spacing w:after="0"/>
+        <w:rPr>
+          <w:b/>
+          <w:bCs/>
+        </w:rPr>
+      </w:pPr>
+      <w:r>
+        <w:t xml:space="preserve">Enter </w:t>
+      </w:r>
+      <w:r>
+        <w:rPr>
+          <w:b/>
+          <w:bCs/>
+        </w:rPr>
+        <w:t>2</w:t>
+      </w:r>
+      <w:r>
+        <w:t xml:space="preserve"> into the box for </w:t>
+      </w:r>
+      <w:r>
+        <w:rPr>
+          <w:b/>
+          <w:bCs/>
+        </w:rPr>
+        <w:t>id</w:t>
+      </w:r>
+    </w:p>
+    <w:p>
+      <w:pPr>
+        <w:pStyle w:val="ListParagraph"/>
+        <w:numPr>
+          <w:ilvl w:val="0"/>
+          <w:numId w:val="6"/>
+        </w:numPr>
+        <w:spacing w:after="0"/>
+        <w:rPr>
+          <w:b/>
+          <w:bCs/>
+        </w:rPr>
+      </w:pPr>
+      <w:r>
+        <w:t xml:space="preserve">Click </w:t>
+      </w:r>
+      <w:r>
+        <w:rPr>
+          <w:b/>
+          <w:bCs/>
+        </w:rPr>
+        <w:t>Execute</w:t>
+      </w:r>
+    </w:p>
+    <w:p>
+      <w:pPr>
+        <w:pStyle w:val="ListParagraph"/>
+        <w:numPr>
+          <w:ilvl w:val="0"/>
+          <w:numId w:val="6"/>
+        </w:numPr>
+        <w:spacing w:after="0"/>
+      </w:pPr>
+      <w:r>
+        <w:t>Expect response: </w:t>
+      </w:r>
+    </w:p>
+    <w:p>
+      <w:pPr>
+        <w:pStyle w:val="ListParagraph"/>
+        <w:numPr>
+          <w:ilvl w:val="1"/>
+          <w:numId w:val="6"/>
+        </w:numPr>
+        <w:spacing w:after="0"/>
+      </w:pPr>
+      <w:r>
+        <w:t>Status: 20</w:t>
+      </w:r>
+      <w:r>
+        <w:t>4</w:t>
+      </w:r>
+    </w:p>
+    <w:p>
+      <w:pPr>
+        <w:spacing w:after="0"/>
+      </w:pPr>
+      <w:r>
+        <w:rPr>
+          <w:b/>
+          <w:bCs/>
+        </w:rPr>
+        <w:t xml:space="preserve">Case </w:t>
+      </w:r>
+      <w:r>
+        <w:rPr>
+          <w:b/>
+          <w:bCs/>
+        </w:rPr>
+        <w:t>2</w:t>
+      </w:r>
+      <w:r>
+        <w:rPr>
+          <w:b/>
+          <w:bCs/>
+        </w:rPr>
+        <w:t xml:space="preserve"> – 404</w:t>
+      </w:r>
+      <w:r>
+        <w:t xml:space="preserve"> </w:t>
+      </w:r>
+      <w:r>
+        <w:rPr>
+          <w:b/>
+          <w:bCs/>
+        </w:rPr>
+        <w:t>Not Found</w:t>
+      </w:r>
+      <w:r>
+        <w:rPr>
+          <w:b/>
+          <w:bCs/>
+        </w:rPr>
+        <w:t>:</w:t>
+      </w:r>
+      <w:r>
+        <w:t xml:space="preserve"> No idea with that id belongs to this user</w:t>
+      </w:r>
+    </w:p>
+    <w:p>
+      <w:pPr>
+        <w:pStyle w:val="ListParagraph"/>
+        <w:numPr>
+          <w:ilvl w:val="0"/>
+          <w:numId w:val="6"/>
+        </w:numPr>
+        <w:spacing w:after="0"/>
+        <w:rPr>
+          <w:b/>
+          <w:bCs/>
+        </w:rPr>
+      </w:pPr>
+      <w:r>
+        <w:t>Click </w:t>
+      </w:r>
+      <w:r>
+        <w:rPr>
+          <w:b/>
+          <w:bCs/>
+        </w:rPr>
+        <w:t>Try it out</w:t>
+      </w:r>
+    </w:p>
+    <w:p>
+      <w:pPr>
+        <w:pStyle w:val="ListParagraph"/>
+        <w:numPr>
+          <w:ilvl w:val="0"/>
+          <w:numId w:val="6"/>
+        </w:numPr>
+        <w:spacing w:after="0"/>
+        <w:rPr>
+          <w:b/>
+          <w:bCs/>
+        </w:rPr>
+      </w:pPr>
+      <w:r>
+        <w:t xml:space="preserve">Enter </w:t>
+      </w:r>
+      <w:r>
+        <w:rPr>
+          <w:b/>
+          <w:bCs/>
+        </w:rPr>
+        <w:t>2</w:t>
+      </w:r>
+      <w:r>
+        <w:t xml:space="preserve"> into the box for </w:t>
+      </w:r>
+      <w:r>
+        <w:rPr>
+          <w:b/>
+          <w:bCs/>
+        </w:rPr>
+        <w:t>id</w:t>
+      </w:r>
+    </w:p>
+    <w:p>
+      <w:pPr>
+        <w:pStyle w:val="ListParagraph"/>
+        <w:numPr>
+          <w:ilvl w:val="0"/>
+          <w:numId w:val="6"/>
+        </w:numPr>
+        <w:spacing w:after="0"/>
+        <w:rPr>
+          <w:b/>
+          <w:bCs/>
+        </w:rPr>
+      </w:pPr>
+      <w:r>
+        <w:t xml:space="preserve">Click </w:t>
+      </w:r>
+      <w:r>
+        <w:rPr>
+          <w:b/>
+          <w:bCs/>
+        </w:rPr>
+        <w:t>Execute</w:t>
+      </w:r>
+    </w:p>
+    <w:p>
+      <w:pPr>
+        <w:pStyle w:val="ListParagraph"/>
+        <w:numPr>
+          <w:ilvl w:val="0"/>
+          <w:numId w:val="6"/>
+        </w:numPr>
+        <w:spacing w:after="0"/>
+      </w:pPr>
+      <w:r>
+        <w:t>Expect response: </w:t>
+      </w:r>
+    </w:p>
+    <w:p>
+      <w:pPr>
+        <w:pStyle w:val="ListParagraph"/>
+        <w:numPr>
+          <w:ilvl w:val="1"/>
+          <w:numId w:val="6"/>
+        </w:numPr>
+        <w:spacing w:after="0"/>
+      </w:pPr>
+      <w:r>
+        <w:t>Status:</w:t>
+      </w:r>
+      <w:r>
+        <w:t> 40</w:t>
+      </w:r>
+      <w:r>
+        <w:t>4</w:t>
+      </w:r>
+      <w:r>
+        <w:t xml:space="preserve"> </w:t>
+      </w:r>
+      <w:r>
+        <w:t>Not Found</w:t>
+      </w:r>
+      <w:r>
+        <w:t>.</w:t>
+      </w:r>
+    </w:p>
+    <w:p>
+      <w:pPr>
+        <w:pStyle w:val="ListParagraph"/>
+        <w:numPr>
+          <w:ilvl w:val="1"/>
+          <w:numId w:val="6"/>
+        </w:numPr>
+        <w:spacing w:after="0"/>
+        <w:rPr>
+          <w:rStyle w:val="CodeExamplesChar"/>
+          <w:rFonts w:asciiTheme="minorHAnsi" w:hAnsiTheme="minorHAnsi"/>
+          <w:sz w:val="24"/>
+          <w:szCs w:val="24"/>
+        </w:rPr>
+      </w:pPr>
+      <w:r>
+        <w:t xml:space="preserve">JSON: </w:t>
+      </w:r>
+      <w:r>
+        <w:rPr>
+          <w:rStyle w:val="CodeExamplesChar"/>
+        </w:rPr>
+        <w:t xml:space="preserve">{ "error": "Idea </w:t>
+      </w:r>
+      <w:r>
+        <w:rPr>
+          <w:rStyle w:val="CodeExamplesChar"/>
+        </w:rPr>
+        <w:t>8</w:t>
+      </w:r>
+      <w:r>
+        <w:rPr>
+          <w:rStyle w:val="CodeExamplesChar"/>
+        </w:rPr>
+        <w:t xml:space="preserve"> not found" }</w:t>
+      </w:r>
+    </w:p>
+    <w:p>
+      <w:pPr>
+        <w:spacing w:after="0"/>
+      </w:pPr>
+      <w:r>
+        <w:rPr>
+          <w:b/>
+          <w:bCs/>
+        </w:rPr>
+        <w:t xml:space="preserve">Case </w:t>
+      </w:r>
+      <w:r>
+        <w:rPr>
+          <w:b/>
+          <w:bCs/>
+        </w:rPr>
+        <w:t>3</w:t>
+      </w:r>
+      <w:r>
+        <w:rPr>
+          <w:b/>
+          <w:bCs/>
+        </w:rPr>
+        <w:t xml:space="preserve"> – 400 </w:t>
+      </w:r>
+      <w:r>
+        <w:rPr>
+          <w:b/>
+          <w:bCs/>
+        </w:rPr>
+        <w:t>Bad Request</w:t>
+      </w:r>
+      <w:r>
+        <w:rPr>
+          <w:b/>
+          <w:bCs/>
+        </w:rPr>
+        <w:t>:</w:t>
+      </w:r>
+      <w:r>
+        <w:t xml:space="preserve"> </w:t>
+      </w:r>
+      <w:r>
+        <w:t>Id not a positive integer</w:t>
+      </w:r>
+    </w:p>
+    <w:p>
+      <w:pPr>
+        <w:pStyle w:val="ListParagraph"/>
+        <w:numPr>
+          <w:ilvl w:val="0"/>
+          <w:numId w:val="7"/>
+        </w:numPr>
+        <w:spacing w:after="0"/>
+        <w:rPr>
+          <w:b/>
+          <w:bCs/>
+        </w:rPr>
+      </w:pPr>
+      <w:r>
+        <w:t>Click </w:t>
+      </w:r>
+      <w:r>
+        <w:rPr>
+          <w:b/>
+          <w:bCs/>
+        </w:rPr>
+        <w:t>Try it out</w:t>
+      </w:r>
+    </w:p>
+    <w:p>
+      <w:pPr>
+        <w:pStyle w:val="ListParagraph"/>
+        <w:numPr>
+          <w:ilvl w:val="0"/>
+          <w:numId w:val="7"/>
+        </w:numPr>
+        <w:spacing w:after="0"/>
+        <w:rPr>
+          <w:b/>
+          <w:bCs/>
+        </w:rPr>
+      </w:pPr>
+      <w:r>
+        <w:t xml:space="preserve">Enter </w:t>
+      </w:r>
+      <w:r>
+        <w:rPr>
+          <w:b/>
+          <w:bCs/>
+        </w:rPr>
+        <w:t>a negative number</w:t>
+      </w:r>
+      <w:r>
+        <w:t xml:space="preserve"> into the box for </w:t>
+      </w:r>
+      <w:r>
+        <w:rPr>
+          <w:b/>
+          <w:bCs/>
+        </w:rPr>
+        <w:t>id</w:t>
+      </w:r>
+    </w:p>
+    <w:p>
+      <w:pPr>
+        <w:pStyle w:val="ListParagraph"/>
+        <w:numPr>
+          <w:ilvl w:val="0"/>
+          <w:numId w:val="7"/>
+        </w:numPr>
+        <w:spacing w:after="0"/>
+        <w:rPr>
+          <w:b/>
+          <w:bCs/>
+        </w:rPr>
+      </w:pPr>
+      <w:r>
+        <w:t xml:space="preserve">Click </w:t>
+      </w:r>
+      <w:r>
+        <w:rPr>
+          <w:b/>
+          <w:bCs/>
+        </w:rPr>
+        <w:t>Execute</w:t>
+      </w:r>
+    </w:p>
+    <w:p>
+      <w:pPr>
+        <w:pStyle w:val="ListParagraph"/>
+        <w:numPr>
+          <w:ilvl w:val="0"/>
+          <w:numId w:val="7"/>
+        </w:numPr>
+        <w:spacing w:after="0"/>
+      </w:pPr>
+      <w:r>
+        <w:t>Expect</w:t>
+      </w:r>
+      <w:r>
+        <w:t>ed</w:t>
+      </w:r>
+      <w:r>
+        <w:t xml:space="preserve"> response: </w:t>
+      </w:r>
+    </w:p>
+    <w:p>
+      <w:pPr>
+        <w:pStyle w:val="ListParagraph"/>
+        <w:numPr>
+          <w:ilvl w:val="1"/>
+          <w:numId w:val="7"/>
+        </w:numPr>
+        <w:spacing w:after="0"/>
+      </w:pPr>
+      <w:r>
+        <w:t>Status: 400</w:t>
+      </w:r>
+    </w:p>
+    <w:p>
+      <w:pPr>
+        <w:pStyle w:val="ListParagraph"/>
+        <w:numPr>
+          <w:ilvl w:val="1"/>
+          <w:numId w:val="7"/>
+        </w:numPr>
+        <w:spacing w:after="0"/>
+      </w:pPr>
+      <w:r>
+        <w:t xml:space="preserve">JSON: </w:t>
+      </w:r>
+      <w:r>
+        <w:rPr>
+          <w:rFonts w:ascii="Consolas" w:hAnsi="Consolas"/>
+          <w:sz w:val="16"/>
+          <w:szCs w:val="20"/>
+        </w:rPr>
+        <w:t>{ "errors": [{ "field": "id", "message": "Id must be a positive integer" }]}</w:t>
+      </w:r>
+    </w:p>
+    <w:p>
+      <w:pPr>
+        <w:spacing w:after="0"/>
+      </w:pPr>
+      <w:r>
+        <w:rPr>
+          <w:b/>
+          <w:bCs/>
+        </w:rPr>
+        <w:t xml:space="preserve">Case </w:t>
+      </w:r>
+      <w:r>
+        <w:rPr>
+          <w:b/>
+          <w:bCs/>
+        </w:rPr>
+        <w:t>4</w:t>
+      </w:r>
+      <w:r>
+        <w:rPr>
+          <w:b/>
+          <w:bCs/>
+        </w:rPr>
+        <w:t xml:space="preserve"> – 401</w:t>
+      </w:r>
+      <w:r>
+        <w:rPr>
+          <w:b/>
+          <w:bCs/>
+        </w:rPr>
+        <w:t xml:space="preserve"> </w:t>
+      </w:r>
+      <w:r>
+        <w:rPr>
+          <w:b/>
+          <w:bCs/>
+        </w:rPr>
+        <w:t>Unauthorized</w:t>
+      </w:r>
+      <w:r>
+        <w:rPr>
+          <w:b/>
+          <w:bCs/>
+        </w:rPr>
+        <w:t>:</w:t>
+      </w:r>
+      <w:r>
+        <w:t xml:space="preserve"> Missing or invalid token</w:t>
+      </w:r>
+    </w:p>
+    <w:p>
+      <w:pPr>
+        <w:pStyle w:val="ListParagraph"/>
+        <w:numPr>
+          <w:ilvl w:val="0"/>
+          <w:numId w:val="6"/>
+        </w:numPr>
+        <w:spacing w:after="0"/>
+      </w:pPr>
+      <w:r>
+        <w:t xml:space="preserve">Click the </w:t>
+      </w:r>
+      <w:r>
+        <w:rPr>
+          <w:b/>
+          <w:bCs/>
+        </w:rPr>
+        <w:t xml:space="preserve">Authorize </w:t>
+      </w:r>
+      <w:r>
+        <w:t xml:space="preserve">button at the top of the page and then press </w:t>
+      </w:r>
+      <w:r>
+        <w:rPr>
+          <w:b/>
+          <w:bCs/>
+        </w:rPr>
+        <w:t>logout</w:t>
+      </w:r>
+    </w:p>
+    <w:p>
+      <w:pPr>
+        <w:pStyle w:val="ListParagraph"/>
+        <w:numPr>
+          <w:ilvl w:val="0"/>
+          <w:numId w:val="6"/>
+        </w:numPr>
+        <w:spacing w:after="0"/>
+      </w:pPr>
+      <w:r>
+        <w:t>Click </w:t>
+      </w:r>
+      <w:r>
+        <w:rPr>
+          <w:b/>
+          <w:bCs/>
+        </w:rPr>
+        <w:t>Try it out</w:t>
+      </w:r>
+    </w:p>
+    <w:p>
+      <w:pPr>
+        <w:pStyle w:val="ListParagraph"/>
+        <w:numPr>
+          <w:ilvl w:val="0"/>
+          <w:numId w:val="6"/>
+        </w:numPr>
+        <w:spacing w:after="0"/>
+      </w:pPr>
+      <w:r>
+        <w:t>Expect</w:t>
+      </w:r>
+      <w:r>
+        <w:t>ed response:</w:t>
+      </w:r>
+    </w:p>
+    <w:p>
+      <w:pPr>
+        <w:pStyle w:val="ListParagraph"/>
+        <w:numPr>
+          <w:ilvl w:val="1"/>
+          <w:numId w:val="6"/>
+        </w:numPr>
+        <w:spacing w:after="0"/>
+      </w:pPr>
+      <w:r>
+        <w:t>Status:</w:t>
+      </w:r>
+      <w:r>
+        <w:t> 401 Unauthorized.</w:t>
+      </w:r>
+    </w:p>
+    <w:p>
+      <w:pPr>
+        <w:pStyle w:val="ListParagraph"/>
+        <w:numPr>
+          <w:ilvl w:val="1"/>
+          <w:numId w:val="6"/>
+        </w:numPr>
+        <w:spacing w:after="0"/>
+      </w:pPr>
+      <w:r>
+        <w:t xml:space="preserve">JSON: </w:t>
+      </w:r>
+      <w:r>
+        <w:rPr>
+          <w:rStyle w:val="CodeExamplesChar"/>
+        </w:rPr>
+        <w:t>{ "error": "Not authenticated. Please provide a valid token." }</w:t>
       </w:r>
     </w:p>
     <w:p>
@@ -2821,7 +4468,7 @@
       </w:pPr>
       <w:r>
         <w:pict w14:anchorId="534D4AA5">
-          <v:rect id="_x0000_i1050" style="width:0;height:.75pt" o:hralign="center" o:hrstd="t" o:hr="t" fillcolor="#a0a0a0" stroked="f"/>
+          <v:rect id="_x0000_i1026" style="width:0;height:.75pt" o:hralign="center" o:hrstd="t" o:hr="t" fillcolor="#a0a0a0" stroked="f"/>
         </w:pict>
       </w:r>
     </w:p>
@@ -2843,87 +4490,14 @@
           <w:rStyle w:val="Heading3Char"/>
           <w:u w:val="single"/>
         </w:rPr>
-        <w:t>POST /api/projects</w:t>
-      </w:r>
-      <w:r>
-        <w:br/>
-      </w:r>
-      <w:r>
-        <w:rPr>
-          <w:b/>
-          <w:bCs/>
-        </w:rPr>
-        <w:t>Access Control:</w:t>
-      </w:r>
-      <w:r>
-        <w:t> Authenticated User</w:t>
-      </w:r>
-      <w:r>
-        <w:br/>
-      </w:r>
-      <w:r>
-        <w:rPr>
-          <w:b/>
-          <w:bCs/>
-        </w:rPr>
-        <w:t>Success Case:</w:t>
-      </w:r>
-      <w:r>
-        <w:t> Provide a name and description.</w:t>
-      </w:r>
-    </w:p>
-    <w:p>
-      <w:pPr>
-        <w:pStyle w:val="ListParagraph"/>
-        <w:numPr>
-          <w:ilvl w:val="0"/>
-          <w:numId w:val="8"/>
-        </w:numPr>
-        <w:spacing w:after="0"/>
-        <w:rPr>
-          <w:b/>
-          <w:bCs/>
-        </w:rPr>
-      </w:pPr>
-      <w:r>
-        <w:t>Click </w:t>
-      </w:r>
-      <w:r>
-        <w:rPr>
-          <w:b/>
-          <w:bCs/>
-        </w:rPr>
-        <w:t>Try it out</w:t>
-      </w:r>
-    </w:p>
-    <w:p>
-      <w:pPr>
-        <w:pStyle w:val="ListParagraph"/>
-        <w:numPr>
-          <w:ilvl w:val="0"/>
-          <w:numId w:val="8"/>
-        </w:numPr>
-        <w:spacing w:after="0"/>
-      </w:pPr>
-      <w:r>
-        <w:t>Expect response: 201 Created with a new project id.</w:t>
-      </w:r>
-    </w:p>
-    <w:p>
-      <w:pPr>
-        <w:spacing w:after="0"/>
-      </w:pPr>
-    </w:p>
-    <w:p>
-      <w:pPr>
-        <w:spacing w:after="0"/>
-      </w:pPr>
+        <w:t>GET</w:t>
+      </w:r>
       <w:r>
         <w:rPr>
           <w:rStyle w:val="Heading3Char"/>
           <w:u w:val="single"/>
         </w:rPr>
-        <w:t>POST /api/projects/:id/files</w:t>
+        <w:t xml:space="preserve"> /api/projects</w:t>
       </w:r>
       <w:r>
         <w:br/>
@@ -2936,7 +4510,7 @@
         <w:t>Access Control:</w:t>
       </w:r>
       <w:r>
-        <w:t> Owner of the Project</w:t>
+        <w:t> Authenticated User</w:t>
       </w:r>
       <w:r>
         <w:br/>
@@ -2946,7 +4520,7 @@
           <w:b/>
           <w:bCs/>
         </w:rPr>
-        <w:t xml:space="preserve">Case 1 – 201 </w:t>
+        <w:t>Case 1 –  200 OK</w:t>
       </w:r>
       <w:r>
         <w:rPr>
@@ -2956,15 +4530,15 @@
         <w:t>:</w:t>
       </w:r>
       <w:r>
-        <w:t> Use a project ID you own. Upload a small image or text file.</w:t>
-      </w:r>
-    </w:p>
-    <w:p>
-      <w:pPr>
-        <w:pStyle w:val="ListParagraph"/>
-        <w:numPr>
-          <w:ilvl w:val="0"/>
-          <w:numId w:val="9"/>
+        <w:t> </w:t>
+      </w:r>
+    </w:p>
+    <w:p>
+      <w:pPr>
+        <w:pStyle w:val="ListParagraph"/>
+        <w:numPr>
+          <w:ilvl w:val="0"/>
+          <w:numId w:val="3"/>
         </w:numPr>
         <w:spacing w:after="0"/>
         <w:rPr>
@@ -2988,80 +4562,451 @@
         <w:pStyle w:val="ListParagraph"/>
         <w:numPr>
           <w:ilvl w:val="0"/>
-          <w:numId w:val="9"/>
-        </w:numPr>
-        <w:spacing w:after="0"/>
-      </w:pPr>
-      <w:r>
-        <w:t>Expect response: 201 Created.</w:t>
-      </w:r>
-    </w:p>
-    <w:p>
-      <w:pPr>
-        <w:spacing w:after="0"/>
-        <w:rPr>
-          <w:b/>
-          <w:bCs/>
-        </w:rPr>
-      </w:pPr>
-      <w:r>
-        <w:rPr>
-          <w:b/>
-          <w:bCs/>
-        </w:rPr>
-        <w:t xml:space="preserve">Case 2 </w:t>
-      </w:r>
-      <w:r>
-        <w:rPr>
-          <w:b/>
-          <w:bCs/>
-        </w:rPr>
-        <w:t>–</w:t>
-      </w:r>
-      <w:r>
-        <w:rPr>
-          <w:b/>
-          <w:bCs/>
-        </w:rPr>
-        <w:t xml:space="preserve"> </w:t>
-      </w:r>
-      <w:r>
-        <w:rPr>
-          <w:b/>
-          <w:bCs/>
-        </w:rPr>
-        <w:t xml:space="preserve">413 </w:t>
-      </w:r>
-      <w:r>
-        <w:rPr>
-          <w:b/>
-          <w:bCs/>
-        </w:rPr>
-        <w:t>Payload Too Large:</w:t>
-      </w:r>
-      <w:r>
-        <w:rPr>
-          <w:b/>
-          <w:bCs/>
-        </w:rPr>
-        <w:t xml:space="preserve"> </w:t>
-      </w:r>
-      <w:r>
-        <w:t>Attempt to upload a file larger than 10MB.</w:t>
-      </w:r>
-    </w:p>
-    <w:p>
-      <w:pPr>
-        <w:pStyle w:val="ListParagraph"/>
-        <w:numPr>
-          <w:ilvl w:val="0"/>
-          <w:numId w:val="10"/>
-        </w:numPr>
-        <w:spacing w:after="0"/>
-        <w:rPr>
-          <w:b/>
-          <w:bCs/>
-        </w:rPr>
+          <w:numId w:val="3"/>
+        </w:numPr>
+        <w:spacing w:after="0"/>
+        <w:rPr>
+          <w:b/>
+          <w:bCs/>
+        </w:rPr>
+      </w:pPr>
+      <w:r>
+        <w:t xml:space="preserve">Click </w:t>
+      </w:r>
+      <w:r>
+        <w:rPr>
+          <w:b/>
+          <w:bCs/>
+        </w:rPr>
+        <w:t>Execute</w:t>
+      </w:r>
+    </w:p>
+    <w:p>
+      <w:pPr>
+        <w:pStyle w:val="ListParagraph"/>
+        <w:numPr>
+          <w:ilvl w:val="0"/>
+          <w:numId w:val="3"/>
+        </w:numPr>
+        <w:spacing w:after="0"/>
+      </w:pPr>
+      <w:r>
+        <w:lastRenderedPageBreak/>
+        <w:t>Expect</w:t>
+      </w:r>
+      <w:r>
+        <w:t>ed</w:t>
+      </w:r>
+      <w:r>
+        <w:t xml:space="preserve"> response: </w:t>
+      </w:r>
+    </w:p>
+    <w:p>
+      <w:pPr>
+        <w:pStyle w:val="ListParagraph"/>
+        <w:numPr>
+          <w:ilvl w:val="1"/>
+          <w:numId w:val="3"/>
+        </w:numPr>
+        <w:spacing w:after="0"/>
+      </w:pPr>
+      <w:r>
+        <w:t>Status: 200 OK</w:t>
+      </w:r>
+    </w:p>
+    <w:p>
+      <w:pPr>
+        <w:pStyle w:val="ListParagraph"/>
+        <w:numPr>
+          <w:ilvl w:val="1"/>
+          <w:numId w:val="3"/>
+        </w:numPr>
+        <w:spacing w:after="0"/>
+      </w:pPr>
+      <w:r>
+        <w:t xml:space="preserve">JSON: </w:t>
+      </w:r>
+    </w:p>
+    <w:p>
+      <w:pPr>
+        <w:pStyle w:val="CodeExamples"/>
+        <w:spacing w:after="0"/>
+        <w:ind w:left="1440"/>
+      </w:pPr>
+      <w:r>
+        <w:t>[</w:t>
+      </w:r>
+    </w:p>
+    <w:p>
+      <w:pPr>
+        <w:pStyle w:val="CodeExamples"/>
+        <w:spacing w:after="0"/>
+        <w:ind w:left="1440"/>
+      </w:pPr>
+      <w:r>
+        <w:t xml:space="preserve">  {</w:t>
+      </w:r>
+    </w:p>
+    <w:p>
+      <w:pPr>
+        <w:pStyle w:val="CodeExamples"/>
+        <w:spacing w:after="0"/>
+        <w:ind w:left="1440"/>
+      </w:pPr>
+      <w:r>
+        <w:t xml:space="preserve">    "id": 1,</w:t>
+      </w:r>
+    </w:p>
+    <w:p>
+      <w:pPr>
+        <w:pStyle w:val="CodeExamples"/>
+        <w:spacing w:after="0"/>
+        <w:ind w:left="1440"/>
+      </w:pPr>
+      <w:r>
+        <w:t xml:space="preserve">    "name": "alice_dev Idea 1",</w:t>
+      </w:r>
+    </w:p>
+    <w:p>
+      <w:pPr>
+        <w:pStyle w:val="CodeExamples"/>
+        <w:spacing w:after="0"/>
+        <w:ind w:left="1440"/>
+      </w:pPr>
+      <w:r>
+        <w:t xml:space="preserve">    "description": "Smart Tasking",</w:t>
+      </w:r>
+    </w:p>
+    <w:p>
+      <w:pPr>
+        <w:pStyle w:val="CodeExamples"/>
+        <w:spacing w:after="0"/>
+        <w:ind w:left="1440"/>
+      </w:pPr>
+      <w:r>
+        <w:t xml:space="preserve">    "date_created": "2026-04-28T16:11:24.956Z",</w:t>
+      </w:r>
+    </w:p>
+    <w:p>
+      <w:pPr>
+        <w:pStyle w:val="CodeExamples"/>
+        <w:spacing w:after="0"/>
+        <w:ind w:left="1440"/>
+      </w:pPr>
+      <w:r>
+        <w:t xml:space="preserve">    </w:t>
+      </w:r>
+      <w:r>
+        <w:t>“files”</w:t>
+      </w:r>
+      <w:r>
+        <w:t>: [</w:t>
+      </w:r>
+    </w:p>
+    <w:p>
+      <w:pPr>
+        <w:pStyle w:val="CodeExamples"/>
+        <w:spacing w:after="0"/>
+        <w:ind w:left="1440"/>
+      </w:pPr>
+      <w:r>
+        <w:t xml:space="preserve">      </w:t>
+      </w:r>
+      <w:r>
+        <w:t>{</w:t>
+      </w:r>
+    </w:p>
+    <w:p>
+      <w:pPr>
+        <w:pStyle w:val="CodeExamples"/>
+        <w:ind w:left="1440"/>
+      </w:pPr>
+      <w:r>
+        <w:tab/>
+      </w:r>
+      <w:r>
+        <w:t>"id": 0,</w:t>
+      </w:r>
+    </w:p>
+    <w:p>
+      <w:pPr>
+        <w:pStyle w:val="CodeExamples"/>
+        <w:ind w:left="1440"/>
+      </w:pPr>
+      <w:r>
+        <w:t xml:space="preserve">        "projectId": 0,</w:t>
+      </w:r>
+    </w:p>
+    <w:p>
+      <w:pPr>
+        <w:pStyle w:val="CodeExamples"/>
+        <w:ind w:left="1440"/>
+      </w:pPr>
+      <w:r>
+        <w:t xml:space="preserve">        "name": "string",</w:t>
+      </w:r>
+    </w:p>
+    <w:p>
+      <w:pPr>
+        <w:pStyle w:val="CodeExamples"/>
+        <w:ind w:left="1440"/>
+      </w:pPr>
+      <w:r>
+        <w:t xml:space="preserve">        "size": 0,</w:t>
+      </w:r>
+    </w:p>
+    <w:p>
+      <w:pPr>
+        <w:pStyle w:val="CodeExamples"/>
+        <w:ind w:left="1440"/>
+      </w:pPr>
+      <w:r>
+        <w:t xml:space="preserve">        "mimeType": "string"</w:t>
+      </w:r>
+    </w:p>
+    <w:p>
+      <w:pPr>
+        <w:pStyle w:val="CodeExamples"/>
+        <w:spacing w:after="0"/>
+        <w:ind w:left="1440"/>
+      </w:pPr>
+      <w:r>
+        <w:t xml:space="preserve">      </w:t>
+      </w:r>
+      <w:r>
+        <w:t>}</w:t>
+      </w:r>
+    </w:p>
+    <w:p>
+      <w:pPr>
+        <w:pStyle w:val="CodeExamples"/>
+        <w:spacing w:after="0"/>
+        <w:ind w:left="1440"/>
+      </w:pPr>
+      <w:r>
+        <w:t xml:space="preserve">    ]</w:t>
+      </w:r>
+    </w:p>
+    <w:p>
+      <w:pPr>
+        <w:pStyle w:val="CodeExamples"/>
+        <w:spacing w:after="0"/>
+        <w:ind w:left="1440"/>
+      </w:pPr>
+      <w:r>
+        <w:t xml:space="preserve">  },</w:t>
+      </w:r>
+    </w:p>
+    <w:p>
+      <w:pPr>
+        <w:pStyle w:val="CodeExamples"/>
+        <w:spacing w:after="0"/>
+        <w:ind w:left="1440"/>
+      </w:pPr>
+      <w:r>
+        <w:t xml:space="preserve">  {</w:t>
+      </w:r>
+    </w:p>
+    <w:p>
+      <w:pPr>
+        <w:pStyle w:val="CodeExamples"/>
+        <w:spacing w:after="0"/>
+        <w:ind w:left="1440"/>
+      </w:pPr>
+      <w:r>
+        <w:t xml:space="preserve">    "id": 2,</w:t>
+      </w:r>
+    </w:p>
+    <w:p>
+      <w:pPr>
+        <w:pStyle w:val="CodeExamples"/>
+        <w:spacing w:after="0"/>
+        <w:ind w:left="1440"/>
+      </w:pPr>
+      <w:r>
+        <w:t xml:space="preserve">    "name": "alice_dev Idea 2",</w:t>
+      </w:r>
+    </w:p>
+    <w:p>
+      <w:pPr>
+        <w:pStyle w:val="CodeExamples"/>
+        <w:spacing w:after="0"/>
+        <w:ind w:left="1440"/>
+      </w:pPr>
+      <w:r>
+        <w:t xml:space="preserve">    "description": "Recipe Hub",</w:t>
+      </w:r>
+    </w:p>
+    <w:p>
+      <w:pPr>
+        <w:pStyle w:val="CodeExamples"/>
+        <w:spacing w:after="0"/>
+        <w:ind w:left="1440"/>
+      </w:pPr>
+      <w:r>
+        <w:t xml:space="preserve">    "date_created": "2026-04-28T16:11:24.956Z",</w:t>
+      </w:r>
+    </w:p>
+    <w:p>
+      <w:pPr>
+        <w:pStyle w:val="CodeExamples"/>
+        <w:spacing w:after="0"/>
+        <w:ind w:left="1440"/>
+      </w:pPr>
+      <w:r>
+        <w:t xml:space="preserve">    "userId": 1</w:t>
+      </w:r>
+    </w:p>
+    <w:p>
+      <w:pPr>
+        <w:pStyle w:val="CodeExamples"/>
+        <w:spacing w:after="0"/>
+        <w:ind w:left="1440"/>
+      </w:pPr>
+      <w:r>
+        <w:t xml:space="preserve">  },</w:t>
+      </w:r>
+    </w:p>
+    <w:p>
+      <w:pPr>
+        <w:pStyle w:val="CodeExamples"/>
+        <w:spacing w:after="0"/>
+        <w:ind w:left="1440"/>
+      </w:pPr>
+      <w:r>
+        <w:t xml:space="preserve">  {</w:t>
+      </w:r>
+    </w:p>
+    <w:p>
+      <w:pPr>
+        <w:pStyle w:val="CodeExamples"/>
+        <w:spacing w:after="0"/>
+        <w:ind w:left="1440"/>
+      </w:pPr>
+      <w:r>
+        <w:t xml:space="preserve">    "id": 3,</w:t>
+      </w:r>
+    </w:p>
+    <w:p>
+      <w:pPr>
+        <w:pStyle w:val="CodeExamples"/>
+        <w:spacing w:after="0"/>
+        <w:ind w:left="1440"/>
+      </w:pPr>
+      <w:r>
+        <w:t xml:space="preserve">    "name": "alice_dev Idea 3",</w:t>
+      </w:r>
+    </w:p>
+    <w:p>
+      <w:pPr>
+        <w:pStyle w:val="CodeExamples"/>
+        <w:spacing w:after="0"/>
+        <w:ind w:left="1440"/>
+      </w:pPr>
+      <w:r>
+        <w:t xml:space="preserve">    "description": "Collab Tool",</w:t>
+      </w:r>
+    </w:p>
+    <w:p>
+      <w:pPr>
+        <w:pStyle w:val="CodeExamples"/>
+        <w:spacing w:after="0"/>
+        <w:ind w:left="1440"/>
+      </w:pPr>
+      <w:r>
+        <w:t xml:space="preserve">    "date_created": "2026-04-28T16:11:24.956Z",</w:t>
+      </w:r>
+    </w:p>
+    <w:p>
+      <w:pPr>
+        <w:pStyle w:val="CodeExamples"/>
+        <w:spacing w:after="0"/>
+        <w:ind w:left="1440"/>
+      </w:pPr>
+      <w:r>
+        <w:t xml:space="preserve">    "userId": 1</w:t>
+      </w:r>
+    </w:p>
+    <w:p>
+      <w:pPr>
+        <w:pStyle w:val="CodeExamples"/>
+        <w:spacing w:after="0"/>
+        <w:ind w:left="1440"/>
+      </w:pPr>
+      <w:r>
+        <w:t xml:space="preserve">  }</w:t>
+      </w:r>
+    </w:p>
+    <w:p>
+      <w:pPr>
+        <w:pStyle w:val="CodeExamples"/>
+        <w:spacing w:after="0"/>
+        <w:ind w:left="1440"/>
+      </w:pPr>
+      <w:r>
+        <w:t>]</w:t>
+      </w:r>
+    </w:p>
+    <w:p>
+      <w:pPr>
+        <w:spacing w:after="0"/>
+      </w:pPr>
+      <w:r>
+        <w:rPr>
+          <w:b/>
+          <w:bCs/>
+        </w:rPr>
+        <w:t xml:space="preserve">Case 2 –  </w:t>
+      </w:r>
+      <w:r>
+        <w:rPr>
+          <w:b/>
+          <w:bCs/>
+        </w:rPr>
+        <w:t>401 Unauthorized:</w:t>
+      </w:r>
+      <w:r>
+        <w:t> Remove the JWT from the Authorize feature.</w:t>
+      </w:r>
+    </w:p>
+    <w:p>
+      <w:pPr>
+        <w:pStyle w:val="ListParagraph"/>
+        <w:numPr>
+          <w:ilvl w:val="0"/>
+          <w:numId w:val="3"/>
+        </w:numPr>
+        <w:spacing w:after="0"/>
+      </w:pPr>
+      <w:r>
+        <w:t xml:space="preserve">Click the </w:t>
+      </w:r>
+      <w:r>
+        <w:rPr>
+          <w:b/>
+          <w:bCs/>
+        </w:rPr>
+        <w:t xml:space="preserve">Authorize </w:t>
+      </w:r>
+      <w:r>
+        <w:t xml:space="preserve">button at the top of the page and then press </w:t>
+      </w:r>
+      <w:r>
+        <w:rPr>
+          <w:b/>
+          <w:bCs/>
+        </w:rPr>
+        <w:t>logout</w:t>
+      </w:r>
+    </w:p>
+    <w:p>
+      <w:pPr>
+        <w:pStyle w:val="ListParagraph"/>
+        <w:numPr>
+          <w:ilvl w:val="0"/>
+          <w:numId w:val="3"/>
+        </w:numPr>
+        <w:spacing w:after="0"/>
       </w:pPr>
       <w:r>
         <w:t>Click </w:t>
@@ -3079,17 +5024,74 @@
         <w:pStyle w:val="ListParagraph"/>
         <w:numPr>
           <w:ilvl w:val="0"/>
-          <w:numId w:val="10"/>
-        </w:numPr>
-        <w:spacing w:after="0"/>
-      </w:pPr>
-      <w:r>
-        <w:t>Expect 413 Payload Too Large.</w:t>
-      </w:r>
-    </w:p>
-    <w:p>
-      <w:pPr>
-        <w:spacing w:after="0"/>
+          <w:numId w:val="3"/>
+        </w:numPr>
+        <w:spacing w:after="0"/>
+      </w:pPr>
+      <w:r>
+        <w:t>Expect</w:t>
+      </w:r>
+      <w:r>
+        <w:t>ed response:</w:t>
+      </w:r>
+    </w:p>
+    <w:p>
+      <w:pPr>
+        <w:pStyle w:val="ListParagraph"/>
+        <w:numPr>
+          <w:ilvl w:val="1"/>
+          <w:numId w:val="3"/>
+        </w:numPr>
+        <w:spacing w:after="0"/>
+      </w:pPr>
+      <w:r>
+        <w:t> </w:t>
+      </w:r>
+      <w:r>
+        <w:t xml:space="preserve">Status: </w:t>
+      </w:r>
+      <w:r>
+        <w:t>401 Unauthorized</w:t>
+      </w:r>
+      <w:r>
+        <w:t xml:space="preserve"> – Missing or invalid token</w:t>
+      </w:r>
+    </w:p>
+    <w:p>
+      <w:pPr>
+        <w:pStyle w:val="ListParagraph"/>
+        <w:numPr>
+          <w:ilvl w:val="1"/>
+          <w:numId w:val="3"/>
+        </w:numPr>
+        <w:spacing w:after="0"/>
+        <w:rPr>
+          <w:rStyle w:val="CodeExamplesChar"/>
+          <w:rFonts w:asciiTheme="minorHAnsi" w:hAnsiTheme="minorHAnsi"/>
+          <w:sz w:val="24"/>
+          <w:szCs w:val="24"/>
+        </w:rPr>
+      </w:pPr>
+      <w:r>
+        <w:t xml:space="preserve">JSON: </w:t>
+      </w:r>
+      <w:r>
+        <w:rPr>
+          <w:rStyle w:val="CodeExamplesChar"/>
+        </w:rPr>
+        <w:t>{ "error": "Not authenticated. Please provide a valid token."  }</w:t>
+      </w:r>
+    </w:p>
+    <w:p>
+      <w:pPr>
+        <w:spacing w:after="0"/>
+        <w:rPr>
+          <w:rStyle w:val="Heading3Char"/>
+          <w:rFonts w:eastAsiaTheme="minorHAnsi" w:cstheme="minorBidi"/>
+          <w:color w:val="auto"/>
+          <w:sz w:val="24"/>
+          <w:szCs w:val="24"/>
+        </w:rPr>
       </w:pPr>
     </w:p>
     <w:p>
@@ -3101,6 +5103,184 @@
           <w:rStyle w:val="Heading3Char"/>
           <w:u w:val="single"/>
         </w:rPr>
+        <w:t>POST /api/projects/:id/files</w:t>
+      </w:r>
+      <w:r>
+        <w:br/>
+      </w:r>
+      <w:r>
+        <w:rPr>
+          <w:b/>
+          <w:bCs/>
+        </w:rPr>
+        <w:t>Access Control:</w:t>
+      </w:r>
+      <w:r>
+        <w:t> Owner of the Project</w:t>
+      </w:r>
+      <w:r>
+        <w:br/>
+      </w:r>
+      <w:r>
+        <w:rPr>
+          <w:b/>
+          <w:bCs/>
+        </w:rPr>
+        <w:t xml:space="preserve">Case 1 – 201 </w:t>
+      </w:r>
+      <w:r>
+        <w:rPr>
+          <w:b/>
+          <w:bCs/>
+        </w:rPr>
+        <w:t>:</w:t>
+      </w:r>
+      <w:r>
+        <w:t> Use a project ID you own. Upload a small image or text file.</w:t>
+      </w:r>
+    </w:p>
+    <w:p>
+      <w:pPr>
+        <w:pStyle w:val="ListParagraph"/>
+        <w:numPr>
+          <w:ilvl w:val="0"/>
+          <w:numId w:val="9"/>
+        </w:numPr>
+        <w:spacing w:after="0"/>
+        <w:rPr>
+          <w:b/>
+          <w:bCs/>
+        </w:rPr>
+      </w:pPr>
+      <w:r>
+        <w:t>Click </w:t>
+      </w:r>
+      <w:r>
+        <w:rPr>
+          <w:b/>
+          <w:bCs/>
+        </w:rPr>
+        <w:t>Try it out</w:t>
+      </w:r>
+    </w:p>
+    <w:p>
+      <w:pPr>
+        <w:pStyle w:val="ListParagraph"/>
+        <w:numPr>
+          <w:ilvl w:val="0"/>
+          <w:numId w:val="9"/>
+        </w:numPr>
+        <w:spacing w:after="0"/>
+      </w:pPr>
+      <w:r>
+        <w:t>Expect response: 201 Created.</w:t>
+      </w:r>
+    </w:p>
+    <w:p>
+      <w:pPr>
+        <w:spacing w:after="0"/>
+        <w:rPr>
+          <w:b/>
+          <w:bCs/>
+        </w:rPr>
+      </w:pPr>
+      <w:r>
+        <w:rPr>
+          <w:b/>
+          <w:bCs/>
+        </w:rPr>
+        <w:t xml:space="preserve">Case 2 </w:t>
+      </w:r>
+      <w:r>
+        <w:rPr>
+          <w:b/>
+          <w:bCs/>
+        </w:rPr>
+        <w:t>–</w:t>
+      </w:r>
+      <w:r>
+        <w:rPr>
+          <w:b/>
+          <w:bCs/>
+        </w:rPr>
+        <w:t xml:space="preserve"> </w:t>
+      </w:r>
+      <w:r>
+        <w:rPr>
+          <w:b/>
+          <w:bCs/>
+        </w:rPr>
+        <w:t xml:space="preserve">413 </w:t>
+      </w:r>
+      <w:r>
+        <w:rPr>
+          <w:b/>
+          <w:bCs/>
+        </w:rPr>
+        <w:t>Payload Too Large:</w:t>
+      </w:r>
+      <w:r>
+        <w:rPr>
+          <w:b/>
+          <w:bCs/>
+        </w:rPr>
+        <w:t xml:space="preserve"> </w:t>
+      </w:r>
+      <w:r>
+        <w:t>Attempt to upload a file larger than 10MB.</w:t>
+      </w:r>
+    </w:p>
+    <w:p>
+      <w:pPr>
+        <w:pStyle w:val="ListParagraph"/>
+        <w:numPr>
+          <w:ilvl w:val="0"/>
+          <w:numId w:val="10"/>
+        </w:numPr>
+        <w:spacing w:after="0"/>
+        <w:rPr>
+          <w:b/>
+          <w:bCs/>
+        </w:rPr>
+      </w:pPr>
+      <w:r>
+        <w:t>Click </w:t>
+      </w:r>
+      <w:r>
+        <w:rPr>
+          <w:b/>
+          <w:bCs/>
+        </w:rPr>
+        <w:t>Try it out</w:t>
+      </w:r>
+    </w:p>
+    <w:p>
+      <w:pPr>
+        <w:pStyle w:val="ListParagraph"/>
+        <w:numPr>
+          <w:ilvl w:val="0"/>
+          <w:numId w:val="10"/>
+        </w:numPr>
+        <w:spacing w:after="0"/>
+      </w:pPr>
+      <w:r>
+        <w:t>Expect 413 Payload Too Large.</w:t>
+      </w:r>
+    </w:p>
+    <w:p>
+      <w:pPr>
+        <w:spacing w:after="0"/>
+      </w:pPr>
+    </w:p>
+    <w:p>
+      <w:pPr>
+        <w:spacing w:after="0"/>
+      </w:pPr>
+      <w:r>
+        <w:rPr>
+          <w:rStyle w:val="Heading3Char"/>
+          <w:u w:val="single"/>
+        </w:rPr>
         <w:t>GET /api/projects/:id/files/download</w:t>
       </w:r>
       <w:r>
@@ -3146,6 +5326,7 @@
         <w:spacing w:after="0"/>
       </w:pPr>
       <w:r>
+        <w:lastRenderedPageBreak/>
         <w:t>Click </w:t>
       </w:r>
       <w:r>
@@ -3178,7 +5359,7 @@
       </w:pPr>
       <w:r>
         <w:pict w14:anchorId="57357105">
-          <v:rect id="_x0000_i1051" style="width:0;height:.75pt" o:hralign="center" o:hrstd="t" o:hr="t" fillcolor="#a0a0a0" stroked="f"/>
+          <v:rect id="_x0000_i1027" style="width:0;height:.75pt" o:hralign="center" o:hrstd="t" o:hr="t" fillcolor="#a0a0a0" stroked="f"/>
         </w:pict>
       </w:r>
     </w:p>
@@ -3271,7 +5452,6 @@
           <w:b/>
           <w:bCs/>
         </w:rPr>
-        <w:lastRenderedPageBreak/>
         <w:t>400 Bad Request:</w:t>
       </w:r>
       <w:r>
@@ -3441,7 +5621,7 @@
       </w:pPr>
       <w:r>
         <w:pict w14:anchorId="383DC381">
-          <v:rect id="_x0000_i1052" style="width:0;height:.75pt" o:hralign="center" o:hrstd="t" o:hr="t" fillcolor="#a0a0a0" stroked="f"/>
+          <v:rect id="_x0000_i1028" style="width:0;height:.75pt" o:hralign="center" o:hrstd="t" o:hr="t" fillcolor="#a0a0a0" stroked="f"/>
         </w:pict>
       </w:r>
     </w:p>
@@ -3735,7 +5915,7 @@
         <w:rFonts w:ascii="Symbol" w:hAnsi="Symbol" w:hint="default"/>
       </w:rPr>
     </w:lvl>
-    <w:lvl w:ilvl="1" w:tplc="04090003" w:tentative="1">
+    <w:lvl w:ilvl="1" w:tplc="04090003">
       <w:start w:val="1"/>
       <w:numFmt w:val="bullet"/>
       <w:lvlText w:val="o"/>
@@ -3747,7 +5927,7 @@
         <w:rFonts w:ascii="Courier New" w:hAnsi="Courier New" w:cs="Courier New" w:hint="default"/>
       </w:rPr>
     </w:lvl>
-    <w:lvl w:ilvl="2" w:tplc="04090005" w:tentative="1">
+    <w:lvl w:ilvl="2" w:tplc="04090005">
       <w:start w:val="1"/>
       <w:numFmt w:val="bullet"/>
       <w:lvlText w:val=""/>
@@ -3961,7 +6141,7 @@
         <w:rFonts w:ascii="Symbol" w:hAnsi="Symbol" w:hint="default"/>
       </w:rPr>
     </w:lvl>
-    <w:lvl w:ilvl="1" w:tplc="04090003" w:tentative="1">
+    <w:lvl w:ilvl="1" w:tplc="04090003">
       <w:start w:val="1"/>
       <w:numFmt w:val="bullet"/>
       <w:lvlText w:val="o"/>
@@ -3973,7 +6153,7 @@
         <w:rFonts w:ascii="Courier New" w:hAnsi="Courier New" w:cs="Courier New" w:hint="default"/>
       </w:rPr>
     </w:lvl>
-    <w:lvl w:ilvl="2" w:tplc="04090005" w:tentative="1">
+    <w:lvl w:ilvl="2" w:tplc="04090005">
       <w:start w:val="1"/>
       <w:numFmt w:val="bullet"/>
       <w:lvlText w:val=""/>

</xml_diff>

<commit_message>
altered getFilesByProjectId to not return the full byte data of each file. It now just returns the metadata.
</commit_message>
<xml_diff>
--- a/docs/Testing/Testing.docx
+++ b/docs/Testing/Testing.docx
@@ -125,13 +125,8 @@
         <w:t>201</w:t>
       </w:r>
       <w:r>
-        <w:t xml:space="preserve"> User created </w:t>
-      </w:r>
-      <w:proofErr w:type="spellStart"/>
-      <w:r>
-        <w:t>sucessfully</w:t>
-      </w:r>
-      <w:proofErr w:type="spellEnd"/>
+        <w:t xml:space="preserve"> User created sucessfully</w:t>
+      </w:r>
     </w:p>
     <w:p>
       <w:pPr>
@@ -975,21 +970,7 @@
         <w:rPr>
           <w:rStyle w:val="CodeExamplesChar"/>
         </w:rPr>
-        <w:t>{ "</w:t>
-      </w:r>
-      <w:proofErr w:type="spellStart"/>
-      <w:r>
-        <w:rPr>
-          <w:rStyle w:val="CodeExamplesChar"/>
-        </w:rPr>
-        <w:t>accessToken</w:t>
-      </w:r>
-      <w:proofErr w:type="spellEnd"/>
-      <w:r>
-        <w:rPr>
-          <w:rStyle w:val="CodeExamplesChar"/>
-        </w:rPr>
-        <w:t>": "eyJhbGciOiJIUzI1NiIsInR5cCI6IkpXVCJ9..."</w:t>
+        <w:t>{ "accessToken": "eyJhbGciOiJIUzI1NiIsInR5cCI6IkpXVCJ9..."</w:t>
       </w:r>
       <w:r>
         <w:rPr>
@@ -1086,21 +1067,7 @@
         <w:rPr>
           <w:rStyle w:val="CodeExamplesChar"/>
         </w:rPr>
-        <w:t>"</w:t>
-      </w:r>
-      <w:proofErr w:type="spellStart"/>
-      <w:r>
-        <w:rPr>
-          <w:rStyle w:val="CodeExamplesChar"/>
-        </w:rPr>
-        <w:t>eyJhbGciOiJIUzI</w:t>
-      </w:r>
-      <w:proofErr w:type="spellEnd"/>
-      <w:r>
-        <w:rPr>
-          <w:rStyle w:val="CodeExamplesChar"/>
-        </w:rPr>
-        <w:t>..."</w:t>
+        <w:t>"eyJhbGciOiJIUzI..."</w:t>
       </w:r>
       <w:r>
         <w:rPr>
@@ -1397,15 +1364,7 @@
         <w:ind w:left="1440"/>
       </w:pPr>
       <w:r>
-        <w:t xml:space="preserve">    "name": "</w:t>
-      </w:r>
-      <w:proofErr w:type="spellStart"/>
-      <w:r>
-        <w:t>alice_dev</w:t>
-      </w:r>
-      <w:proofErr w:type="spellEnd"/>
-      <w:r>
-        <w:t xml:space="preserve"> Idea 1",</w:t>
+        <w:t xml:space="preserve">    "name": "alice_dev Idea 1",</w:t>
       </w:r>
     </w:p>
     <w:p>
@@ -1425,20 +1384,7 @@
         <w:ind w:left="1440"/>
       </w:pPr>
       <w:r>
-        <w:t xml:space="preserve">    "</w:t>
-      </w:r>
-      <w:proofErr w:type="spellStart"/>
-      <w:proofErr w:type="gramStart"/>
-      <w:r>
-        <w:t>date</w:t>
-      </w:r>
-      <w:proofErr w:type="gramEnd"/>
-      <w:r>
-        <w:t>_created</w:t>
-      </w:r>
-      <w:proofErr w:type="spellEnd"/>
-      <w:r>
-        <w:t>": "2026-04-28T16:11:24.956Z",</w:t>
+        <w:t xml:space="preserve">    "date_created": "2026-04-28T16:11:24.956Z",</w:t>
       </w:r>
     </w:p>
     <w:p>
@@ -1448,15 +1394,7 @@
         <w:ind w:left="1440"/>
       </w:pPr>
       <w:r>
-        <w:t xml:space="preserve">    "</w:t>
-      </w:r>
-      <w:proofErr w:type="spellStart"/>
-      <w:r>
-        <w:t>userId</w:t>
-      </w:r>
-      <w:proofErr w:type="spellEnd"/>
-      <w:r>
-        <w:t>": 1</w:t>
+        <w:t xml:space="preserve">    "userId": 1</w:t>
       </w:r>
     </w:p>
     <w:p>
@@ -1496,15 +1434,7 @@
         <w:ind w:left="1440"/>
       </w:pPr>
       <w:r>
-        <w:t xml:space="preserve">    "name": "</w:t>
-      </w:r>
-      <w:proofErr w:type="spellStart"/>
-      <w:r>
-        <w:t>alice_dev</w:t>
-      </w:r>
-      <w:proofErr w:type="spellEnd"/>
-      <w:r>
-        <w:t xml:space="preserve"> Idea 2",</w:t>
+        <w:t xml:space="preserve">    "name": "alice_dev Idea 2",</w:t>
       </w:r>
     </w:p>
     <w:p>
@@ -1524,20 +1454,7 @@
         <w:ind w:left="1440"/>
       </w:pPr>
       <w:r>
-        <w:t xml:space="preserve">    "</w:t>
-      </w:r>
-      <w:proofErr w:type="spellStart"/>
-      <w:proofErr w:type="gramStart"/>
-      <w:r>
-        <w:t>date</w:t>
-      </w:r>
-      <w:proofErr w:type="gramEnd"/>
-      <w:r>
-        <w:t>_created</w:t>
-      </w:r>
-      <w:proofErr w:type="spellEnd"/>
-      <w:r>
-        <w:t>": "2026-04-28T16:11:24.956Z",</w:t>
+        <w:t xml:space="preserve">    "date_created": "2026-04-28T16:11:24.956Z",</w:t>
       </w:r>
     </w:p>
     <w:p>
@@ -1547,15 +1464,7 @@
         <w:ind w:left="1440"/>
       </w:pPr>
       <w:r>
-        <w:t xml:space="preserve">    "</w:t>
-      </w:r>
-      <w:proofErr w:type="spellStart"/>
-      <w:r>
-        <w:t>userId</w:t>
-      </w:r>
-      <w:proofErr w:type="spellEnd"/>
-      <w:r>
-        <w:t>": 1</w:t>
+        <w:t xml:space="preserve">    "userId": 1</w:t>
       </w:r>
     </w:p>
     <w:p>
@@ -1595,15 +1504,7 @@
         <w:ind w:left="1440"/>
       </w:pPr>
       <w:r>
-        <w:t xml:space="preserve">    "name": "</w:t>
-      </w:r>
-      <w:proofErr w:type="spellStart"/>
-      <w:r>
-        <w:t>alice_dev</w:t>
-      </w:r>
-      <w:proofErr w:type="spellEnd"/>
-      <w:r>
-        <w:t xml:space="preserve"> Idea 3",</w:t>
+        <w:t xml:space="preserve">    "name": "alice_dev Idea 3",</w:t>
       </w:r>
     </w:p>
     <w:p>
@@ -1623,20 +1524,7 @@
         <w:ind w:left="1440"/>
       </w:pPr>
       <w:r>
-        <w:t xml:space="preserve">    "</w:t>
-      </w:r>
-      <w:proofErr w:type="spellStart"/>
-      <w:proofErr w:type="gramStart"/>
-      <w:r>
-        <w:t>date</w:t>
-      </w:r>
-      <w:proofErr w:type="gramEnd"/>
-      <w:r>
-        <w:t>_created</w:t>
-      </w:r>
-      <w:proofErr w:type="spellEnd"/>
-      <w:r>
-        <w:t>": "2026-04-28T16:11:24.956Z",</w:t>
+        <w:t xml:space="preserve">    "date_created": "2026-04-28T16:11:24.956Z",</w:t>
       </w:r>
     </w:p>
     <w:p>
@@ -1646,15 +1534,7 @@
         <w:ind w:left="1440"/>
       </w:pPr>
       <w:r>
-        <w:t xml:space="preserve">    "</w:t>
-      </w:r>
-      <w:proofErr w:type="spellStart"/>
-      <w:r>
-        <w:t>userId</w:t>
-      </w:r>
-      <w:proofErr w:type="spellEnd"/>
-      <w:r>
-        <w:t>": 1</w:t>
+        <w:t xml:space="preserve">    "userId": 1</w:t>
       </w:r>
     </w:p>
     <w:p>
@@ -2020,20 +1900,7 @@
         <w:ind w:left="1440"/>
       </w:pPr>
       <w:r>
-        <w:t xml:space="preserve">  "</w:t>
-      </w:r>
-      <w:proofErr w:type="spellStart"/>
-      <w:proofErr w:type="gramStart"/>
-      <w:r>
-        <w:t>date</w:t>
-      </w:r>
-      <w:proofErr w:type="gramEnd"/>
-      <w:r>
-        <w:t>_created</w:t>
-      </w:r>
-      <w:proofErr w:type="spellEnd"/>
-      <w:r>
-        <w:t>": "2026-04-28T17:45:09.600Z",</w:t>
+        <w:t xml:space="preserve">  "date_created": "2026-04-28T17:45:09.600Z",</w:t>
       </w:r>
     </w:p>
     <w:p>
@@ -2042,15 +1909,7 @@
         <w:ind w:left="1440"/>
       </w:pPr>
       <w:r>
-        <w:t xml:space="preserve">  "</w:t>
-      </w:r>
-      <w:proofErr w:type="spellStart"/>
-      <w:r>
-        <w:t>userId</w:t>
-      </w:r>
-      <w:proofErr w:type="spellEnd"/>
-      <w:r>
-        <w:t>": 1</w:t>
+        <w:t xml:space="preserve">  "userId": 1</w:t>
       </w:r>
     </w:p>
     <w:p>
@@ -2750,13 +2609,8 @@
         <w:t> </w:t>
       </w:r>
       <w:r>
-        <w:t xml:space="preserve">Update an </w:t>
-      </w:r>
-      <w:proofErr w:type="gramStart"/>
-      <w:r>
-        <w:t>Idea</w:t>
-      </w:r>
-      <w:proofErr w:type="gramEnd"/>
+        <w:t>Update an Idea</w:t>
+      </w:r>
     </w:p>
     <w:p>
       <w:pPr>
@@ -2922,20 +2776,7 @@
         <w:ind w:left="1440"/>
       </w:pPr>
       <w:r>
-        <w:t xml:space="preserve">  "</w:t>
-      </w:r>
-      <w:proofErr w:type="spellStart"/>
-      <w:proofErr w:type="gramStart"/>
-      <w:r>
-        <w:t>date</w:t>
-      </w:r>
-      <w:proofErr w:type="gramEnd"/>
-      <w:r>
-        <w:t>_created</w:t>
-      </w:r>
-      <w:proofErr w:type="spellEnd"/>
-      <w:r>
-        <w:t>": "2026-04-28T18:07:07.644Z",</w:t>
+        <w:t xml:space="preserve">  "date_created": "2026-04-28T18:07:07.644Z",</w:t>
       </w:r>
     </w:p>
     <w:p>
@@ -2944,15 +2785,7 @@
         <w:ind w:left="1440"/>
       </w:pPr>
       <w:r>
-        <w:t xml:space="preserve">  "</w:t>
-      </w:r>
-      <w:proofErr w:type="spellStart"/>
-      <w:r>
-        <w:t>userId</w:t>
-      </w:r>
-      <w:proofErr w:type="spellEnd"/>
-      <w:r>
-        <w:t>": 1</w:t>
+        <w:t xml:space="preserve">  "userId": 1</w:t>
       </w:r>
     </w:p>
     <w:p>
@@ -4632,15 +4465,7 @@
         <w:ind w:left="1440"/>
       </w:pPr>
       <w:r>
-        <w:t xml:space="preserve">    "name": "</w:t>
-      </w:r>
-      <w:proofErr w:type="spellStart"/>
-      <w:r>
-        <w:t>alice_dev</w:t>
-      </w:r>
-      <w:proofErr w:type="spellEnd"/>
-      <w:r>
-        <w:t xml:space="preserve"> </w:t>
+        <w:t xml:space="preserve">    "name": "alice_dev </w:t>
       </w:r>
       <w:r>
         <w:t>Project</w:t>
@@ -4675,20 +4500,7 @@
         <w:ind w:left="1440"/>
       </w:pPr>
       <w:r>
-        <w:t xml:space="preserve">    "</w:t>
-      </w:r>
-      <w:proofErr w:type="spellStart"/>
-      <w:proofErr w:type="gramStart"/>
-      <w:r>
-        <w:t>date</w:t>
-      </w:r>
-      <w:proofErr w:type="gramEnd"/>
-      <w:r>
-        <w:t>_created</w:t>
-      </w:r>
-      <w:proofErr w:type="spellEnd"/>
-      <w:r>
-        <w:t>": "2026-04-28T16:11:24.956Z"</w:t>
+        <w:t xml:space="preserve">    "date_created": "2026-04-28T16:11:24.956Z"</w:t>
       </w:r>
     </w:p>
     <w:p>
@@ -4729,24 +4541,101 @@
         <w:ind w:left="1440"/>
       </w:pPr>
       <w:r>
-        <w:t xml:space="preserve">    "name": "</w:t>
-      </w:r>
-      <w:proofErr w:type="spellStart"/>
-      <w:r>
-        <w:t>alice_dev</w:t>
-      </w:r>
-      <w:proofErr w:type="spellEnd"/>
+        <w:t xml:space="preserve">    "name": "alice_dev </w:t>
+      </w:r>
+      <w:r>
+        <w:t>Project</w:t>
+      </w:r>
       <w:r>
         <w:t xml:space="preserve"> </w:t>
       </w:r>
       <w:r>
+        <w:t>2",</w:t>
+      </w:r>
+    </w:p>
+    <w:p>
+      <w:pPr>
+        <w:pStyle w:val="CodeExamples"/>
+        <w:spacing w:after="0"/>
+        <w:ind w:left="1440"/>
+      </w:pPr>
+      <w:r>
+        <w:t xml:space="preserve">    "description": "</w:t>
+      </w:r>
+      <w:r>
+        <w:t>Workspace for project 2</w:t>
+      </w:r>
+      <w:r>
+        <w:t>",</w:t>
+      </w:r>
+    </w:p>
+    <w:p>
+      <w:pPr>
+        <w:pStyle w:val="CodeExamples"/>
+        <w:spacing w:after="0"/>
+        <w:ind w:left="1440"/>
+      </w:pPr>
+      <w:r>
+        <w:t xml:space="preserve">    "date_created": "2026-04-28T16:11:24.956Z",</w:t>
+      </w:r>
+    </w:p>
+    <w:p>
+      <w:pPr>
+        <w:pStyle w:val="CodeExamples"/>
+        <w:spacing w:after="0"/>
+        <w:ind w:left="1440"/>
+      </w:pPr>
+      <w:r>
+        <w:t xml:space="preserve">    "userId": 1</w:t>
+      </w:r>
+    </w:p>
+    <w:p>
+      <w:pPr>
+        <w:pStyle w:val="CodeExamples"/>
+        <w:spacing w:after="0"/>
+        <w:ind w:left="1440"/>
+      </w:pPr>
+      <w:r>
+        <w:t xml:space="preserve">  },</w:t>
+      </w:r>
+    </w:p>
+    <w:p>
+      <w:pPr>
+        <w:pStyle w:val="CodeExamples"/>
+        <w:spacing w:after="0"/>
+        <w:ind w:left="1440"/>
+      </w:pPr>
+      <w:r>
+        <w:t xml:space="preserve">  {</w:t>
+      </w:r>
+    </w:p>
+    <w:p>
+      <w:pPr>
+        <w:pStyle w:val="CodeExamples"/>
+        <w:spacing w:after="0"/>
+        <w:ind w:left="1440"/>
+      </w:pPr>
+      <w:r>
+        <w:t xml:space="preserve">    "id": 3,</w:t>
+      </w:r>
+    </w:p>
+    <w:p>
+      <w:pPr>
+        <w:pStyle w:val="CodeExamples"/>
+        <w:spacing w:after="0"/>
+        <w:ind w:left="1440"/>
+      </w:pPr>
+      <w:r>
+        <w:t xml:space="preserve">    "name": "alice_dev </w:t>
+      </w:r>
+      <w:r>
         <w:t>Project</w:t>
       </w:r>
       <w:r>
         <w:t xml:space="preserve"> </w:t>
       </w:r>
       <w:r>
-        <w:t>2",</w:t>
+        <w:t>3",</w:t>
       </w:r>
     </w:p>
     <w:p>
@@ -4759,10 +4648,7 @@
         <w:t xml:space="preserve">    "description": "</w:t>
       </w:r>
       <w:r>
-        <w:t xml:space="preserve">Workspace for project </w:t>
-      </w:r>
-      <w:r>
-        <w:t>2</w:t>
+        <w:t>Workspace for project 3</w:t>
       </w:r>
       <w:r>
         <w:t>",</w:t>
@@ -4775,20 +4661,7 @@
         <w:ind w:left="1440"/>
       </w:pPr>
       <w:r>
-        <w:t xml:space="preserve">    "</w:t>
-      </w:r>
-      <w:proofErr w:type="spellStart"/>
-      <w:proofErr w:type="gramStart"/>
-      <w:r>
-        <w:t>date</w:t>
-      </w:r>
-      <w:proofErr w:type="gramEnd"/>
-      <w:r>
-        <w:t>_created</w:t>
-      </w:r>
-      <w:proofErr w:type="spellEnd"/>
-      <w:r>
-        <w:t>": "2026-04-28T16:11:24.956Z",</w:t>
+        <w:t xml:space="preserve">    "date_created": "2026-04-28T16:11:24.956Z",</w:t>
       </w:r>
     </w:p>
     <w:p>
@@ -4798,132 +4671,7 @@
         <w:ind w:left="1440"/>
       </w:pPr>
       <w:r>
-        <w:t xml:space="preserve">    "</w:t>
-      </w:r>
-      <w:proofErr w:type="spellStart"/>
-      <w:r>
-        <w:t>userId</w:t>
-      </w:r>
-      <w:proofErr w:type="spellEnd"/>
-      <w:r>
-        <w:t>": 1</w:t>
-      </w:r>
-    </w:p>
-    <w:p>
-      <w:pPr>
-        <w:pStyle w:val="CodeExamples"/>
-        <w:spacing w:after="0"/>
-        <w:ind w:left="1440"/>
-      </w:pPr>
-      <w:r>
-        <w:t xml:space="preserve">  },</w:t>
-      </w:r>
-    </w:p>
-    <w:p>
-      <w:pPr>
-        <w:pStyle w:val="CodeExamples"/>
-        <w:spacing w:after="0"/>
-        <w:ind w:left="1440"/>
-      </w:pPr>
-      <w:r>
-        <w:t xml:space="preserve">  {</w:t>
-      </w:r>
-    </w:p>
-    <w:p>
-      <w:pPr>
-        <w:pStyle w:val="CodeExamples"/>
-        <w:spacing w:after="0"/>
-        <w:ind w:left="1440"/>
-      </w:pPr>
-      <w:r>
-        <w:t xml:space="preserve">    "id": 3,</w:t>
-      </w:r>
-    </w:p>
-    <w:p>
-      <w:pPr>
-        <w:pStyle w:val="CodeExamples"/>
-        <w:spacing w:after="0"/>
-        <w:ind w:left="1440"/>
-      </w:pPr>
-      <w:r>
-        <w:t xml:space="preserve">    "name": "</w:t>
-      </w:r>
-      <w:proofErr w:type="spellStart"/>
-      <w:r>
-        <w:t>alice_dev</w:t>
-      </w:r>
-      <w:proofErr w:type="spellEnd"/>
-      <w:r>
-        <w:t xml:space="preserve"> </w:t>
-      </w:r>
-      <w:r>
-        <w:t>Project</w:t>
-      </w:r>
-      <w:r>
-        <w:t xml:space="preserve"> </w:t>
-      </w:r>
-      <w:r>
-        <w:t>3",</w:t>
-      </w:r>
-    </w:p>
-    <w:p>
-      <w:pPr>
-        <w:pStyle w:val="CodeExamples"/>
-        <w:spacing w:after="0"/>
-        <w:ind w:left="1440"/>
-      </w:pPr>
-      <w:r>
-        <w:t xml:space="preserve">    "description": "</w:t>
-      </w:r>
-      <w:r>
-        <w:t xml:space="preserve">Workspace for project </w:t>
-      </w:r>
-      <w:r>
-        <w:t>3</w:t>
-      </w:r>
-      <w:r>
-        <w:t>",</w:t>
-      </w:r>
-    </w:p>
-    <w:p>
-      <w:pPr>
-        <w:pStyle w:val="CodeExamples"/>
-        <w:spacing w:after="0"/>
-        <w:ind w:left="1440"/>
-      </w:pPr>
-      <w:r>
-        <w:t xml:space="preserve">    "</w:t>
-      </w:r>
-      <w:proofErr w:type="spellStart"/>
-      <w:proofErr w:type="gramStart"/>
-      <w:r>
-        <w:t>date</w:t>
-      </w:r>
-      <w:proofErr w:type="gramEnd"/>
-      <w:r>
-        <w:t>_created</w:t>
-      </w:r>
-      <w:proofErr w:type="spellEnd"/>
-      <w:r>
-        <w:t>": "2026-04-28T16:11:24.956Z",</w:t>
-      </w:r>
-    </w:p>
-    <w:p>
-      <w:pPr>
-        <w:pStyle w:val="CodeExamples"/>
-        <w:spacing w:after="0"/>
-        <w:ind w:left="1440"/>
-      </w:pPr>
-      <w:r>
-        <w:t xml:space="preserve">    "</w:t>
-      </w:r>
-      <w:proofErr w:type="spellStart"/>
-      <w:r>
-        <w:t>userId</w:t>
-      </w:r>
-      <w:proofErr w:type="spellEnd"/>
-      <w:r>
-        <w:t>": 1</w:t>
+        <w:t xml:space="preserve">    "userId": 1</w:t>
       </w:r>
     </w:p>
     <w:p>
@@ -5148,21 +4896,7 @@
           <w:b/>
           <w:bCs/>
         </w:rPr>
-        <w:t xml:space="preserve">Case 1 – 201 </w:t>
-      </w:r>
-      <w:r>
-        <w:rPr>
-          <w:b/>
-          <w:bCs/>
-        </w:rPr>
-        <w:t>Project</w:t>
-      </w:r>
-      <w:r>
-        <w:rPr>
-          <w:b/>
-          <w:bCs/>
-        </w:rPr>
-        <w:t xml:space="preserve"> Created Successfully </w:t>
+        <w:t xml:space="preserve">Case 1 – 201 Project Created Successfully </w:t>
       </w:r>
       <w:r>
         <w:t> </w:t>
@@ -5321,20 +5055,7 @@
         <w:ind w:left="1440"/>
       </w:pPr>
       <w:r>
-        <w:t xml:space="preserve">  "</w:t>
-      </w:r>
-      <w:proofErr w:type="spellStart"/>
-      <w:proofErr w:type="gramStart"/>
-      <w:r>
-        <w:t>date</w:t>
-      </w:r>
-      <w:proofErr w:type="gramEnd"/>
-      <w:r>
-        <w:t>_created</w:t>
-      </w:r>
-      <w:proofErr w:type="spellEnd"/>
-      <w:r>
-        <w:t>": "2026-04-28T19:00:05.863Z",</w:t>
+        <w:t xml:space="preserve">  "date_created": "2026-04-28T19:00:05.863Z",</w:t>
       </w:r>
     </w:p>
     <w:p>
@@ -5993,81 +5714,52 @@
         <w:ind w:left="1440"/>
       </w:pPr>
       <w:r>
-        <w:t xml:space="preserve">  "name": "</w:t>
-      </w:r>
-      <w:proofErr w:type="spellStart"/>
-      <w:r>
-        <w:t>alice_dev</w:t>
-      </w:r>
-      <w:proofErr w:type="spellEnd"/>
+        <w:t xml:space="preserve">  "name": "alice_dev </w:t>
+      </w:r>
+      <w:r>
+        <w:t>Project</w:t>
+      </w:r>
+      <w:r>
+        <w:t xml:space="preserve"> 1",</w:t>
+      </w:r>
+    </w:p>
+    <w:p>
+      <w:pPr>
+        <w:pStyle w:val="CodeExamples"/>
+        <w:spacing w:after="0"/>
+        <w:ind w:left="1440"/>
+      </w:pPr>
+      <w:r>
+        <w:t xml:space="preserve">  "description": "</w:t>
+      </w:r>
+      <w:r>
+        <w:t>Workspace for project 1</w:t>
+      </w:r>
+      <w:r>
+        <w:t>",</w:t>
+      </w:r>
+    </w:p>
+    <w:p>
+      <w:pPr>
+        <w:pStyle w:val="CodeExamples"/>
+        <w:spacing w:after="0"/>
+        <w:ind w:left="1440"/>
+      </w:pPr>
+      <w:r>
+        <w:t xml:space="preserve">  "date_created": "2026-04-28T16:11:24.956Z",</w:t>
+      </w:r>
+    </w:p>
+    <w:p>
+      <w:pPr>
+        <w:pStyle w:val="CodeExamples"/>
+        <w:spacing w:after="0"/>
+        <w:ind w:left="1440"/>
+      </w:pPr>
       <w:r>
         <w:t xml:space="preserve"> </w:t>
       </w:r>
       <w:r>
-        <w:t>Project</w:t>
-      </w:r>
-      <w:r>
-        <w:t xml:space="preserve"> 1",</w:t>
-      </w:r>
-    </w:p>
-    <w:p>
-      <w:pPr>
-        <w:pStyle w:val="CodeExamples"/>
-        <w:spacing w:after="0"/>
-        <w:ind w:left="1440"/>
-      </w:pPr>
-      <w:r>
-        <w:t xml:space="preserve">  "description": "</w:t>
-      </w:r>
-      <w:r>
-        <w:t>Workspace for project 1</w:t>
-      </w:r>
-      <w:r>
-        <w:t>",</w:t>
-      </w:r>
-    </w:p>
-    <w:p>
-      <w:pPr>
-        <w:pStyle w:val="CodeExamples"/>
-        <w:spacing w:after="0"/>
-        <w:ind w:left="1440"/>
-      </w:pPr>
-      <w:r>
-        <w:t xml:space="preserve">  "</w:t>
-      </w:r>
-      <w:proofErr w:type="spellStart"/>
-      <w:proofErr w:type="gramStart"/>
-      <w:r>
-        <w:t>date</w:t>
-      </w:r>
-      <w:proofErr w:type="gramEnd"/>
-      <w:r>
-        <w:t>_created</w:t>
-      </w:r>
-      <w:proofErr w:type="spellEnd"/>
-      <w:r>
-        <w:t>": "2026-04-28T16:11:24.956Z",</w:t>
-      </w:r>
-    </w:p>
-    <w:p>
-      <w:pPr>
-        <w:pStyle w:val="CodeExamples"/>
-        <w:spacing w:after="0"/>
-        <w:ind w:left="1440"/>
-      </w:pPr>
-      <w:r>
-        <w:t xml:space="preserve"> </w:t>
-      </w:r>
-      <w:r>
-        <w:t xml:space="preserve"> "</w:t>
-      </w:r>
-      <w:proofErr w:type="spellStart"/>
-      <w:r>
-        <w:t>userId</w:t>
-      </w:r>
-      <w:proofErr w:type="spellEnd"/>
-      <w:r>
-        <w:t>": 1</w:t>
+        <w:t xml:space="preserve"> "userId": 1</w:t>
       </w:r>
     </w:p>
     <w:p>
@@ -6463,13 +6155,8 @@
         <w:t> </w:t>
       </w:r>
       <w:r>
-        <w:t xml:space="preserve">Update an </w:t>
-      </w:r>
-      <w:proofErr w:type="gramStart"/>
-      <w:r>
-        <w:t>Idea</w:t>
-      </w:r>
-      <w:proofErr w:type="gramEnd"/>
+        <w:t>Update an Idea</w:t>
+      </w:r>
     </w:p>
     <w:p>
       <w:pPr>
@@ -6619,13 +6306,8 @@
       <w:r>
         <w:t xml:space="preserve">  "name": "</w:t>
       </w:r>
-      <w:proofErr w:type="spellStart"/>
-      <w:r>
-        <w:t>alice_dev</w:t>
-      </w:r>
-      <w:proofErr w:type="spellEnd"/>
-      <w:r>
-        <w:t xml:space="preserve"> </w:t>
+      <w:r>
+        <w:t xml:space="preserve">alice_dev </w:t>
       </w:r>
       <w:r>
         <w:t xml:space="preserve">Updated </w:t>
@@ -6649,10 +6331,7 @@
         <w:t xml:space="preserve">Updated </w:t>
       </w:r>
       <w:r>
-        <w:t xml:space="preserve">Workspace for project </w:t>
-      </w:r>
-      <w:r>
-        <w:t>2</w:t>
+        <w:t>Workspace for project 2</w:t>
       </w:r>
       <w:r>
         <w:t>",</w:t>
@@ -6664,20 +6343,7 @@
         <w:ind w:left="1440"/>
       </w:pPr>
       <w:r>
-        <w:t xml:space="preserve">  "</w:t>
-      </w:r>
-      <w:proofErr w:type="spellStart"/>
-      <w:proofErr w:type="gramStart"/>
-      <w:r>
-        <w:t>date</w:t>
-      </w:r>
-      <w:proofErr w:type="gramEnd"/>
-      <w:r>
-        <w:t>_created</w:t>
-      </w:r>
-      <w:proofErr w:type="spellEnd"/>
-      <w:r>
-        <w:t>": "2026-04-28T18:07:07.644Z"</w:t>
+        <w:t xml:space="preserve">  "date_created": "2026-04-28T18:07:07.644Z"</w:t>
       </w:r>
     </w:p>
     <w:p>
@@ -7005,19 +6671,11 @@
         </w:rPr>
         <w:t>“</w:t>
       </w:r>
-      <w:proofErr w:type="spellStart"/>
       <w:r>
         <w:rPr>
           <w:rStyle w:val="CodeExamplesChar"/>
         </w:rPr>
-        <w:t>alice_dev</w:t>
-      </w:r>
-      <w:proofErr w:type="spellEnd"/>
-      <w:r>
-        <w:rPr>
-          <w:rStyle w:val="CodeExamplesChar"/>
-        </w:rPr>
-        <w:t xml:space="preserve"> Updated Project 2</w:t>
+        <w:t>alice_dev Updated Project 2</w:t>
       </w:r>
       <w:r>
         <w:rPr>
@@ -7426,10 +7084,7 @@
         <w:t xml:space="preserve">Case 1 – 204: </w:t>
       </w:r>
       <w:r>
-        <w:t>Project</w:t>
-      </w:r>
-      <w:r>
-        <w:t xml:space="preserve"> deleted successfully</w:t>
+        <w:t>Project deleted successfully</w:t>
       </w:r>
     </w:p>
     <w:p>
@@ -7577,13 +7232,7 @@
         <w:t>Not Found:</w:t>
       </w:r>
       <w:r>
-        <w:t xml:space="preserve"> No </w:t>
-      </w:r>
-      <w:r>
-        <w:t>project</w:t>
-      </w:r>
-      <w:r>
-        <w:t xml:space="preserve"> with that id belongs to this user</w:t>
+        <w:t xml:space="preserve"> No project with that id belongs to this user</w:t>
       </w:r>
     </w:p>
     <w:p>
@@ -8068,56 +7717,1327 @@
     </w:p>
     <w:p>
       <w:pPr>
-        <w:spacing w:after="0"/>
-      </w:pPr>
-      <w:r>
-        <w:pict w14:anchorId="53CE88D7">
+        <w:rPr>
+          <w:rStyle w:val="Heading3Char"/>
+          <w:u w:val="single"/>
+        </w:rPr>
+      </w:pPr>
+    </w:p>
+    <w:p>
+      <w:pPr>
+        <w:spacing w:after="0"/>
+        <w:rPr>
+          <w:rStyle w:val="Heading3Char"/>
+          <w:u w:val="single"/>
+        </w:rPr>
+      </w:pPr>
+      <w:r>
+        <w:rPr>
+          <w:rStyle w:val="Heading3Char"/>
+          <w:u w:val="single"/>
+        </w:rPr>
+        <w:t>GET /api/projects/:id/files</w:t>
+      </w:r>
+    </w:p>
+    <w:p>
+      <w:pPr>
+        <w:spacing w:after="0"/>
+      </w:pPr>
+      <w:r>
+        <w:rPr>
+          <w:b/>
+          <w:bCs/>
+        </w:rPr>
+        <w:t>Access Control:</w:t>
+      </w:r>
+      <w:r>
+        <w:t> Authenticated User</w:t>
+      </w:r>
+      <w:r>
+        <w:br/>
+      </w:r>
+      <w:r>
+        <w:rPr>
+          <w:b/>
+          <w:bCs/>
+        </w:rPr>
+        <w:t>Case 1 –  200 OK</w:t>
+      </w:r>
+      <w:r>
+        <w:rPr>
+          <w:b/>
+          <w:bCs/>
+        </w:rPr>
+        <w:t>:</w:t>
+      </w:r>
+      <w:r>
+        <w:t> </w:t>
+      </w:r>
+    </w:p>
+    <w:p>
+      <w:pPr>
+        <w:pStyle w:val="ListParagraph"/>
+        <w:numPr>
+          <w:ilvl w:val="0"/>
+          <w:numId w:val="3"/>
+        </w:numPr>
+        <w:spacing w:after="0"/>
+        <w:rPr>
+          <w:b/>
+          <w:bCs/>
+        </w:rPr>
+      </w:pPr>
+      <w:r>
+        <w:t>Click </w:t>
+      </w:r>
+      <w:r>
+        <w:rPr>
+          <w:b/>
+          <w:bCs/>
+        </w:rPr>
+        <w:t>Try it out</w:t>
+      </w:r>
+    </w:p>
+    <w:p>
+      <w:pPr>
+        <w:pStyle w:val="ListParagraph"/>
+        <w:numPr>
+          <w:ilvl w:val="0"/>
+          <w:numId w:val="3"/>
+        </w:numPr>
+        <w:spacing w:after="0"/>
+        <w:rPr>
+          <w:b/>
+          <w:bCs/>
+        </w:rPr>
+      </w:pPr>
+      <w:r>
+        <w:t xml:space="preserve">Click </w:t>
+      </w:r>
+      <w:r>
+        <w:rPr>
+          <w:b/>
+          <w:bCs/>
+        </w:rPr>
+        <w:t>Execute</w:t>
+      </w:r>
+    </w:p>
+    <w:p>
+      <w:pPr>
+        <w:pStyle w:val="ListParagraph"/>
+        <w:numPr>
+          <w:ilvl w:val="0"/>
+          <w:numId w:val="3"/>
+        </w:numPr>
+        <w:spacing w:after="0"/>
+      </w:pPr>
+      <w:r>
+        <w:t>Expect</w:t>
+      </w:r>
+      <w:r>
+        <w:t>ed</w:t>
+      </w:r>
+      <w:r>
+        <w:t xml:space="preserve"> response: </w:t>
+      </w:r>
+    </w:p>
+    <w:p>
+      <w:pPr>
+        <w:pStyle w:val="ListParagraph"/>
+        <w:numPr>
+          <w:ilvl w:val="1"/>
+          <w:numId w:val="3"/>
+        </w:numPr>
+        <w:spacing w:after="0"/>
+      </w:pPr>
+      <w:r>
+        <w:t>Status: 200 OK</w:t>
+      </w:r>
+    </w:p>
+    <w:p>
+      <w:pPr>
+        <w:pStyle w:val="ListParagraph"/>
+        <w:numPr>
+          <w:ilvl w:val="1"/>
+          <w:numId w:val="3"/>
+        </w:numPr>
+        <w:spacing w:after="0"/>
+      </w:pPr>
+      <w:r>
+        <w:t xml:space="preserve">JSON: </w:t>
+      </w:r>
+    </w:p>
+    <w:p>
+      <w:pPr>
+        <w:pStyle w:val="CodeExamples"/>
+        <w:spacing w:after="0"/>
+        <w:ind w:left="1440"/>
+      </w:pPr>
+      <w:r>
+        <w:t>[</w:t>
+      </w:r>
+    </w:p>
+    <w:p>
+      <w:pPr>
+        <w:pStyle w:val="CodeExamples"/>
+        <w:spacing w:after="0"/>
+        <w:ind w:left="1440"/>
+      </w:pPr>
+      <w:r>
+        <w:t xml:space="preserve">  {</w:t>
+      </w:r>
+    </w:p>
+    <w:p>
+      <w:pPr>
+        <w:pStyle w:val="CodeExamples"/>
+        <w:spacing w:after="0"/>
+        <w:ind w:left="1440"/>
+      </w:pPr>
+      <w:r>
+        <w:t xml:space="preserve">    </w:t>
+      </w:r>
+      <w:r>
+        <w:t xml:space="preserve">"id": </w:t>
+      </w:r>
+      <w:r>
+        <w:t>4</w:t>
+      </w:r>
+      <w:r>
+        <w:t>,</w:t>
+      </w:r>
+    </w:p>
+    <w:p>
+      <w:pPr>
+        <w:pStyle w:val="CodeExamples"/>
+        <w:spacing w:after="0"/>
+        <w:ind w:left="1440"/>
+      </w:pPr>
+      <w:r>
+        <w:t xml:space="preserve">    "projectId": </w:t>
+      </w:r>
+      <w:r>
+        <w:t>2</w:t>
+      </w:r>
+      <w:r>
+        <w:t>,</w:t>
+      </w:r>
+    </w:p>
+    <w:p>
+      <w:pPr>
+        <w:pStyle w:val="CodeExamples"/>
+        <w:spacing w:after="0"/>
+        <w:ind w:left="1440"/>
+      </w:pPr>
+      <w:r>
+        <w:t xml:space="preserve">    "name": "</w:t>
+      </w:r>
+      <w:r>
+        <w:t>U1_P2_0_seed_1.docx</w:t>
+      </w:r>
+      <w:r>
+        <w:t>",</w:t>
+      </w:r>
+    </w:p>
+    <w:p>
+      <w:pPr>
+        <w:pStyle w:val="CodeExamples"/>
+        <w:spacing w:after="0"/>
+        <w:ind w:left="1440"/>
+      </w:pPr>
+      <w:r>
+        <w:t xml:space="preserve">    "size": </w:t>
+      </w:r>
+      <w:r>
+        <w:t>14499</w:t>
+      </w:r>
+      <w:r>
+        <w:t>,</w:t>
+      </w:r>
+    </w:p>
+    <w:p>
+      <w:pPr>
+        <w:pStyle w:val="CodeExamples"/>
+        <w:spacing w:after="0"/>
+        <w:ind w:left="1440"/>
+      </w:pPr>
+      <w:r>
+        <w:t xml:space="preserve">    "mimeType": "</w:t>
+      </w:r>
+      <w:r>
+        <w:t xml:space="preserve"> </w:t>
+      </w:r>
+      <w:r>
+        <w:t>application/vnd.openxmlformats-officedocument.wordprocessingml.document</w:t>
+      </w:r>
+      <w:r>
+        <w:t>"</w:t>
+      </w:r>
+      <w:r>
+        <w:t xml:space="preserve">  </w:t>
+      </w:r>
+    </w:p>
+    <w:p>
+      <w:pPr>
+        <w:pStyle w:val="CodeExamples"/>
+        <w:spacing w:after="0"/>
+        <w:ind w:left="1440"/>
+      </w:pPr>
+      <w:r>
+        <w:t xml:space="preserve">  </w:t>
+      </w:r>
+      <w:r>
+        <w:t>},</w:t>
+      </w:r>
+    </w:p>
+    <w:p>
+      <w:pPr>
+        <w:pStyle w:val="CodeExamples"/>
+        <w:spacing w:after="0"/>
+        <w:ind w:left="1440"/>
+      </w:pPr>
+      <w:r>
+        <w:t xml:space="preserve">  {</w:t>
+      </w:r>
+    </w:p>
+    <w:p>
+      <w:pPr>
+        <w:pStyle w:val="CodeExamples"/>
+        <w:spacing w:after="0"/>
+        <w:ind w:left="1440"/>
+      </w:pPr>
+      <w:r>
+        <w:t xml:space="preserve">    </w:t>
+      </w:r>
+      <w:r>
+        <w:t xml:space="preserve">"id": </w:t>
+      </w:r>
+      <w:r>
+        <w:t>5</w:t>
+      </w:r>
+      <w:r>
+        <w:t>,</w:t>
+      </w:r>
+    </w:p>
+    <w:p>
+      <w:pPr>
+        <w:pStyle w:val="CodeExamples"/>
+        <w:spacing w:after="0"/>
+        <w:ind w:left="1440"/>
+      </w:pPr>
+      <w:r>
+        <w:t xml:space="preserve">    "projectId": 2,</w:t>
+      </w:r>
+    </w:p>
+    <w:p>
+      <w:pPr>
+        <w:pStyle w:val="CodeExamples"/>
+        <w:spacing w:after="0"/>
+        <w:ind w:left="1440"/>
+      </w:pPr>
+      <w:r>
+        <w:t xml:space="preserve">    "name": "</w:t>
+      </w:r>
+      <w:r>
+        <w:t>U1_P2_</w:t>
+      </w:r>
+      <w:r>
+        <w:t>1</w:t>
+      </w:r>
+      <w:r>
+        <w:t>_seed_</w:t>
+      </w:r>
+      <w:r>
+        <w:t>2</w:t>
+      </w:r>
+      <w:r>
+        <w:t>.docx</w:t>
+      </w:r>
+      <w:r>
+        <w:t>",</w:t>
+      </w:r>
+    </w:p>
+    <w:p>
+      <w:pPr>
+        <w:pStyle w:val="CodeExamples"/>
+        <w:spacing w:after="0"/>
+        <w:ind w:left="1440"/>
+      </w:pPr>
+      <w:r>
+        <w:t xml:space="preserve">    "size": </w:t>
+      </w:r>
+      <w:r>
+        <w:t>33930</w:t>
+      </w:r>
+      <w:r>
+        <w:t>,</w:t>
+      </w:r>
+    </w:p>
+    <w:p>
+      <w:pPr>
+        <w:pStyle w:val="CodeExamples"/>
+        <w:spacing w:after="0"/>
+        <w:ind w:left="1440"/>
+      </w:pPr>
+      <w:r>
+        <w:t xml:space="preserve">    "mimeType": "</w:t>
+      </w:r>
+      <w:r>
+        <w:t>application/pdf</w:t>
+      </w:r>
+      <w:r>
+        <w:t>"</w:t>
+      </w:r>
+      <w:r>
+        <w:t xml:space="preserve">  </w:t>
+      </w:r>
+    </w:p>
+    <w:p>
+      <w:pPr>
+        <w:pStyle w:val="CodeExamples"/>
+        <w:spacing w:after="0"/>
+        <w:ind w:left="1440"/>
+      </w:pPr>
+      <w:r>
+        <w:t xml:space="preserve">  },</w:t>
+      </w:r>
+    </w:p>
+    <w:p>
+      <w:pPr>
+        <w:pStyle w:val="CodeExamples"/>
+        <w:spacing w:after="0"/>
+        <w:ind w:left="1440"/>
+      </w:pPr>
+      <w:r>
+        <w:lastRenderedPageBreak/>
+        <w:t xml:space="preserve">  </w:t>
+      </w:r>
+      <w:r>
+        <w:t>{</w:t>
+      </w:r>
+    </w:p>
+    <w:p>
+      <w:pPr>
+        <w:pStyle w:val="CodeExamples"/>
+        <w:spacing w:after="0"/>
+        <w:ind w:left="1440"/>
+      </w:pPr>
+      <w:r>
+        <w:t xml:space="preserve">    </w:t>
+      </w:r>
+      <w:r>
+        <w:t xml:space="preserve">"id": </w:t>
+      </w:r>
+      <w:r>
+        <w:t>6</w:t>
+      </w:r>
+      <w:r>
+        <w:t>,</w:t>
+      </w:r>
+    </w:p>
+    <w:p>
+      <w:pPr>
+        <w:pStyle w:val="CodeExamples"/>
+        <w:spacing w:after="0"/>
+        <w:ind w:left="1440"/>
+      </w:pPr>
+      <w:r>
+        <w:t xml:space="preserve">    "projectId": 2,</w:t>
+      </w:r>
+    </w:p>
+    <w:p>
+      <w:pPr>
+        <w:pStyle w:val="CodeExamples"/>
+        <w:spacing w:after="0"/>
+        <w:ind w:left="1440"/>
+      </w:pPr>
+      <w:r>
+        <w:t xml:space="preserve">    "name": "</w:t>
+      </w:r>
+      <w:r>
+        <w:t>U1_P2_</w:t>
+      </w:r>
+      <w:r>
+        <w:t>2</w:t>
+      </w:r>
+      <w:r>
+        <w:t>_seed_</w:t>
+      </w:r>
+      <w:r>
+        <w:t>3</w:t>
+      </w:r>
+      <w:r>
+        <w:t>.docx</w:t>
+      </w:r>
+      <w:r>
+        <w:t>",</w:t>
+      </w:r>
+    </w:p>
+    <w:p>
+      <w:pPr>
+        <w:pStyle w:val="CodeExamples"/>
+        <w:spacing w:after="0"/>
+        <w:ind w:left="1440"/>
+      </w:pPr>
+      <w:r>
+        <w:t xml:space="preserve">    "size": </w:t>
+      </w:r>
+      <w:r>
+        <w:t>276129</w:t>
+      </w:r>
+      <w:r>
+        <w:t>,</w:t>
+      </w:r>
+    </w:p>
+    <w:p>
+      <w:pPr>
+        <w:pStyle w:val="CodeExamples"/>
+        <w:spacing w:after="0"/>
+        <w:ind w:left="1440"/>
+      </w:pPr>
+      <w:r>
+        <w:t xml:space="preserve">    "mimeType": "</w:t>
+      </w:r>
+      <w:r>
+        <w:t>image/pdf</w:t>
+      </w:r>
+      <w:r>
+        <w:t>"</w:t>
+      </w:r>
+      <w:r>
+        <w:t xml:space="preserve">  </w:t>
+      </w:r>
+    </w:p>
+    <w:p>
+      <w:pPr>
+        <w:pStyle w:val="CodeExamples"/>
+        <w:spacing w:after="0"/>
+        <w:ind w:left="1440"/>
+      </w:pPr>
+      <w:r>
+        <w:t xml:space="preserve">  },</w:t>
+      </w:r>
+    </w:p>
+    <w:p>
+      <w:pPr>
+        <w:pStyle w:val="CodeExamples"/>
+        <w:spacing w:after="0"/>
+        <w:ind w:left="1440"/>
+      </w:pPr>
+      <w:r>
+        <w:t>]</w:t>
+      </w:r>
+    </w:p>
+    <w:p>
+      <w:pPr>
+        <w:spacing w:after="0"/>
+      </w:pPr>
+      <w:r>
+        <w:rPr>
+          <w:b/>
+          <w:bCs/>
+        </w:rPr>
+        <w:t xml:space="preserve">Case 2 –  </w:t>
+      </w:r>
+      <w:r>
+        <w:rPr>
+          <w:b/>
+          <w:bCs/>
+        </w:rPr>
+        <w:t>401 Unauthorized:</w:t>
+      </w:r>
+      <w:r>
+        <w:t> Remove the JWT from the Authorize feature.</w:t>
+      </w:r>
+    </w:p>
+    <w:p>
+      <w:pPr>
+        <w:pStyle w:val="ListParagraph"/>
+        <w:numPr>
+          <w:ilvl w:val="0"/>
+          <w:numId w:val="3"/>
+        </w:numPr>
+        <w:spacing w:after="0"/>
+      </w:pPr>
+      <w:r>
+        <w:t xml:space="preserve">Click the </w:t>
+      </w:r>
+      <w:r>
+        <w:rPr>
+          <w:b/>
+          <w:bCs/>
+        </w:rPr>
+        <w:t xml:space="preserve">Authorize </w:t>
+      </w:r>
+      <w:r>
+        <w:t xml:space="preserve">button at the top of the page and then press </w:t>
+      </w:r>
+      <w:r>
+        <w:rPr>
+          <w:b/>
+          <w:bCs/>
+        </w:rPr>
+        <w:t>logout</w:t>
+      </w:r>
+    </w:p>
+    <w:p>
+      <w:pPr>
+        <w:pStyle w:val="ListParagraph"/>
+        <w:numPr>
+          <w:ilvl w:val="0"/>
+          <w:numId w:val="3"/>
+        </w:numPr>
+        <w:spacing w:after="0"/>
+      </w:pPr>
+      <w:r>
+        <w:t>Click </w:t>
+      </w:r>
+      <w:r>
+        <w:rPr>
+          <w:b/>
+          <w:bCs/>
+        </w:rPr>
+        <w:t>Try it out</w:t>
+      </w:r>
+    </w:p>
+    <w:p>
+      <w:pPr>
+        <w:pStyle w:val="ListParagraph"/>
+        <w:numPr>
+          <w:ilvl w:val="0"/>
+          <w:numId w:val="3"/>
+        </w:numPr>
+        <w:spacing w:after="0"/>
+      </w:pPr>
+      <w:r>
+        <w:t>Expect</w:t>
+      </w:r>
+      <w:r>
+        <w:t>ed response:</w:t>
+      </w:r>
+    </w:p>
+    <w:p>
+      <w:pPr>
+        <w:pStyle w:val="ListParagraph"/>
+        <w:numPr>
+          <w:ilvl w:val="1"/>
+          <w:numId w:val="3"/>
+        </w:numPr>
+        <w:spacing w:after="0"/>
+      </w:pPr>
+      <w:r>
+        <w:t> </w:t>
+      </w:r>
+      <w:r>
+        <w:t xml:space="preserve">Status: </w:t>
+      </w:r>
+      <w:r>
+        <w:t>401 Unauthorized</w:t>
+      </w:r>
+      <w:r>
+        <w:t xml:space="preserve"> – Missing or invalid token</w:t>
+      </w:r>
+    </w:p>
+    <w:p>
+      <w:pPr>
+        <w:pStyle w:val="ListParagraph"/>
+        <w:numPr>
+          <w:ilvl w:val="1"/>
+          <w:numId w:val="3"/>
+        </w:numPr>
+        <w:spacing w:after="0"/>
+        <w:rPr>
+          <w:rStyle w:val="CodeExamplesChar"/>
+          <w:rFonts w:asciiTheme="minorHAnsi" w:hAnsiTheme="minorHAnsi"/>
+          <w:sz w:val="24"/>
+          <w:szCs w:val="24"/>
+        </w:rPr>
+      </w:pPr>
+      <w:r>
+        <w:t xml:space="preserve">JSON: </w:t>
+      </w:r>
+      <w:r>
+        <w:rPr>
+          <w:rStyle w:val="CodeExamplesChar"/>
+        </w:rPr>
+        <w:t>{ "error": "Not authenticated. Please provide a valid token."  }</w:t>
+      </w:r>
+    </w:p>
+    <w:p>
+      <w:pPr>
+        <w:rPr>
+          <w:rStyle w:val="Heading3Char"/>
+          <w:u w:val="single"/>
+        </w:rPr>
+      </w:pPr>
+    </w:p>
+    <w:p>
+      <w:pPr>
+        <w:spacing w:after="0"/>
+      </w:pPr>
+      <w:r>
+        <w:rPr>
+          <w:rStyle w:val="Heading3Char"/>
+          <w:u w:val="single"/>
+        </w:rPr>
+        <w:t>GET /api/projects/:id/files/download</w:t>
+      </w:r>
+      <w:r>
+        <w:br/>
+      </w:r>
+      <w:r>
+        <w:rPr>
+          <w:b/>
+          <w:bCs/>
+        </w:rPr>
+        <w:t>Access Control:</w:t>
+      </w:r>
+      <w:r>
+        <w:t> Owner of the Project</w:t>
+      </w:r>
+      <w:r>
+        <w:br/>
+      </w:r>
+      <w:r>
+        <w:rPr>
+          <w:b/>
+          <w:bCs/>
+        </w:rPr>
+        <w:t>Success Case:</w:t>
+      </w:r>
+      <w:r>
+        <w:t> </w:t>
+      </w:r>
+      <w:r>
+        <w:t>Use a project ID you own to download all uploaded files from the database related to that project.</w:t>
+      </w:r>
+    </w:p>
+    <w:p>
+      <w:pPr>
+        <w:pStyle w:val="ListParagraph"/>
+        <w:numPr>
+          <w:ilvl w:val="0"/>
+          <w:numId w:val="11"/>
+        </w:numPr>
+        <w:spacing w:after="0"/>
+      </w:pPr>
+      <w:r>
+        <w:t>Click </w:t>
+      </w:r>
+      <w:r>
+        <w:rPr>
+          <w:b/>
+          <w:bCs/>
+        </w:rPr>
+        <w:t>Try it out</w:t>
+      </w:r>
+      <w:r>
+        <w:t>.</w:t>
+      </w:r>
+    </w:p>
+    <w:p>
+      <w:pPr>
+        <w:pStyle w:val="ListParagraph"/>
+        <w:numPr>
+          <w:ilvl w:val="0"/>
+          <w:numId w:val="11"/>
+        </w:numPr>
+        <w:spacing w:after="0"/>
+      </w:pPr>
+      <w:r>
+        <w:t>Expect response: 200 OK and a link to download the project files as a .zip.</w:t>
+      </w:r>
+    </w:p>
+    <w:p>
+      <w:pPr>
+        <w:spacing w:after="0"/>
+        <w:rPr>
+          <w:rStyle w:val="Heading3Char"/>
+          <w:u w:val="single"/>
+        </w:rPr>
+      </w:pPr>
+    </w:p>
+    <w:p>
+      <w:pPr>
+        <w:spacing w:after="0"/>
+      </w:pPr>
+      <w:r>
+        <w:rPr>
+          <w:rStyle w:val="Heading3Char"/>
+          <w:u w:val="single"/>
+        </w:rPr>
+        <w:t>POST /api/projects/:id/files</w:t>
+      </w:r>
+      <w:r>
+        <w:br/>
+      </w:r>
+      <w:r>
+        <w:rPr>
+          <w:b/>
+          <w:bCs/>
+        </w:rPr>
+        <w:t>Access Control:</w:t>
+      </w:r>
+      <w:r>
+        <w:t> Owner of the Project</w:t>
+      </w:r>
+      <w:r>
+        <w:br/>
+      </w:r>
+      <w:r>
+        <w:rPr>
+          <w:b/>
+          <w:bCs/>
+        </w:rPr>
+        <w:t xml:space="preserve">Case 1 – 201 </w:t>
+      </w:r>
+      <w:r>
+        <w:rPr>
+          <w:b/>
+          <w:bCs/>
+        </w:rPr>
+        <w:t>:</w:t>
+      </w:r>
+      <w:r>
+        <w:t> Use a project ID you own. Upload a small image or text file.</w:t>
+      </w:r>
+    </w:p>
+    <w:p>
+      <w:pPr>
+        <w:pStyle w:val="ListParagraph"/>
+        <w:numPr>
+          <w:ilvl w:val="0"/>
+          <w:numId w:val="9"/>
+        </w:numPr>
+        <w:spacing w:after="0"/>
+        <w:rPr>
+          <w:b/>
+          <w:bCs/>
+        </w:rPr>
+      </w:pPr>
+      <w:r>
+        <w:t>Click </w:t>
+      </w:r>
+      <w:r>
+        <w:rPr>
+          <w:b/>
+          <w:bCs/>
+        </w:rPr>
+        <w:t>Try it out</w:t>
+      </w:r>
+    </w:p>
+    <w:p>
+      <w:pPr>
+        <w:pStyle w:val="ListParagraph"/>
+        <w:numPr>
+          <w:ilvl w:val="0"/>
+          <w:numId w:val="9"/>
+        </w:numPr>
+        <w:spacing w:after="0"/>
+      </w:pPr>
+      <w:r>
+        <w:t>Expect response: 201 Created.</w:t>
+      </w:r>
+    </w:p>
+    <w:p>
+      <w:pPr>
+        <w:spacing w:after="0"/>
+        <w:rPr>
+          <w:b/>
+          <w:bCs/>
+        </w:rPr>
+      </w:pPr>
+      <w:r>
+        <w:rPr>
+          <w:b/>
+          <w:bCs/>
+        </w:rPr>
+        <w:t xml:space="preserve">Case 2 </w:t>
+      </w:r>
+      <w:r>
+        <w:rPr>
+          <w:b/>
+          <w:bCs/>
+        </w:rPr>
+        <w:t>–</w:t>
+      </w:r>
+      <w:r>
+        <w:rPr>
+          <w:b/>
+          <w:bCs/>
+        </w:rPr>
+        <w:t xml:space="preserve"> </w:t>
+      </w:r>
+      <w:r>
+        <w:rPr>
+          <w:b/>
+          <w:bCs/>
+        </w:rPr>
+        <w:t xml:space="preserve">413 </w:t>
+      </w:r>
+      <w:r>
+        <w:rPr>
+          <w:b/>
+          <w:bCs/>
+        </w:rPr>
+        <w:t>Payload Too Large:</w:t>
+      </w:r>
+      <w:r>
+        <w:rPr>
+          <w:b/>
+          <w:bCs/>
+        </w:rPr>
+        <w:t xml:space="preserve"> </w:t>
+      </w:r>
+      <w:r>
+        <w:t>Attempt to upload a file larger than 10MB.</w:t>
+      </w:r>
+    </w:p>
+    <w:p>
+      <w:pPr>
+        <w:pStyle w:val="ListParagraph"/>
+        <w:numPr>
+          <w:ilvl w:val="0"/>
+          <w:numId w:val="10"/>
+        </w:numPr>
+        <w:spacing w:after="0"/>
+        <w:rPr>
+          <w:b/>
+          <w:bCs/>
+        </w:rPr>
+      </w:pPr>
+      <w:r>
+        <w:t>Click </w:t>
+      </w:r>
+      <w:r>
+        <w:rPr>
+          <w:b/>
+          <w:bCs/>
+        </w:rPr>
+        <w:t>Try it out</w:t>
+      </w:r>
+    </w:p>
+    <w:p>
+      <w:pPr>
+        <w:pStyle w:val="ListParagraph"/>
+        <w:numPr>
+          <w:ilvl w:val="0"/>
+          <w:numId w:val="10"/>
+        </w:numPr>
+        <w:spacing w:after="0"/>
+      </w:pPr>
+      <w:r>
+        <w:t>Expect 413 Payload Too Large.</w:t>
+      </w:r>
+    </w:p>
+    <w:p>
+      <w:pPr>
+        <w:spacing w:after="0"/>
+        <w:rPr>
+          <w:rStyle w:val="Heading3Char"/>
+          <w:u w:val="single"/>
+        </w:rPr>
+      </w:pPr>
+      <w:r>
+        <w:rPr>
+          <w:rStyle w:val="Heading3Char"/>
+          <w:u w:val="single"/>
+        </w:rPr>
+        <w:t>DELETE</w:t>
+      </w:r>
+      <w:r>
+        <w:rPr>
+          <w:rStyle w:val="Heading3Char"/>
+          <w:u w:val="single"/>
+        </w:rPr>
+        <w:t xml:space="preserve"> /api/projects</w:t>
+      </w:r>
+      <w:r>
+        <w:rPr>
+          <w:rStyle w:val="Heading3Char"/>
+          <w:u w:val="single"/>
+        </w:rPr>
+        <w:t>/files/:id</w:t>
+      </w:r>
+    </w:p>
+    <w:p/>
+    <w:p>
+      <w:pPr>
+        <w:spacing w:after="0"/>
+      </w:pPr>
+      <w:r>
+        <w:pict w14:anchorId="57357105">
+          <v:rect id="_x0000_i1028" style="width:0;height:.75pt" o:hralign="center" o:hrstd="t" o:hr="t" fillcolor="#a0a0a0" stroked="f"/>
+        </w:pict>
+      </w:r>
+    </w:p>
+    <w:p>
+      <w:pPr>
+        <w:pStyle w:val="Heading2"/>
+        <w:jc w:val="center"/>
+      </w:pPr>
+      <w:r>
+        <w:t>Materials &amp; Resources</w:t>
+      </w:r>
+    </w:p>
+    <w:p>
+      <w:pPr>
+        <w:spacing w:after="0"/>
+        <w:rPr>
+          <w:rStyle w:val="Heading3Char"/>
+          <w:u w:val="single"/>
+        </w:rPr>
+      </w:pPr>
+      <w:r>
+        <w:rPr>
+          <w:rStyle w:val="Heading3Char"/>
+          <w:u w:val="single"/>
+        </w:rPr>
+        <w:t>GET</w:t>
+      </w:r>
+      <w:r>
+        <w:rPr>
+          <w:rStyle w:val="Heading3Char"/>
+          <w:u w:val="single"/>
+        </w:rPr>
+        <w:t xml:space="preserve"> /api/projects</w:t>
+      </w:r>
+    </w:p>
+    <w:p>
+      <w:pPr>
+        <w:rPr>
+          <w:rStyle w:val="Heading2Char"/>
+          <w:u w:val="single"/>
+        </w:rPr>
+      </w:pPr>
+    </w:p>
+    <w:p>
+      <w:pPr>
+        <w:spacing w:after="0"/>
+      </w:pPr>
+      <w:r>
+        <w:rPr>
+          <w:rStyle w:val="Heading2Char"/>
+          <w:u w:val="single"/>
+        </w:rPr>
+        <w:t>POST /api/materials</w:t>
+      </w:r>
+      <w:r>
+        <w:br/>
+      </w:r>
+      <w:r>
+        <w:rPr>
+          <w:b/>
+          <w:bCs/>
+        </w:rPr>
+        <w:t>Access Control:</w:t>
+      </w:r>
+      <w:r>
+        <w:t> Authenticated User</w:t>
+      </w:r>
+      <w:r>
+        <w:br/>
+      </w:r>
+      <w:r>
+        <w:rPr>
+          <w:b/>
+          <w:bCs/>
+        </w:rPr>
+        <w:t>Success Case:</w:t>
+      </w:r>
+      <w:r>
+        <w:t> Provide a valid projectId you own and fill in all material fields.</w:t>
+      </w:r>
+    </w:p>
+    <w:p>
+      <w:pPr>
+        <w:pStyle w:val="ListParagraph"/>
+        <w:numPr>
+          <w:ilvl w:val="0"/>
+          <w:numId w:val="11"/>
+        </w:numPr>
+        <w:spacing w:after="0"/>
+      </w:pPr>
+      <w:r>
+        <w:t>Click </w:t>
+      </w:r>
+      <w:r>
+        <w:rPr>
+          <w:b/>
+          <w:bCs/>
+        </w:rPr>
+        <w:t>Try it out</w:t>
+      </w:r>
+    </w:p>
+    <w:p>
+      <w:pPr>
+        <w:pStyle w:val="ListParagraph"/>
+        <w:numPr>
+          <w:ilvl w:val="0"/>
+          <w:numId w:val="11"/>
+        </w:numPr>
+        <w:spacing w:after="0"/>
+      </w:pPr>
+      <w:r>
+        <w:t>Expect response: 201 Created.</w:t>
+      </w:r>
+    </w:p>
+    <w:p>
+      <w:pPr>
+        <w:spacing w:after="0"/>
+      </w:pPr>
+      <w:r>
+        <w:rPr>
+          <w:b/>
+          <w:bCs/>
+        </w:rPr>
+        <w:t>400 Bad Request:</w:t>
+      </w:r>
+      <w:r>
+        <w:t> Remove a required field like author or source.</w:t>
+      </w:r>
+    </w:p>
+    <w:p>
+      <w:pPr>
+        <w:pStyle w:val="ListParagraph"/>
+        <w:numPr>
+          <w:ilvl w:val="0"/>
+          <w:numId w:val="11"/>
+        </w:numPr>
+        <w:spacing w:after="0"/>
+      </w:pPr>
+      <w:r>
+        <w:lastRenderedPageBreak/>
+        <w:t>Click </w:t>
+      </w:r>
+      <w:r>
+        <w:rPr>
+          <w:b/>
+          <w:bCs/>
+        </w:rPr>
+        <w:t>Try it out</w:t>
+      </w:r>
+    </w:p>
+    <w:p>
+      <w:pPr>
+        <w:pStyle w:val="ListParagraph"/>
+        <w:numPr>
+          <w:ilvl w:val="0"/>
+          <w:numId w:val="11"/>
+        </w:numPr>
+        <w:spacing w:after="0"/>
+      </w:pPr>
+      <w:r>
+        <w:t>Expect 400 Bad Request.</w:t>
+      </w:r>
+    </w:p>
+    <w:p>
+      <w:pPr>
+        <w:spacing w:after="0"/>
+        <w:rPr>
+          <w:rStyle w:val="Heading3Char"/>
+          <w:u w:val="single"/>
+        </w:rPr>
+      </w:pPr>
+      <w:r>
+        <w:rPr>
+          <w:rStyle w:val="Heading3Char"/>
+          <w:u w:val="single"/>
+        </w:rPr>
+        <w:t>POST /api/</w:t>
+      </w:r>
+      <w:r>
+        <w:rPr>
+          <w:rStyle w:val="Heading3Char"/>
+          <w:u w:val="single"/>
+        </w:rPr>
+        <w:t>materials</w:t>
+      </w:r>
+      <w:r>
+        <w:rPr>
+          <w:rStyle w:val="Heading3Char"/>
+          <w:u w:val="single"/>
+        </w:rPr>
+        <w:t>/:projectId</w:t>
+      </w:r>
+    </w:p>
+    <w:p/>
+    <w:p>
+      <w:pPr>
+        <w:spacing w:after="0"/>
+      </w:pPr>
+      <w:r>
+        <w:rPr>
+          <w:rStyle w:val="Heading3Char"/>
+          <w:u w:val="single"/>
+        </w:rPr>
+        <w:t>DELETE /api/materials/:id</w:t>
+      </w:r>
+      <w:r>
+        <w:br/>
+      </w:r>
+      <w:r>
+        <w:rPr>
+          <w:b/>
+          <w:bCs/>
+        </w:rPr>
+        <w:t>Access Control:</w:t>
+      </w:r>
+      <w:r>
+        <w:t> Owner of the Material</w:t>
+      </w:r>
+      <w:r>
+        <w:br/>
+      </w:r>
+      <w:r>
+        <w:rPr>
+          <w:b/>
+          <w:bCs/>
+        </w:rPr>
+        <w:t>Success Case:</w:t>
+      </w:r>
+      <w:r>
+        <w:t> Provide a valid material ID.</w:t>
+      </w:r>
+    </w:p>
+    <w:p>
+      <w:pPr>
+        <w:pStyle w:val="ListParagraph"/>
+        <w:numPr>
+          <w:ilvl w:val="0"/>
+          <w:numId w:val="11"/>
+        </w:numPr>
+        <w:spacing w:after="0"/>
+      </w:pPr>
+      <w:r>
+        <w:t>Click </w:t>
+      </w:r>
+      <w:r>
+        <w:rPr>
+          <w:b/>
+          <w:bCs/>
+        </w:rPr>
+        <w:t>Try it out</w:t>
+      </w:r>
+    </w:p>
+    <w:p>
+      <w:pPr>
+        <w:pStyle w:val="ListParagraph"/>
+        <w:numPr>
+          <w:ilvl w:val="0"/>
+          <w:numId w:val="11"/>
+        </w:numPr>
+        <w:spacing w:after="0"/>
+      </w:pPr>
+      <w:r>
+        <w:t>Expect 204 No Content.</w:t>
+      </w:r>
+    </w:p>
+    <w:p>
+      <w:pPr>
+        <w:spacing w:after="0"/>
+      </w:pPr>
+      <w:r>
+        <w:rPr>
+          <w:b/>
+          <w:bCs/>
+        </w:rPr>
+        <w:t>404 Not Found:</w:t>
+      </w:r>
+      <w:r>
+        <w:t> Log in as a different user and attempt to delete this same ID.</w:t>
+      </w:r>
+    </w:p>
+    <w:p>
+      <w:pPr>
+        <w:pStyle w:val="ListParagraph"/>
+        <w:numPr>
+          <w:ilvl w:val="0"/>
+          <w:numId w:val="11"/>
+        </w:numPr>
+        <w:spacing w:after="0"/>
+      </w:pPr>
+      <w:r>
+        <w:t>Click </w:t>
+      </w:r>
+      <w:r>
+        <w:rPr>
+          <w:b/>
+          <w:bCs/>
+        </w:rPr>
+        <w:t>Try it out</w:t>
+      </w:r>
+    </w:p>
+    <w:p>
+      <w:pPr>
+        <w:pStyle w:val="ListParagraph"/>
+        <w:numPr>
+          <w:ilvl w:val="0"/>
+          <w:numId w:val="11"/>
+        </w:numPr>
+        <w:spacing w:after="0"/>
+      </w:pPr>
+      <w:r>
+        <w:t>Expect 404 Not Found.</w:t>
+      </w:r>
+    </w:p>
+    <w:p>
+      <w:pPr>
+        <w:spacing w:after="0"/>
+      </w:pPr>
+      <w:r>
+        <w:pict w14:anchorId="383DC381">
           <v:rect id="_x0000_i1029" style="width:0;height:.75pt" o:hralign="center" o:hrstd="t" o:hr="t" fillcolor="#a0a0a0" stroked="f"/>
         </w:pict>
       </w:r>
     </w:p>
     <w:p>
       <w:pPr>
+        <w:pStyle w:val="Heading2"/>
+        <w:jc w:val="center"/>
+      </w:pPr>
+      <w:r>
+        <w:t>Global Features</w:t>
+      </w:r>
+    </w:p>
+    <w:p>
+      <w:pPr>
+        <w:spacing w:after="0"/>
         <w:rPr>
           <w:rStyle w:val="Heading3Char"/>
           <w:u w:val="single"/>
         </w:rPr>
       </w:pPr>
-    </w:p>
-    <w:p>
-      <w:pPr>
-        <w:spacing w:after="0"/>
+      <w:r>
         <w:rPr>
           <w:rStyle w:val="Heading3Char"/>
           <w:u w:val="single"/>
         </w:rPr>
-      </w:pPr>
-      <w:r>
-        <w:rPr>
-          <w:rStyle w:val="Heading3Char"/>
-          <w:u w:val="single"/>
-        </w:rPr>
-        <w:t>GET /api/projects/:id/files</w:t>
-      </w:r>
-    </w:p>
-    <w:p>
-      <w:pPr>
-        <w:rPr>
-          <w:rStyle w:val="Heading3Char"/>
-          <w:u w:val="single"/>
-        </w:rPr>
-      </w:pPr>
-    </w:p>
-    <w:p>
-      <w:pPr>
-        <w:spacing w:after="0"/>
-      </w:pPr>
-      <w:r>
-        <w:rPr>
-          <w:rStyle w:val="Heading3Char"/>
-          <w:u w:val="single"/>
-        </w:rPr>
-        <w:t>GET /api/projects/:id/files/download</w:t>
+        <w:t>GET /api/ideas (or /api/projects)</w:t>
+      </w:r>
+    </w:p>
+    <w:p>
+      <w:pPr>
+        <w:spacing w:after="0"/>
+      </w:pPr>
+      <w:r>
+        <w:rPr>
+          <w:b/>
+          <w:bCs/>
+        </w:rPr>
+        <w:t>Access Control</w:t>
+      </w:r>
+      <w:r>
+        <w:rPr>
+          <w:b/>
+          <w:bCs/>
+        </w:rPr>
+        <w:t>:</w:t>
+      </w:r>
+      <w:r>
+        <w:t> </w:t>
+      </w:r>
+      <w:r>
+        <w:t>Only files associated with the currently authenticated user</w:t>
       </w:r>
       <w:r>
         <w:br/>
@@ -8127,26 +9047,10 @@
           <w:b/>
           <w:bCs/>
         </w:rPr>
-        <w:t>Access Control:</w:t>
-      </w:r>
-      <w:r>
-        <w:t> Owner of the Project</w:t>
-      </w:r>
-      <w:r>
-        <w:br/>
-      </w:r>
-      <w:r>
-        <w:rPr>
-          <w:b/>
-          <w:bCs/>
-        </w:rPr>
-        <w:t>Success Case:</w:t>
-      </w:r>
-      <w:r>
-        <w:t> </w:t>
-      </w:r>
-      <w:r>
-        <w:t>Use a project ID you own to download all uploaded files from the database related to that project.</w:t>
+        <w:t>Parameters:</w:t>
+      </w:r>
+      <w:r>
+        <w:t> Set limit=1 and offset=0.</w:t>
       </w:r>
     </w:p>
     <w:p>
@@ -8168,9 +9072,6 @@
         </w:rPr>
         <w:t>Try it out</w:t>
       </w:r>
-      <w:r>
-        <w:t>.</w:t>
-      </w:r>
     </w:p>
     <w:p>
       <w:pPr>
@@ -8182,654 +9083,7 @@
         <w:spacing w:after="0"/>
       </w:pPr>
       <w:r>
-        <w:t>Expect response: 200 OK and a link to download the project files as a .zip.</w:t>
-      </w:r>
-    </w:p>
-    <w:p>
-      <w:pPr>
-        <w:spacing w:after="0"/>
-        <w:rPr>
-          <w:rStyle w:val="Heading3Char"/>
-          <w:u w:val="single"/>
-        </w:rPr>
-      </w:pPr>
-    </w:p>
-    <w:p>
-      <w:pPr>
-        <w:spacing w:after="0"/>
-      </w:pPr>
-      <w:r>
-        <w:rPr>
-          <w:rStyle w:val="Heading3Char"/>
-          <w:u w:val="single"/>
-        </w:rPr>
-        <w:t>POST /api/projects/:id/files</w:t>
-      </w:r>
-      <w:r>
-        <w:br/>
-      </w:r>
-      <w:r>
-        <w:rPr>
-          <w:b/>
-          <w:bCs/>
-        </w:rPr>
-        <w:t>Access Control:</w:t>
-      </w:r>
-      <w:r>
-        <w:t> Owner of the Project</w:t>
-      </w:r>
-      <w:r>
-        <w:br/>
-      </w:r>
-      <w:r>
-        <w:rPr>
-          <w:b/>
-          <w:bCs/>
-        </w:rPr>
-        <w:t xml:space="preserve">Case 1 – 201 </w:t>
-      </w:r>
-      <w:r>
-        <w:rPr>
-          <w:b/>
-          <w:bCs/>
-        </w:rPr>
-        <w:t>:</w:t>
-      </w:r>
-      <w:r>
-        <w:t> Use a project ID you own. Upload a small image or text file.</w:t>
-      </w:r>
-    </w:p>
-    <w:p>
-      <w:pPr>
-        <w:pStyle w:val="ListParagraph"/>
-        <w:numPr>
-          <w:ilvl w:val="0"/>
-          <w:numId w:val="9"/>
-        </w:numPr>
-        <w:spacing w:after="0"/>
-        <w:rPr>
-          <w:b/>
-          <w:bCs/>
-        </w:rPr>
-      </w:pPr>
-      <w:r>
-        <w:t>Click </w:t>
-      </w:r>
-      <w:r>
-        <w:rPr>
-          <w:b/>
-          <w:bCs/>
-        </w:rPr>
-        <w:t>Try it out</w:t>
-      </w:r>
-    </w:p>
-    <w:p>
-      <w:pPr>
-        <w:pStyle w:val="ListParagraph"/>
-        <w:numPr>
-          <w:ilvl w:val="0"/>
-          <w:numId w:val="9"/>
-        </w:numPr>
-        <w:spacing w:after="0"/>
-      </w:pPr>
-      <w:r>
-        <w:t>Expect response: 201 Created.</w:t>
-      </w:r>
-    </w:p>
-    <w:p>
-      <w:pPr>
-        <w:spacing w:after="0"/>
-        <w:rPr>
-          <w:b/>
-          <w:bCs/>
-        </w:rPr>
-      </w:pPr>
-      <w:r>
-        <w:rPr>
-          <w:b/>
-          <w:bCs/>
-        </w:rPr>
-        <w:t xml:space="preserve">Case 2 </w:t>
-      </w:r>
-      <w:r>
-        <w:rPr>
-          <w:b/>
-          <w:bCs/>
-        </w:rPr>
-        <w:t>–</w:t>
-      </w:r>
-      <w:r>
-        <w:rPr>
-          <w:b/>
-          <w:bCs/>
-        </w:rPr>
-        <w:t xml:space="preserve"> </w:t>
-      </w:r>
-      <w:r>
-        <w:rPr>
-          <w:b/>
-          <w:bCs/>
-        </w:rPr>
-        <w:t xml:space="preserve">413 </w:t>
-      </w:r>
-      <w:r>
-        <w:rPr>
-          <w:b/>
-          <w:bCs/>
-        </w:rPr>
-        <w:t>Payload Too Large:</w:t>
-      </w:r>
-      <w:r>
-        <w:rPr>
-          <w:b/>
-          <w:bCs/>
-        </w:rPr>
-        <w:t xml:space="preserve"> </w:t>
-      </w:r>
-      <w:r>
-        <w:t>Attempt to upload a file larger than 10MB.</w:t>
-      </w:r>
-    </w:p>
-    <w:p>
-      <w:pPr>
-        <w:pStyle w:val="ListParagraph"/>
-        <w:numPr>
-          <w:ilvl w:val="0"/>
-          <w:numId w:val="10"/>
-        </w:numPr>
-        <w:spacing w:after="0"/>
-        <w:rPr>
-          <w:b/>
-          <w:bCs/>
-        </w:rPr>
-      </w:pPr>
-      <w:r>
-        <w:lastRenderedPageBreak/>
-        <w:t>Click </w:t>
-      </w:r>
-      <w:r>
-        <w:rPr>
-          <w:b/>
-          <w:bCs/>
-        </w:rPr>
-        <w:t>Try it out</w:t>
-      </w:r>
-    </w:p>
-    <w:p>
-      <w:pPr>
-        <w:pStyle w:val="ListParagraph"/>
-        <w:numPr>
-          <w:ilvl w:val="0"/>
-          <w:numId w:val="10"/>
-        </w:numPr>
-        <w:spacing w:after="0"/>
-      </w:pPr>
-      <w:r>
-        <w:t>Expect 413 Payload Too Large.</w:t>
-      </w:r>
-    </w:p>
-    <w:p>
-      <w:pPr>
-        <w:spacing w:after="0"/>
-        <w:rPr>
-          <w:rStyle w:val="Heading3Char"/>
-          <w:u w:val="single"/>
-        </w:rPr>
-      </w:pPr>
-      <w:r>
-        <w:rPr>
-          <w:rStyle w:val="Heading3Char"/>
-          <w:u w:val="single"/>
-        </w:rPr>
-        <w:t>DELETE</w:t>
-      </w:r>
-      <w:r>
-        <w:rPr>
-          <w:rStyle w:val="Heading3Char"/>
-          <w:u w:val="single"/>
-        </w:rPr>
-        <w:t xml:space="preserve"> /api/projects</w:t>
-      </w:r>
-      <w:r>
-        <w:rPr>
-          <w:rStyle w:val="Heading3Char"/>
-          <w:u w:val="single"/>
-        </w:rPr>
-        <w:t>/files/:id</w:t>
-      </w:r>
-    </w:p>
-    <w:p/>
-    <w:p>
-      <w:pPr>
-        <w:spacing w:after="0"/>
-      </w:pPr>
-      <w:r>
-        <w:pict w14:anchorId="57357105">
-          <v:rect id="_x0000_i1027" style="width:0;height:.75pt" o:hralign="center" o:hrstd="t" o:hr="t" fillcolor="#a0a0a0" stroked="f"/>
-        </w:pict>
-      </w:r>
-    </w:p>
-    <w:p>
-      <w:pPr>
-        <w:pStyle w:val="Heading2"/>
-        <w:jc w:val="center"/>
-      </w:pPr>
-      <w:r>
-        <w:t>Materials &amp; Resources</w:t>
-      </w:r>
-    </w:p>
-    <w:p>
-      <w:pPr>
-        <w:spacing w:after="0"/>
-        <w:rPr>
-          <w:rStyle w:val="Heading3Char"/>
-          <w:u w:val="single"/>
-        </w:rPr>
-      </w:pPr>
-      <w:r>
-        <w:rPr>
-          <w:rStyle w:val="Heading3Char"/>
-          <w:u w:val="single"/>
-        </w:rPr>
-        <w:t>GET</w:t>
-      </w:r>
-      <w:r>
-        <w:rPr>
-          <w:rStyle w:val="Heading3Char"/>
-          <w:u w:val="single"/>
-        </w:rPr>
-        <w:t xml:space="preserve"> /api/projects</w:t>
-      </w:r>
-    </w:p>
-    <w:p>
-      <w:pPr>
-        <w:rPr>
-          <w:rStyle w:val="Heading2Char"/>
-          <w:u w:val="single"/>
-        </w:rPr>
-      </w:pPr>
-    </w:p>
-    <w:p>
-      <w:pPr>
-        <w:spacing w:after="0"/>
-      </w:pPr>
-      <w:r>
-        <w:rPr>
-          <w:rStyle w:val="Heading2Char"/>
-          <w:u w:val="single"/>
-        </w:rPr>
-        <w:t>POST /api/materials</w:t>
-      </w:r>
-      <w:r>
-        <w:br/>
-      </w:r>
-      <w:r>
-        <w:rPr>
-          <w:b/>
-          <w:bCs/>
-        </w:rPr>
-        <w:t>Access Control:</w:t>
-      </w:r>
-      <w:r>
-        <w:t> Authenticated User</w:t>
-      </w:r>
-      <w:r>
-        <w:br/>
-      </w:r>
-      <w:r>
-        <w:rPr>
-          <w:b/>
-          <w:bCs/>
-        </w:rPr>
-        <w:t>Success Case:</w:t>
-      </w:r>
-      <w:r>
-        <w:t> Provide a valid projectId you own and fill in all material fields.</w:t>
-      </w:r>
-    </w:p>
-    <w:p>
-      <w:pPr>
-        <w:pStyle w:val="ListParagraph"/>
-        <w:numPr>
-          <w:ilvl w:val="0"/>
-          <w:numId w:val="11"/>
-        </w:numPr>
-        <w:spacing w:after="0"/>
-      </w:pPr>
-      <w:r>
-        <w:t>Click </w:t>
-      </w:r>
-      <w:r>
-        <w:rPr>
-          <w:b/>
-          <w:bCs/>
-        </w:rPr>
-        <w:t>Try it out</w:t>
-      </w:r>
-    </w:p>
-    <w:p>
-      <w:pPr>
-        <w:pStyle w:val="ListParagraph"/>
-        <w:numPr>
-          <w:ilvl w:val="0"/>
-          <w:numId w:val="11"/>
-        </w:numPr>
-        <w:spacing w:after="0"/>
-      </w:pPr>
-      <w:r>
-        <w:t>Expect response: 201 Created.</w:t>
-      </w:r>
-    </w:p>
-    <w:p>
-      <w:pPr>
-        <w:spacing w:after="0"/>
-      </w:pPr>
-      <w:r>
-        <w:rPr>
-          <w:b/>
-          <w:bCs/>
-        </w:rPr>
-        <w:t>400 Bad Request:</w:t>
-      </w:r>
-      <w:r>
-        <w:t> Remove a required field like author or source.</w:t>
-      </w:r>
-    </w:p>
-    <w:p>
-      <w:pPr>
-        <w:pStyle w:val="ListParagraph"/>
-        <w:numPr>
-          <w:ilvl w:val="0"/>
-          <w:numId w:val="11"/>
-        </w:numPr>
-        <w:spacing w:after="0"/>
-      </w:pPr>
-      <w:r>
-        <w:t>Click </w:t>
-      </w:r>
-      <w:r>
-        <w:rPr>
-          <w:b/>
-          <w:bCs/>
-        </w:rPr>
-        <w:t>Try it out</w:t>
-      </w:r>
-    </w:p>
-    <w:p>
-      <w:pPr>
-        <w:pStyle w:val="ListParagraph"/>
-        <w:numPr>
-          <w:ilvl w:val="0"/>
-          <w:numId w:val="11"/>
-        </w:numPr>
-        <w:spacing w:after="0"/>
-      </w:pPr>
-      <w:r>
-        <w:t>Expect 400 Bad Request.</w:t>
-      </w:r>
-    </w:p>
-    <w:p>
-      <w:pPr>
-        <w:spacing w:after="0"/>
-        <w:rPr>
-          <w:rStyle w:val="Heading3Char"/>
-          <w:u w:val="single"/>
-        </w:rPr>
-      </w:pPr>
-      <w:r>
-        <w:rPr>
-          <w:rStyle w:val="Heading3Char"/>
-          <w:u w:val="single"/>
-        </w:rPr>
-        <w:t>POST /api/</w:t>
-      </w:r>
-      <w:r>
-        <w:rPr>
-          <w:rStyle w:val="Heading3Char"/>
-          <w:u w:val="single"/>
-        </w:rPr>
-        <w:t>materials</w:t>
-      </w:r>
-      <w:r>
-        <w:rPr>
-          <w:rStyle w:val="Heading3Char"/>
-          <w:u w:val="single"/>
-        </w:rPr>
-        <w:t>/:projectId</w:t>
-      </w:r>
-    </w:p>
-    <w:p/>
-    <w:p>
-      <w:pPr>
-        <w:spacing w:after="0"/>
-      </w:pPr>
-      <w:r>
-        <w:rPr>
-          <w:rStyle w:val="Heading3Char"/>
-          <w:u w:val="single"/>
-        </w:rPr>
-        <w:t>DELETE /api/materials/:id</w:t>
-      </w:r>
-      <w:r>
-        <w:br/>
-      </w:r>
-      <w:r>
-        <w:rPr>
-          <w:b/>
-          <w:bCs/>
-        </w:rPr>
-        <w:t>Access Control:</w:t>
-      </w:r>
-      <w:r>
-        <w:t> Owner of the Material</w:t>
-      </w:r>
-      <w:r>
-        <w:br/>
-      </w:r>
-      <w:r>
-        <w:rPr>
-          <w:b/>
-          <w:bCs/>
-        </w:rPr>
-        <w:t>Success Case:</w:t>
-      </w:r>
-      <w:r>
-        <w:t> Provide a valid material ID.</w:t>
-      </w:r>
-    </w:p>
-    <w:p>
-      <w:pPr>
-        <w:pStyle w:val="ListParagraph"/>
-        <w:numPr>
-          <w:ilvl w:val="0"/>
-          <w:numId w:val="11"/>
-        </w:numPr>
-        <w:spacing w:after="0"/>
-      </w:pPr>
-      <w:r>
-        <w:t>Click </w:t>
-      </w:r>
-      <w:r>
-        <w:rPr>
-          <w:b/>
-          <w:bCs/>
-        </w:rPr>
-        <w:t>Try it out</w:t>
-      </w:r>
-    </w:p>
-    <w:p>
-      <w:pPr>
-        <w:pStyle w:val="ListParagraph"/>
-        <w:numPr>
-          <w:ilvl w:val="0"/>
-          <w:numId w:val="11"/>
-        </w:numPr>
-        <w:spacing w:after="0"/>
-      </w:pPr>
-      <w:r>
-        <w:t>Expect 204 No Content.</w:t>
-      </w:r>
-    </w:p>
-    <w:p>
-      <w:pPr>
-        <w:spacing w:after="0"/>
-      </w:pPr>
-      <w:r>
-        <w:rPr>
-          <w:b/>
-          <w:bCs/>
-        </w:rPr>
-        <w:t>404 Not Found:</w:t>
-      </w:r>
-      <w:r>
-        <w:t> Log in as a different user and attempt to delete this same ID.</w:t>
-      </w:r>
-    </w:p>
-    <w:p>
-      <w:pPr>
-        <w:pStyle w:val="ListParagraph"/>
-        <w:numPr>
-          <w:ilvl w:val="0"/>
-          <w:numId w:val="11"/>
-        </w:numPr>
-        <w:spacing w:after="0"/>
-      </w:pPr>
-      <w:r>
-        <w:t>Click </w:t>
-      </w:r>
-      <w:r>
-        <w:rPr>
-          <w:b/>
-          <w:bCs/>
-        </w:rPr>
-        <w:t>Try it out</w:t>
-      </w:r>
-    </w:p>
-    <w:p>
-      <w:pPr>
-        <w:pStyle w:val="ListParagraph"/>
-        <w:numPr>
-          <w:ilvl w:val="0"/>
-          <w:numId w:val="11"/>
-        </w:numPr>
-        <w:spacing w:after="0"/>
-      </w:pPr>
-      <w:r>
-        <w:t>Expect 404 Not Found.</w:t>
-      </w:r>
-    </w:p>
-    <w:p>
-      <w:pPr>
-        <w:spacing w:after="0"/>
-      </w:pPr>
-      <w:r>
-        <w:pict w14:anchorId="383DC381">
-          <v:rect id="_x0000_i1028" style="width:0;height:.75pt" o:hralign="center" o:hrstd="t" o:hr="t" fillcolor="#a0a0a0" stroked="f"/>
-        </w:pict>
-      </w:r>
-    </w:p>
-    <w:p>
-      <w:pPr>
-        <w:pStyle w:val="Heading2"/>
-        <w:jc w:val="center"/>
-      </w:pPr>
-      <w:r>
-        <w:t>Global Features</w:t>
-      </w:r>
-    </w:p>
-    <w:p>
-      <w:pPr>
-        <w:spacing w:after="0"/>
-        <w:rPr>
-          <w:rStyle w:val="Heading3Char"/>
-          <w:u w:val="single"/>
-        </w:rPr>
-      </w:pPr>
-      <w:r>
-        <w:rPr>
-          <w:rStyle w:val="Heading3Char"/>
-          <w:u w:val="single"/>
-        </w:rPr>
-        <w:t>GET /api/ideas (or /api/projects)</w:t>
-      </w:r>
-    </w:p>
-    <w:p>
-      <w:pPr>
-        <w:spacing w:after="0"/>
-      </w:pPr>
-      <w:r>
-        <w:rPr>
-          <w:b/>
-          <w:bCs/>
-        </w:rPr>
-        <w:t>Access Control</w:t>
-      </w:r>
-      <w:r>
-        <w:rPr>
-          <w:b/>
-          <w:bCs/>
-        </w:rPr>
-        <w:t>:</w:t>
-      </w:r>
-      <w:r>
-        <w:t> </w:t>
-      </w:r>
-      <w:r>
-        <w:t>Only files associated with the currently authenticated user</w:t>
-      </w:r>
-      <w:r>
-        <w:br/>
-      </w:r>
-      <w:r>
-        <w:rPr>
-          <w:b/>
-          <w:bCs/>
-        </w:rPr>
-        <w:t>Parameters:</w:t>
-      </w:r>
-      <w:r>
-        <w:t> Set limit=1 and offset=0.</w:t>
-      </w:r>
-    </w:p>
-    <w:p>
-      <w:pPr>
-        <w:pStyle w:val="ListParagraph"/>
-        <w:numPr>
-          <w:ilvl w:val="0"/>
-          <w:numId w:val="11"/>
-        </w:numPr>
-        <w:spacing w:after="0"/>
-      </w:pPr>
-      <w:r>
-        <w:t>Click </w:t>
-      </w:r>
-      <w:r>
-        <w:rPr>
-          <w:b/>
-          <w:bCs/>
-        </w:rPr>
-        <w:t>Try it out</w:t>
-      </w:r>
-    </w:p>
-    <w:p>
-      <w:pPr>
-        <w:pStyle w:val="ListParagraph"/>
-        <w:numPr>
-          <w:ilvl w:val="0"/>
-          <w:numId w:val="11"/>
-        </w:numPr>
-        <w:spacing w:after="0"/>
-      </w:pPr>
-      <w:r>
-        <w:t xml:space="preserve">Expect response: 200 OK with only one item </w:t>
-      </w:r>
-      <w:proofErr w:type="gramStart"/>
-      <w:r>
-        <w:t>in</w:t>
-      </w:r>
-      <w:proofErr w:type="gramEnd"/>
-      <w:r>
-        <w:t xml:space="preserve"> the list.</w:t>
+        <w:t>Expect response: 200 OK with only one item in the list.</w:t>
       </w:r>
     </w:p>
     <w:p>
@@ -10777,7 +11031,6 @@
   <w:style w:type="character" w:default="1" w:styleId="DefaultParagraphFont">
     <w:name w:val="Default Paragraph Font"/>
     <w:uiPriority w:val="1"/>
-    <w:semiHidden/>
     <w:unhideWhenUsed/>
   </w:style>
   <w:style w:type="table" w:default="1" w:styleId="TableNormal">

</xml_diff>

<commit_message>
Converted my testing plan to a pdf
</commit_message>
<xml_diff>
--- a/docs/Testing/Testing.docx
+++ b/docs/Testing/Testing.docx
@@ -4,47 +4,129 @@
   <w:body>
     <w:p>
       <w:pPr>
+        <w:pStyle w:val="Heading1"/>
+        <w:rPr>
+          <w:u w:val="single"/>
+        </w:rPr>
+      </w:pPr>
+      <w:r>
+        <w:rPr>
+          <w:u w:val="single"/>
+        </w:rPr>
+        <w:t>Important Links</w:t>
+      </w:r>
+    </w:p>
+    <w:p>
+      <w:r>
+        <w:t>Public Repositor</w:t>
+      </w:r>
+      <w:r>
+        <w:t>ies</w:t>
+      </w:r>
+      <w:r>
+        <w:t xml:space="preserve"> (they are the same</w:t>
+      </w:r>
+      <w:r>
+        <w:t>)</w:t>
+      </w:r>
+      <w:r>
+        <w:t xml:space="preserve">: </w:t>
+      </w:r>
+    </w:p>
+    <w:p>
+      <w:pPr>
+        <w:ind w:firstLine="720"/>
+      </w:pPr>
+      <w:r>
+        <w:t xml:space="preserve">GitHub: </w:t>
+      </w:r>
+      <w:hyperlink r:id="rId5" w:history="1">
+        <w:r>
+          <w:rPr>
+            <w:rStyle w:val="Hyperlink"/>
+          </w:rPr>
+          <w:t>https://github.com/LewisPrice-Rapturate/Idea_Tracker_API.git</w:t>
+        </w:r>
+      </w:hyperlink>
+    </w:p>
+    <w:p>
+      <w:pPr>
+        <w:ind w:firstLine="720"/>
+      </w:pPr>
+      <w:r>
+        <w:t xml:space="preserve">Git.lewispricedev.com: </w:t>
+      </w:r>
+      <w:hyperlink r:id="rId6" w:history="1">
+        <w:r>
+          <w:rPr>
+            <w:rStyle w:val="Hyperlink"/>
+          </w:rPr>
+          <w:t>https://git.lewispricedev.com/Rapturate/Idea_Tracker_API.git</w:t>
+        </w:r>
+      </w:hyperlink>
+      <w:r>
+        <w:t xml:space="preserve"> </w:t>
+      </w:r>
+    </w:p>
+    <w:p>
+      <w:r>
+        <w:t xml:space="preserve">Live API on Render: </w:t>
+      </w:r>
+      <w:hyperlink r:id="rId7" w:history="1">
+        <w:r>
+          <w:rPr>
+            <w:rStyle w:val="Hyperlink"/>
+          </w:rPr>
+          <w:t>https://idea-tracker-api.onrender.com/</w:t>
+        </w:r>
+      </w:hyperlink>
+      <w:r>
+        <w:t xml:space="preserve"> </w:t>
+      </w:r>
+    </w:p>
+    <w:p>
+      <w:r>
+        <w:t xml:space="preserve">Live API documentation: </w:t>
+      </w:r>
+      <w:hyperlink r:id="rId8" w:history="1">
+        <w:r>
+          <w:rPr>
+            <w:rStyle w:val="Hyperlink"/>
+          </w:rPr>
+          <w:t>https://idea-tracker-api.onrender.com/api-docs</w:t>
+        </w:r>
+      </w:hyperlink>
+      <w:r>
+        <w:t xml:space="preserve"> </w:t>
+      </w:r>
+    </w:p>
+    <w:p>
+      <w:pPr>
+        <w:pStyle w:val="Heading1"/>
+        <w:rPr>
+          <w:u w:val="single"/>
+        </w:rPr>
+      </w:pPr>
+      <w:r>
+        <w:rPr>
+          <w:u w:val="single"/>
+        </w:rPr>
+        <w:t xml:space="preserve">Testing </w:t>
+      </w:r>
+      <w:r>
+        <w:rPr>
+          <w:u w:val="single"/>
+        </w:rPr>
+        <w:t>Plan</w:t>
+      </w:r>
+    </w:p>
+    <w:p>
+      <w:pPr>
         <w:pStyle w:val="Heading2"/>
         <w:spacing w:before="0" w:after="0"/>
         <w:jc w:val="center"/>
       </w:pPr>
       <w:r>
-        <w:t>Important Links</w:t>
-      </w:r>
-    </w:p>
-    <w:p>
-      <w:r>
-        <w:t xml:space="preserve">Public Repository: </w:t>
-      </w:r>
-    </w:p>
-    <w:p>
-      <w:pPr>
-        <w:pStyle w:val="Heading2"/>
-        <w:spacing w:before="0" w:after="0"/>
-        <w:jc w:val="center"/>
-      </w:pPr>
-    </w:p>
-    <w:p>
-      <w:pPr>
-        <w:pStyle w:val="Heading2"/>
-        <w:spacing w:before="0" w:after="0"/>
-        <w:jc w:val="center"/>
-      </w:pPr>
-    </w:p>
-    <w:p>
-      <w:pPr>
-        <w:pStyle w:val="Heading2"/>
-        <w:spacing w:before="0" w:after="0"/>
-        <w:jc w:val="center"/>
-      </w:pPr>
-    </w:p>
-    <w:p>
-      <w:pPr>
-        <w:pStyle w:val="Heading2"/>
-        <w:spacing w:before="0" w:after="0"/>
-        <w:jc w:val="center"/>
-      </w:pPr>
-      <w:r>
         <w:t>Authentication Endpoints</w:t>
       </w:r>
     </w:p>
@@ -765,6 +847,7 @@
         <w:spacing w:after="0"/>
       </w:pPr>
       <w:r>
+        <w:lastRenderedPageBreak/>
         <w:t xml:space="preserve">Click </w:t>
       </w:r>
       <w:r>
@@ -909,7 +992,6 @@
         <w:spacing w:after="0"/>
       </w:pPr>
       <w:r>
-        <w:lastRenderedPageBreak/>
         <w:t>Click </w:t>
       </w:r>
       <w:r>
@@ -1730,6 +1812,7 @@
         <w:spacing w:after="0"/>
       </w:pPr>
       <w:r>
+        <w:lastRenderedPageBreak/>
         <w:t xml:space="preserve">Click the </w:t>
       </w:r>
       <w:r>
@@ -1854,7 +1937,6 @@
           <w:rStyle w:val="Heading3Char"/>
           <w:u w:val="single"/>
         </w:rPr>
-        <w:lastRenderedPageBreak/>
         <w:t>POST</w:t>
       </w:r>
       <w:r>
@@ -2655,7 +2737,6 @@
         </w:rPr>
       </w:pPr>
       <w:r>
-        <w:lastRenderedPageBreak/>
         <w:t xml:space="preserve">Click </w:t>
       </w:r>
       <w:r>
@@ -3469,6 +3550,7 @@
         </w:rPr>
       </w:pPr>
       <w:r>
+        <w:lastRenderedPageBreak/>
         <w:t xml:space="preserve">Note that this returns 404 instead of </w:t>
       </w:r>
       <w:r>
@@ -3652,7 +3734,6 @@
         <w:spacing w:after="0"/>
       </w:pPr>
       <w:r>
-        <w:lastRenderedPageBreak/>
         <w:t>Click </w:t>
       </w:r>
       <w:r>
@@ -4453,6 +4534,7 @@
         <w:jc w:val="center"/>
       </w:pPr>
       <w:r>
+        <w:lastRenderedPageBreak/>
         <w:t>Project &amp; File Management</w:t>
       </w:r>
     </w:p>
@@ -4566,7 +4648,6 @@
         <w:spacing w:after="0"/>
       </w:pPr>
       <w:r>
-        <w:lastRenderedPageBreak/>
         <w:t>Expect</w:t>
       </w:r>
       <w:r>
@@ -5313,6 +5394,7 @@
         </w:rPr>
       </w:pPr>
       <w:r>
+        <w:lastRenderedPageBreak/>
         <w:t>}</w:t>
       </w:r>
       <w:r>
@@ -5430,7 +5512,6 @@
         <w:spacing w:after="0"/>
       </w:pPr>
       <w:r>
-        <w:lastRenderedPageBreak/>
         <w:t>Status: 400</w:t>
       </w:r>
     </w:p>
@@ -6186,6 +6267,7 @@
         </w:rPr>
       </w:pPr>
       <w:r>
+        <w:lastRenderedPageBreak/>
         <w:t xml:space="preserve">JSON: </w:t>
       </w:r>
       <w:r>
@@ -6362,7 +6444,6 @@
         </w:rPr>
       </w:pPr>
       <w:r>
-        <w:lastRenderedPageBreak/>
         <w:t xml:space="preserve">Click </w:t>
       </w:r>
       <w:r>
@@ -7153,6 +7234,7 @@
         <w:spacing w:after="0"/>
       </w:pPr>
       <w:r>
+        <w:lastRenderedPageBreak/>
         <w:t xml:space="preserve">JSON: </w:t>
       </w:r>
       <w:r>
@@ -8115,6 +8197,7 @@
         </w:rPr>
       </w:pPr>
       <w:r>
+        <w:lastRenderedPageBreak/>
         <w:t xml:space="preserve">Click </w:t>
       </w:r>
       <w:r>
@@ -8248,7 +8331,6 @@
         <w:ind w:left="1440"/>
       </w:pPr>
       <w:r>
-        <w:lastRenderedPageBreak/>
         <w:t xml:space="preserve">    "size": </w:t>
       </w:r>
       <w:r>
@@ -9059,6 +9141,7 @@
         </w:rPr>
       </w:pPr>
       <w:r>
+        <w:lastRenderedPageBreak/>
         <w:t xml:space="preserve">Click </w:t>
       </w:r>
       <w:r>
@@ -9140,7 +9223,6 @@
           <w:rStyle w:val="Heading3Char"/>
           <w:u w:val="single"/>
         </w:rPr>
-        <w:lastRenderedPageBreak/>
         <w:t>POST /api/projects/:id/files</w:t>
       </w:r>
       <w:r>
@@ -10004,6 +10086,7 @@
         <w:spacing w:after="0"/>
       </w:pPr>
       <w:r>
+        <w:lastRenderedPageBreak/>
         <w:pict w14:anchorId="57357105">
           <v:rect id="_x0000_i1027" style="width:0;height:.75pt" o:hralign="center" o:hrstd="t" o:hr="t" fillcolor="#a0a0a0" stroked="f"/>
         </w:pict>
@@ -10057,7 +10140,6 @@
           <w:b/>
           <w:bCs/>
         </w:rPr>
-        <w:lastRenderedPageBreak/>
         <w:t>Access Control:</w:t>
       </w:r>
       <w:r>
@@ -10784,28 +10866,7 @@
           <w:rStyle w:val="Heading3Char"/>
           <w:u w:val="single"/>
         </w:rPr>
-        <w:t>materials</w:t>
-      </w:r>
-      <w:r>
-        <w:rPr>
-          <w:rStyle w:val="Heading3Char"/>
-          <w:u w:val="single"/>
-        </w:rPr>
-        <w:t>/:</w:t>
-      </w:r>
-      <w:r>
-        <w:rPr>
-          <w:rStyle w:val="Heading3Char"/>
-          <w:u w:val="single"/>
-        </w:rPr>
-        <w:t>projectI</w:t>
-      </w:r>
-      <w:r>
-        <w:rPr>
-          <w:rStyle w:val="Heading3Char"/>
-          <w:u w:val="single"/>
-        </w:rPr>
-        <w:t>d</w:t>
+        <w:t>materials/:projectId</w:t>
       </w:r>
     </w:p>
     <w:p>
@@ -11081,6 +11142,7 @@
           <w:sz w:val="16"/>
           <w:szCs w:val="20"/>
         </w:rPr>
+        <w:lastRenderedPageBreak/>
         <w:t xml:space="preserve">    "source": "Source 1",</w:t>
       </w:r>
     </w:p>
@@ -11195,7 +11257,6 @@
           <w:sz w:val="16"/>
           <w:szCs w:val="20"/>
         </w:rPr>
-        <w:lastRenderedPageBreak/>
         <w:t xml:space="preserve">    "id": 3,</w:t>
       </w:r>
     </w:p>
@@ -11806,35 +11867,7 @@
           <w:b/>
           <w:bCs/>
         </w:rPr>
-        <w:t>Case 1 – 201</w:t>
-      </w:r>
-      <w:r>
-        <w:rPr>
-          <w:b/>
-          <w:bCs/>
-        </w:rPr>
-        <w:t>:</w:t>
-      </w:r>
-      <w:r>
-        <w:rPr>
-          <w:b/>
-          <w:bCs/>
-        </w:rPr>
-        <w:t xml:space="preserve"> </w:t>
-      </w:r>
-      <w:r>
-        <w:rPr>
-          <w:b/>
-          <w:bCs/>
-        </w:rPr>
-        <w:t>Material</w:t>
-      </w:r>
-      <w:r>
-        <w:rPr>
-          <w:b/>
-          <w:bCs/>
-        </w:rPr>
-        <w:t xml:space="preserve"> Created Successfully </w:t>
+        <w:t xml:space="preserve">Case 1 – 201: Material Created Successfully </w:t>
       </w:r>
       <w:r>
         <w:t> </w:t>
@@ -12050,6 +12083,7 @@
         <w:spacing w:after="0"/>
       </w:pPr>
       <w:r>
+        <w:lastRenderedPageBreak/>
         <w:t>Go through the login process again.</w:t>
       </w:r>
     </w:p>
@@ -12116,7 +12150,6 @@
         <w:spacing w:after="0"/>
       </w:pPr>
       <w:r>
-        <w:lastRenderedPageBreak/>
         <w:t>Expected response:</w:t>
       </w:r>
     </w:p>
@@ -12965,10 +12998,7 @@
         <w:t xml:space="preserve">Case 1 – 204: </w:t>
       </w:r>
       <w:r>
-        <w:t>Material</w:t>
-      </w:r>
-      <w:r>
-        <w:t xml:space="preserve"> deleted successfully</w:t>
+        <w:t>Material deleted successfully</w:t>
       </w:r>
     </w:p>
     <w:p>
@@ -13043,6 +13073,7 @@
         </w:rPr>
       </w:pPr>
       <w:r>
+        <w:lastRenderedPageBreak/>
         <w:t xml:space="preserve">Click </w:t>
       </w:r>
       <w:r>
@@ -13138,7 +13169,6 @@
         </w:rPr>
       </w:pPr>
       <w:r>
-        <w:lastRenderedPageBreak/>
         <w:t>Click </w:t>
       </w:r>
       <w:r>
@@ -13617,7 +13647,7 @@
       </w:pPr>
       <w:r>
         <w:pict w14:anchorId="383DC381">
-          <v:rect id="_x0000_i1031" style="width:0;height:.75pt" o:hralign="center" o:hrstd="t" o:hr="t" fillcolor="#a0a0a0" stroked="f"/>
+          <v:rect id="_x0000_i1028" style="width:0;height:.75pt" o:hralign="center" o:hrstd="t" o:hr="t" fillcolor="#a0a0a0" stroked="f"/>
         </w:pict>
       </w:r>
     </w:p>
@@ -15669,7 +15699,6 @@
   <w:style w:type="character" w:default="1" w:styleId="DefaultParagraphFont">
     <w:name w:val="Default Paragraph Font"/>
     <w:uiPriority w:val="1"/>
-    <w:semiHidden/>
     <w:unhideWhenUsed/>
   </w:style>
   <w:style w:type="table" w:default="1" w:styleId="TableNormal">
@@ -16038,6 +16067,29 @@
       <w:szCs w:val="20"/>
     </w:rPr>
   </w:style>
+  <w:style w:type="character" w:styleId="Hyperlink">
+    <w:name w:val="Hyperlink"/>
+    <w:basedOn w:val="DefaultParagraphFont"/>
+    <w:uiPriority w:val="99"/>
+    <w:unhideWhenUsed/>
+    <w:rsid w:val="007B7F35"/>
+    <w:rPr>
+      <w:color w:val="467886" w:themeColor="hyperlink"/>
+      <w:u w:val="single"/>
+    </w:rPr>
+  </w:style>
+  <w:style w:type="character" w:styleId="UnresolvedMention">
+    <w:name w:val="Unresolved Mention"/>
+    <w:basedOn w:val="DefaultParagraphFont"/>
+    <w:uiPriority w:val="99"/>
+    <w:semiHidden/>
+    <w:unhideWhenUsed/>
+    <w:rsid w:val="007B7F35"/>
+    <w:rPr>
+      <w:color w:val="605E5C"/>
+      <w:shd w:val="clear" w:color="auto" w:fill="E1DFDD"/>
+    </w:rPr>
+  </w:style>
 </w:styles>
 </file>
 

</xml_diff>